<commit_message>
Regenerate resume DOCX after generic client names
Made-with: Cursor
</commit_message>
<xml_diff>
--- a/public/Java_FullStack_FullTime_Resume.docx
+++ b/public/Java_FullStack_FullTime_Resume.docx
@@ -13,7 +13,7 @@
           <w:sz w:val="22"/>
           <w:szCs w:val="22"/>
         </w:rPr>
-        <w:t xml:space="preserve">456-961-7695</w:t>
+        <w:t xml:space="preserve"/>
       </w:r>
     </w:p>
     <w:p>
@@ -152,7 +152,7 @@
           <w:sz w:val="22"/>
           <w:szCs w:val="22"/>
         </w:rPr>
-        <w:t xml:space="preserve">Full Stack Engineer – Mad Mobile</w:t>
+        <w:t xml:space="preserve">Full Stack Engineer – Retail Technology Company</w:t>
       </w:r>
     </w:p>
     <w:p>
@@ -232,7 +232,7 @@
           <w:sz w:val="22"/>
           <w:szCs w:val="22"/>
         </w:rPr>
-        <w:t xml:space="preserve">Java Full Stack Engineer – Corebridge Financial</w:t>
+        <w:t xml:space="preserve">Java Full Stack Engineer – Financial Services Company</w:t>
       </w:r>
     </w:p>
     <w:p>
@@ -312,7 +312,7 @@
           <w:sz w:val="22"/>
           <w:szCs w:val="22"/>
         </w:rPr>
-        <w:t xml:space="preserve">Java Full Stack Engineer – ConocoPhillips</w:t>
+        <w:t xml:space="preserve">Java Full Stack Engineer – Energy Company</w:t>
       </w:r>
     </w:p>
     <w:p>
@@ -379,7 +379,7 @@
           <w:sz w:val="22"/>
           <w:szCs w:val="22"/>
         </w:rPr>
-        <w:t xml:space="preserve">Java Full Stack Engineer – Infosys</w:t>
+        <w:t xml:space="preserve">Java Full Stack Engineer – Global IT Services Company</w:t>
       </w:r>
     </w:p>
     <w:p>
@@ -446,7 +446,7 @@
           <w:sz w:val="22"/>
           <w:szCs w:val="22"/>
         </w:rPr>
-        <w:t xml:space="preserve">Java Full Stack Engineer – Elder Pharmaceuticals</w:t>
+        <w:t xml:space="preserve">Java Full Stack Engineer – Pharmaceutical Manufacturing Company</w:t>
       </w:r>
     </w:p>
     <w:p>

</xml_diff>

<commit_message>
Add downloadable full-time resume (PDF/DOCX/TXT) with financial full-stack optimizations.
Made-with: Cursor
</commit_message>
<xml_diff>
--- a/public/Java_FullStack_FullTime_Resume.docx
+++ b/public/Java_FullStack_FullTime_Resume.docx
@@ -13,7 +13,7 @@
           <w:sz w:val="22"/>
           <w:szCs w:val="22"/>
         </w:rPr>
-        <w:t xml:space="preserve"/>
+        <w:t xml:space="preserve">456-961-7695</w:t>
       </w:r>
     </w:p>
     <w:p>
@@ -88,7 +88,7 @@
           <w:sz w:val="22"/>
           <w:szCs w:val="22"/>
         </w:rPr>
-        <w:t xml:space="preserve">Java Full Stack Engineer with 5+ years building scalable enterprise applications. Proficient in Java, Spring Boot, Microservices, REST APIs, React, Angular, and AWS. Delivered cloud-native systems and modern web interfaces for financial services, energy, and automotive sectors. AWS Certified. Strong focus on system design, API development, CI/CD, and production-ready systems.</w:t>
+        <w:t xml:space="preserve">Java Full Stack Engineer with 5+ years delivering scalable enterprise applications across the full software development lifecycle—from technical design and specifications through secure implementation, automated testing, CI/CD, and production support. Proficient in Java, Spring Boot, microservices, REST APIs with OAuth2, JWT, and RBAC (Spring Security), React, Angular, and AWS. Applies DevSecOps-minded practices in build and release workflows and emphasizes code quality with JUnit and Mockito. Delivered cloud-native systems and modern web interfaces for financial and investment-adjacent services (retirement, insurance, asset management), energy, and automotive sectors. AWS Certified. Strong collaborator with cross-functional Agile teams (product, QA, DevOps/platform).</w:t>
       </w:r>
     </w:p>
     <w:p>
@@ -119,7 +119,7 @@
           <w:sz w:val="22"/>
           <w:szCs w:val="22"/>
         </w:rPr>
-        <w:t xml:space="preserve">Java, Spring Boot, Microservices, REST APIs | React, Angular | AWS, Docker, Kubernetes | CI/CD (Jenkins, Bitbucket) | MySQL, PostgreSQL, MongoDB, Oracle | Kafka, RabbitMQ | JUnit, Mockito, Prometheus, Grafana</w:t>
+        <w:t xml:space="preserve">Java, Spring Boot, Microservices, REST APIs, Spring Security (OAuth2, JWT, RBAC) | React, Angular | AWS, Docker, Kubernetes | CI/CD &amp; DevSecOps practices (Jenkins, Bitbucket) | MySQL, PostgreSQL, MongoDB, Oracle | Kafka, RabbitMQ | JUnit, Mockito, Prometheus, Grafana</w:t>
       </w:r>
     </w:p>
     <w:p>
@@ -152,7 +152,7 @@
           <w:sz w:val="22"/>
           <w:szCs w:val="22"/>
         </w:rPr>
-        <w:t xml:space="preserve">Full Stack Engineer – Mad Mobile</w:t>
+        <w:t xml:space="preserve">Java Full Stack Engineer – Mad Mobile</w:t>
       </w:r>
     </w:p>
     <w:p>
@@ -178,7 +178,7 @@
           <w:sz w:val="22"/>
           <w:szCs w:val="22"/>
         </w:rPr>
-        <w:t xml:space="preserve">• Engineered migration from legacy Spring MVC to Java 17 / Spring Boot microservices; reduced production incidents by 40% and deployment time from 2 hours to 15 minutes.</w:t>
+        <w:t xml:space="preserve">• Engineered migration from legacy Spring MVC to Java 17 / Spring Boot microservices; owned technical design through deployment; reduced production incidents by 40% and deployment time from 2 hours to 15 minutes.</w:t>
       </w:r>
     </w:p>
     <w:p>
@@ -209,6 +209,32 @@
     </w:p>
     <w:p>
       <w:pPr>
+        <w:spacing w:after="20"/>
+      </w:pPr>
+      <w:r>
+        <w:rPr>
+          <w:rFonts w:ascii="Times New Roman" w:cs="Times New Roman" w:eastAsia="Times New Roman" w:hAnsi="Times New Roman"/>
+          <w:sz w:val="22"/>
+          <w:szCs w:val="22"/>
+        </w:rPr>
+        <w:t xml:space="preserve">• Supported 500+ concurrent users with sub-200ms REST APIs using Spring Security and OAuth2; delivered responsive Angular and React UIs with Prometheus and Grafana monitoring.</w:t>
+      </w:r>
+    </w:p>
+    <w:p>
+      <w:pPr>
+        <w:spacing w:after="20"/>
+      </w:pPr>
+      <w:r>
+        <w:rPr>
+          <w:rFonts w:ascii="Times New Roman" w:cs="Times New Roman" w:eastAsia="Times New Roman" w:hAnsi="Times New Roman"/>
+          <w:sz w:val="22"/>
+          <w:szCs w:val="22"/>
+        </w:rPr>
+        <w:t xml:space="preserve">• Automated regression and service-level testing with JUnit and Mockito; aligned test coverage with release criteria and defect KPIs.</w:t>
+      </w:r>
+    </w:p>
+    <w:p>
+      <w:pPr>
         <w:spacing w:after="80"/>
       </w:pPr>
       <w:r>
@@ -217,7 +243,7 @@
           <w:sz w:val="22"/>
           <w:szCs w:val="22"/>
         </w:rPr>
-        <w:t xml:space="preserve">• Supported 500+ concurrent users with sub-200ms REST APIs using Spring Security and OAuth2; delivered responsive Angular and React UIs with Prometheus and Grafana monitoring.</w:t>
+        <w:t xml:space="preserve">• Partnered with DevOps on CI/CD automation (Jenkins, Bitbucket) to standardize build, scan, and deploy stages for repeatable, frequent releases.</w:t>
       </w:r>
     </w:p>
     <w:p>
@@ -258,20 +284,20 @@
           <w:sz w:val="22"/>
           <w:szCs w:val="22"/>
         </w:rPr>
-        <w:t xml:space="preserve">• Developed Java / Spring Boot applications for retirement, life insurance, and asset management; engineered REST APIs with Hibernate for customer portals and agent dashboards.</w:t>
-      </w:r>
-    </w:p>
-    <w:p>
-      <w:pPr>
-        <w:spacing w:after="20"/>
-      </w:pPr>
-      <w:r>
-        <w:rPr>
-          <w:rFonts w:ascii="Times New Roman" w:cs="Times New Roman" w:eastAsia="Times New Roman" w:hAnsi="Times New Roman"/>
-          <w:sz w:val="22"/>
-          <w:szCs w:val="22"/>
-        </w:rPr>
-        <w:t xml:space="preserve">• Developed responsive user interfaces with Angular and React; implemented OAuth2, JWT, and Redis for authentication; reduced data errors by 90%; improved API response time by 25%.</w:t>
+        <w:t xml:space="preserve">• Developed Java / Spring Boot applications for retirement, life insurance, and asset management; engineered REST APIs with Hibernate for customer-facing and agent-facing portals and dashboards.</w:t>
+      </w:r>
+    </w:p>
+    <w:p>
+      <w:pPr>
+        <w:spacing w:after="20"/>
+      </w:pPr>
+      <w:r>
+        <w:rPr>
+          <w:rFonts w:ascii="Times New Roman" w:cs="Times New Roman" w:eastAsia="Times New Roman" w:hAnsi="Times New Roman"/>
+          <w:sz w:val="22"/>
+          <w:szCs w:val="22"/>
+        </w:rPr>
+        <w:t xml:space="preserve">• Developed responsive user interfaces with Angular and React; implemented OAuth2, JWT, and Redis for secure authentication and session management; reduced data errors by 90%; improved API response time by 25%.</w:t>
       </w:r>
     </w:p>
     <w:p>
@@ -289,6 +315,45 @@
     </w:p>
     <w:p>
       <w:pPr>
+        <w:spacing w:after="20"/>
+      </w:pPr>
+      <w:r>
+        <w:rPr>
+          <w:rFonts w:ascii="Times New Roman" w:cs="Times New Roman" w:eastAsia="Times New Roman" w:hAnsi="Times New Roman"/>
+          <w:sz w:val="22"/>
+          <w:szCs w:val="22"/>
+        </w:rPr>
+        <w:t xml:space="preserve">• Partnered with QA and Product teams in Agile ceremonies for requirement refinement; delivered 8+ features on schedule including policy management and claims processing.</w:t>
+      </w:r>
+    </w:p>
+    <w:p>
+      <w:pPr>
+        <w:spacing w:after="20"/>
+      </w:pPr>
+      <w:r>
+        <w:rPr>
+          <w:rFonts w:ascii="Times New Roman" w:cs="Times New Roman" w:eastAsia="Times New Roman" w:hAnsi="Times New Roman"/>
+          <w:sz w:val="22"/>
+          <w:szCs w:val="22"/>
+        </w:rPr>
+        <w:t xml:space="preserve">• Contributed to technical specifications and API contracts for financial workflows; supported reviews with architecture and compliance stakeholders.</w:t>
+      </w:r>
+    </w:p>
+    <w:p>
+      <w:pPr>
+        <w:spacing w:after="20"/>
+      </w:pPr>
+      <w:r>
+        <w:rPr>
+          <w:rFonts w:ascii="Times New Roman" w:cs="Times New Roman" w:eastAsia="Times New Roman" w:hAnsi="Times New Roman"/>
+          <w:sz w:val="22"/>
+          <w:szCs w:val="22"/>
+        </w:rPr>
+        <w:t xml:space="preserve">• Strengthened secure coding practices (input validation, least-privilege access patterns) within Spring Security; extended automated tests using JUnit and Mockito for critical policy and claims paths.</w:t>
+      </w:r>
+    </w:p>
+    <w:p>
+      <w:pPr>
         <w:spacing w:after="80"/>
       </w:pPr>
       <w:r>
@@ -297,7 +362,7 @@
           <w:sz w:val="22"/>
           <w:szCs w:val="22"/>
         </w:rPr>
-        <w:t xml:space="preserve">• Partnered with QA and Product teams for requirement refinement; delivered 8+ features on schedule including policy management and claims processing.</w:t>
+        <w:t xml:space="preserve">• Improved CI/CD pipelines for predictable deployments to cloud environments, reducing manual steps and supporting faster feedback from test to production.</w:t>
       </w:r>
     </w:p>
     <w:p>
@@ -356,6 +421,32 @@
     </w:p>
     <w:p>
       <w:pPr>
+        <w:spacing w:after="20"/>
+      </w:pPr>
+      <w:r>
+        <w:rPr>
+          <w:rFonts w:ascii="Times New Roman" w:cs="Times New Roman" w:eastAsia="Times New Roman" w:hAnsi="Times New Roman"/>
+          <w:sz w:val="22"/>
+          <w:szCs w:val="22"/>
+        </w:rPr>
+        <w:t xml:space="preserve">• Integrated Oracle and MySQL; developed CI/CD with Jenkins and Terraform; automated build-test-deploy stages; deployed on Kubernetes with health checks and auto-scaling.</w:t>
+      </w:r>
+    </w:p>
+    <w:p>
+      <w:pPr>
+        <w:spacing w:after="20"/>
+      </w:pPr>
+      <w:r>
+        <w:rPr>
+          <w:rFonts w:ascii="Times New Roman" w:cs="Times New Roman" w:eastAsia="Times New Roman" w:hAnsi="Times New Roman"/>
+          <w:sz w:val="22"/>
+          <w:szCs w:val="22"/>
+        </w:rPr>
+        <w:t xml:space="preserve">• Documented service behavior and integration points to support operations and cross-team onboarding.</w:t>
+      </w:r>
+    </w:p>
+    <w:p>
+      <w:pPr>
         <w:spacing w:after="80"/>
       </w:pPr>
       <w:r>
@@ -364,7 +455,7 @@
           <w:sz w:val="22"/>
           <w:szCs w:val="22"/>
         </w:rPr>
-        <w:t xml:space="preserve">• Integrated Oracle and MySQL; developed CI/CD with Jenkins and Terraform; deployed on Kubernetes with health checks and auto-scaling.</w:t>
+        <w:t xml:space="preserve">• Added and maintained automated tests (JUnit, Mockito) for core services to protect refactors and production stability.</w:t>
       </w:r>
     </w:p>
     <w:p>
@@ -423,6 +514,19 @@
     </w:p>
     <w:p>
       <w:pPr>
+        <w:spacing w:after="20"/>
+      </w:pPr>
+      <w:r>
+        <w:rPr>
+          <w:rFonts w:ascii="Times New Roman" w:cs="Times New Roman" w:eastAsia="Times New Roman" w:hAnsi="Times New Roman"/>
+          <w:sz w:val="22"/>
+          <w:szCs w:val="22"/>
+        </w:rPr>
+        <w:t xml:space="preserve">• Optimized SQL queries for dashboards; improved query performance by 30%; reduced load times for 100+ users.</w:t>
+      </w:r>
+    </w:p>
+    <w:p>
+      <w:pPr>
         <w:spacing w:after="80"/>
       </w:pPr>
       <w:r>
@@ -431,7 +535,7 @@
           <w:sz w:val="22"/>
           <w:szCs w:val="22"/>
         </w:rPr>
-        <w:t xml:space="preserve">• Optimized SQL queries for dashboards; improved query performance by 30%; reduced load times for 100+ users.</w:t>
+        <w:t xml:space="preserve">• Worked in Agile squads with analysts and QA to clarify acceptance criteria and ship incremental enhancements.</w:t>
       </w:r>
     </w:p>
     <w:p>
@@ -490,6 +594,19 @@
     </w:p>
     <w:p>
       <w:pPr>
+        <w:spacing w:after="20"/>
+      </w:pPr>
+      <w:r>
+        <w:rPr>
+          <w:rFonts w:ascii="Times New Roman" w:cs="Times New Roman" w:eastAsia="Times New Roman" w:hAnsi="Times New Roman"/>
+          <w:sz w:val="22"/>
+          <w:szCs w:val="22"/>
+        </w:rPr>
+        <w:t xml:space="preserve">• Implemented data validation and SQL-based compliance reports; automated CI/CD with Jenkins and Maven.</w:t>
+      </w:r>
+    </w:p>
+    <w:p>
+      <w:pPr>
         <w:spacing w:after="80"/>
       </w:pPr>
       <w:r>
@@ -498,7 +615,7 @@
           <w:sz w:val="22"/>
           <w:szCs w:val="22"/>
         </w:rPr>
-        <w:t xml:space="preserve">• Implemented data validation and SQL-based compliance reports; automated CI/CD with Jenkins and Maven.</w:t>
+        <w:t xml:space="preserve">• Applied validation and audit-friendly reporting patterns suitable for regulated operational data.</w:t>
       </w:r>
     </w:p>
     <w:p>
@@ -745,7 +862,7 @@
           <w:sz w:val="22"/>
           <w:szCs w:val="22"/>
         </w:rPr>
-        <w:t xml:space="preserve">• Designed and developed full-stack application using Spring Boot, JWT authentication, and React; deployed on AWS with Docker for retirement planning and portfolio management.</w:t>
+        <w:t xml:space="preserve">• Designed and developed full-stack application using Spring Boot, JWT and role-based access, and React; deployed on AWS with Docker for retirement planning and portfolio management.</w:t>
       </w:r>
     </w:p>
     <w:p>

</xml_diff>

<commit_message>
Resume: Software Engineer at Infosys, Associate Software Engineer at Elder Pharmaceuticals.
Made-with: Cursor
</commit_message>
<xml_diff>
--- a/public/Java_FullStack_FullTime_Resume.docx
+++ b/public/Java_FullStack_FullTime_Resume.docx
@@ -470,7 +470,7 @@
           <w:sz w:val="22"/>
           <w:szCs w:val="22"/>
         </w:rPr>
-        <w:t xml:space="preserve">Java Full Stack Engineer – Infosys</w:t>
+        <w:t xml:space="preserve">Software Engineer – Infosys</w:t>
       </w:r>
     </w:p>
     <w:p>
@@ -550,7 +550,7 @@
           <w:sz w:val="22"/>
           <w:szCs w:val="22"/>
         </w:rPr>
-        <w:t xml:space="preserve">Java Full Stack Engineer – Elder Pharmaceuticals</w:t>
+        <w:t xml:space="preserve">Associate Software Engineer – Elder Pharmaceuticals</w:t>
       </w:r>
     </w:p>
     <w:p>

</xml_diff>

<commit_message>
Resumes: System Engineer (Infosys), Associate System Engineer (Elder); ATS FE/BE/cloud balance for full-time and C2C.
Made-with: Cursor
</commit_message>
<xml_diff>
--- a/public/Java_FullStack_FullTime_Resume.docx
+++ b/public/Java_FullStack_FullTime_Resume.docx
@@ -43,7 +43,7 @@
           <w:sz w:val="24"/>
           <w:szCs w:val="24"/>
         </w:rPr>
-        <w:t xml:space="preserve">Java Full Stack Engineer | Spring Boot | Microservices | AWS</w:t>
+        <w:t xml:space="preserve">Java Full Stack Engineer | React &amp; Angular | Spring Boot | AWS Cloud</w:t>
       </w:r>
     </w:p>
     <w:p>
@@ -88,7 +88,7 @@
           <w:sz w:val="22"/>
           <w:szCs w:val="22"/>
         </w:rPr>
-        <w:t xml:space="preserve">Java Full Stack Engineer with 5+ years delivering scalable enterprise applications across the full software development lifecycle—from technical design and specifications through secure implementation, automated testing, CI/CD, and production support. Proficient in Java, Spring Boot, microservices, REST APIs with OAuth2, JWT, and RBAC (Spring Security), React, Angular, and AWS. Applies DevSecOps-minded practices in build and release workflows and emphasizes code quality with JUnit and Mockito. Delivered cloud-native systems and modern web interfaces for financial and investment-adjacent services (retirement, insurance, asset management), energy, and automotive sectors. AWS Certified. Strong collaborator with cross-functional Agile teams (product, QA, DevOps/platform).</w:t>
+        <w:t xml:space="preserve">Java Full Stack Engineer with 5+ years owning the full SDLC across frontend, backend, and cloud. Backend: Java, Spring Boot, microservices, REST APIs, Spring Security (OAuth2, JWT, RBAC), Hibernate/JPA, and event-driven integration (Kafka, RabbitMQ). Frontend: responsive web UIs with React and Angular. Cloud &amp; DevOps: AWS, Docker, Kubernetes, Terraform, CI/CD (Jenkins, Bitbucket), and DevSecOps-minded release practices. Quality: JUnit, Mockito, and measurable KPIs (uptime, latency, defect reduction). Delivered systems for financial services (retirement, insurance, asset management), energy, automotive, and regulated industries. AWS Certified (DevOps Professional, Solutions Architect Associate), Terraform Associate. Agile collaboration with product, QA, and platform teams.</w:t>
       </w:r>
     </w:p>
     <w:p>
@@ -119,7 +119,7 @@
           <w:sz w:val="22"/>
           <w:szCs w:val="22"/>
         </w:rPr>
-        <w:t xml:space="preserve">Java, Spring Boot, Microservices, REST APIs, Spring Security (OAuth2, JWT, RBAC) | React, Angular | AWS, Docker, Kubernetes | CI/CD &amp; DevSecOps practices (Jenkins, Bitbucket) | MySQL, PostgreSQL, MongoDB, Oracle | Kafka, RabbitMQ | JUnit, Mockito, Prometheus, Grafana</w:t>
+        <w:t xml:space="preserve">Frontend: React, Angular, responsive UI, REST integration | Backend: Java (11, 17), Spring Boot, microservices, REST APIs, Spring Security (OAuth2, JWT, RBAC), Hibernate/JPA, Node.js | Cloud &amp; DevOps: AWS (EC2, S3, RDS, Lambda, ECS), Docker, Kubernetes, Terraform, CI/CD (Jenkins, Bitbucket), infrastructure as code | Data &amp; messaging: MySQL, PostgreSQL, MongoDB, Oracle, Redis, Kafka, RabbitMQ | Quality &amp; observability: JUnit, Mockito, Prometheus, Grafana</w:t>
       </w:r>
     </w:p>
     <w:p>
@@ -217,7 +217,7 @@
           <w:sz w:val="22"/>
           <w:szCs w:val="22"/>
         </w:rPr>
-        <w:t xml:space="preserve">• Supported 500+ concurrent users with sub-200ms REST APIs using Spring Security and OAuth2; delivered responsive Angular and React UIs with Prometheus and Grafana monitoring.</w:t>
+        <w:t xml:space="preserve">• Full stack delivery: sub-200ms REST APIs with Spring Security and OAuth2 for 500+ concurrent users; responsive Angular and React front ends; Prometheus and Grafana for SLO-style monitoring.</w:t>
       </w:r>
     </w:p>
     <w:p>
@@ -243,7 +243,7 @@
           <w:sz w:val="22"/>
           <w:szCs w:val="22"/>
         </w:rPr>
-        <w:t xml:space="preserve">• Partnered with DevOps on CI/CD automation (Jenkins, Bitbucket) to standardize build, scan, and deploy stages for repeatable, frequent releases.</w:t>
+        <w:t xml:space="preserve">• Partnered with DevOps on CI/CD automation (Jenkins, Bitbucket) to standardize build, scan, and deploy stages for repeatable, frequent releases to cloud environments.</w:t>
       </w:r>
     </w:p>
     <w:p>
@@ -297,59 +297,59 @@
           <w:sz w:val="22"/>
           <w:szCs w:val="22"/>
         </w:rPr>
-        <w:t xml:space="preserve">• Developed responsive user interfaces with Angular and React; implemented OAuth2, JWT, and Redis for secure authentication and session management; reduced data errors by 90%; improved API response time by 25%.</w:t>
-      </w:r>
-    </w:p>
-    <w:p>
-      <w:pPr>
-        <w:spacing w:after="20"/>
-      </w:pPr>
-      <w:r>
-        <w:rPr>
-          <w:rFonts w:ascii="Times New Roman" w:cs="Times New Roman" w:eastAsia="Times New Roman" w:hAnsi="Times New Roman"/>
-          <w:sz w:val="22"/>
-          <w:szCs w:val="22"/>
-        </w:rPr>
-        <w:t xml:space="preserve">• Collaborated with DevOps on Docker and Kubernetes deployments; utilized AWS EC2, S3, RDS, and Lambda.</w:t>
-      </w:r>
-    </w:p>
-    <w:p>
-      <w:pPr>
-        <w:spacing w:after="20"/>
-      </w:pPr>
-      <w:r>
-        <w:rPr>
-          <w:rFonts w:ascii="Times New Roman" w:cs="Times New Roman" w:eastAsia="Times New Roman" w:hAnsi="Times New Roman"/>
-          <w:sz w:val="22"/>
-          <w:szCs w:val="22"/>
-        </w:rPr>
-        <w:t xml:space="preserve">• Partnered with QA and Product teams in Agile ceremonies for requirement refinement; delivered 8+ features on schedule including policy management and claims processing.</w:t>
-      </w:r>
-    </w:p>
-    <w:p>
-      <w:pPr>
-        <w:spacing w:after="20"/>
-      </w:pPr>
-      <w:r>
-        <w:rPr>
-          <w:rFonts w:ascii="Times New Roman" w:cs="Times New Roman" w:eastAsia="Times New Roman" w:hAnsi="Times New Roman"/>
-          <w:sz w:val="22"/>
-          <w:szCs w:val="22"/>
-        </w:rPr>
-        <w:t xml:space="preserve">• Contributed to technical specifications and API contracts for financial workflows; supported reviews with architecture and compliance stakeholders.</w:t>
-      </w:r>
-    </w:p>
-    <w:p>
-      <w:pPr>
-        <w:spacing w:after="20"/>
-      </w:pPr>
-      <w:r>
-        <w:rPr>
-          <w:rFonts w:ascii="Times New Roman" w:cs="Times New Roman" w:eastAsia="Times New Roman" w:hAnsi="Times New Roman"/>
-          <w:sz w:val="22"/>
-          <w:szCs w:val="22"/>
-        </w:rPr>
-        <w:t xml:space="preserve">• Strengthened secure coding practices (input validation, least-privilege access patterns) within Spring Security; extended automated tests using JUnit and Mockito for critical policy and claims paths.</w:t>
+        <w:t xml:space="preserve">• Frontend and backend: responsive Angular and React UIs; OAuth2, JWT, and Redis for secure authentication and session management; reduced data errors by 90%; improved API response time by 25%.</w:t>
+      </w:r>
+    </w:p>
+    <w:p>
+      <w:pPr>
+        <w:spacing w:after="20"/>
+      </w:pPr>
+      <w:r>
+        <w:rPr>
+          <w:rFonts w:ascii="Times New Roman" w:cs="Times New Roman" w:eastAsia="Times New Roman" w:hAnsi="Times New Roman"/>
+          <w:sz w:val="22"/>
+          <w:szCs w:val="22"/>
+        </w:rPr>
+        <w:t xml:space="preserve">• Cloud delivery: collaborated with DevOps on Docker and Kubernetes deployments; AWS EC2, S3, RDS, and Lambda for financial services workloads.</w:t>
+      </w:r>
+    </w:p>
+    <w:p>
+      <w:pPr>
+        <w:spacing w:after="20"/>
+      </w:pPr>
+      <w:r>
+        <w:rPr>
+          <w:rFonts w:ascii="Times New Roman" w:cs="Times New Roman" w:eastAsia="Times New Roman" w:hAnsi="Times New Roman"/>
+          <w:sz w:val="22"/>
+          <w:szCs w:val="22"/>
+        </w:rPr>
+        <w:t xml:space="preserve">• Agile delivery with QA and Product: requirement refinement, acceptance criteria, and 8+ on-schedule features including policy management and claims processing.</w:t>
+      </w:r>
+    </w:p>
+    <w:p>
+      <w:pPr>
+        <w:spacing w:after="20"/>
+      </w:pPr>
+      <w:r>
+        <w:rPr>
+          <w:rFonts w:ascii="Times New Roman" w:cs="Times New Roman" w:eastAsia="Times New Roman" w:hAnsi="Times New Roman"/>
+          <w:sz w:val="22"/>
+          <w:szCs w:val="22"/>
+        </w:rPr>
+        <w:t xml:space="preserve">• Technical design: specifications and API contracts for financial workflows; reviews with architecture and compliance stakeholders.</w:t>
+      </w:r>
+    </w:p>
+    <w:p>
+      <w:pPr>
+        <w:spacing w:after="20"/>
+      </w:pPr>
+      <w:r>
+        <w:rPr>
+          <w:rFonts w:ascii="Times New Roman" w:cs="Times New Roman" w:eastAsia="Times New Roman" w:hAnsi="Times New Roman"/>
+          <w:sz w:val="22"/>
+          <w:szCs w:val="22"/>
+        </w:rPr>
+        <w:t xml:space="preserve">• Secure coding with Spring Security (validation, least-privilege patterns); JUnit and Mockito for critical policy and claims paths.</w:t>
       </w:r>
     </w:p>
     <w:p>
@@ -362,7 +362,7 @@
           <w:sz w:val="22"/>
           <w:szCs w:val="22"/>
         </w:rPr>
-        <w:t xml:space="preserve">• Improved CI/CD pipelines for predictable deployments to cloud environments, reducing manual steps and supporting faster feedback from test to production.</w:t>
+        <w:t xml:space="preserve">• CI/CD pipeline improvements for predictable cloud deployments, fewer manual steps, and faster test-to-production feedback.</w:t>
       </w:r>
     </w:p>
     <w:p>
@@ -403,46 +403,46 @@
           <w:sz w:val="22"/>
           <w:szCs w:val="22"/>
         </w:rPr>
-        <w:t xml:space="preserve">• Implemented server-side logic with Java 11 and Spring Boot for portfolio and asset tracking; supported 500+ users and 10K+ daily transactions.</w:t>
-      </w:r>
-    </w:p>
-    <w:p>
-      <w:pPr>
-        <w:spacing w:after="20"/>
-      </w:pPr>
-      <w:r>
-        <w:rPr>
-          <w:rFonts w:ascii="Times New Roman" w:cs="Times New Roman" w:eastAsia="Times New Roman" w:hAnsi="Times New Roman"/>
-          <w:sz w:val="22"/>
-          <w:szCs w:val="22"/>
-        </w:rPr>
-        <w:t xml:space="preserve">• Developed REST APIs with Spring Data JPA and Hibernate; built responsive UIs with React; reduced manual reporting time by 50%.</w:t>
-      </w:r>
-    </w:p>
-    <w:p>
-      <w:pPr>
-        <w:spacing w:after="20"/>
-      </w:pPr>
-      <w:r>
-        <w:rPr>
-          <w:rFonts w:ascii="Times New Roman" w:cs="Times New Roman" w:eastAsia="Times New Roman" w:hAnsi="Times New Roman"/>
-          <w:sz w:val="22"/>
-          <w:szCs w:val="22"/>
-        </w:rPr>
-        <w:t xml:space="preserve">• Integrated Oracle and MySQL; developed CI/CD with Jenkins and Terraform; automated build-test-deploy stages; deployed on Kubernetes with health checks and auto-scaling.</w:t>
-      </w:r>
-    </w:p>
-    <w:p>
-      <w:pPr>
-        <w:spacing w:after="20"/>
-      </w:pPr>
-      <w:r>
-        <w:rPr>
-          <w:rFonts w:ascii="Times New Roman" w:cs="Times New Roman" w:eastAsia="Times New Roman" w:hAnsi="Times New Roman"/>
-          <w:sz w:val="22"/>
-          <w:szCs w:val="22"/>
-        </w:rPr>
-        <w:t xml:space="preserve">• Documented service behavior and integration points to support operations and cross-team onboarding.</w:t>
+        <w:t xml:space="preserve">• Backend: Java 11, Spring Boot, and Spring Data JPA/Hibernate for portfolio and asset tracking; supported 500+ users and 10K+ daily transactions.</w:t>
+      </w:r>
+    </w:p>
+    <w:p>
+      <w:pPr>
+        <w:spacing w:after="20"/>
+      </w:pPr>
+      <w:r>
+        <w:rPr>
+          <w:rFonts w:ascii="Times New Roman" w:cs="Times New Roman" w:eastAsia="Times New Roman" w:hAnsi="Times New Roman"/>
+          <w:sz w:val="22"/>
+          <w:szCs w:val="22"/>
+        </w:rPr>
+        <w:t xml:space="preserve">• Full stack: REST APIs integrated with responsive React UIs; reduced manual reporting time by 50%.</w:t>
+      </w:r>
+    </w:p>
+    <w:p>
+      <w:pPr>
+        <w:spacing w:after="20"/>
+      </w:pPr>
+      <w:r>
+        <w:rPr>
+          <w:rFonts w:ascii="Times New Roman" w:cs="Times New Roman" w:eastAsia="Times New Roman" w:hAnsi="Times New Roman"/>
+          <w:sz w:val="22"/>
+          <w:szCs w:val="22"/>
+        </w:rPr>
+        <w:t xml:space="preserve">• Cloud &amp; platform: Oracle and MySQL; Jenkins and Terraform for CI/CD; automated build-test-deploy; Kubernetes deployment with health checks and auto-scaling.</w:t>
+      </w:r>
+    </w:p>
+    <w:p>
+      <w:pPr>
+        <w:spacing w:after="20"/>
+      </w:pPr>
+      <w:r>
+        <w:rPr>
+          <w:rFonts w:ascii="Times New Roman" w:cs="Times New Roman" w:eastAsia="Times New Roman" w:hAnsi="Times New Roman"/>
+          <w:sz w:val="22"/>
+          <w:szCs w:val="22"/>
+        </w:rPr>
+        <w:t xml:space="preserve">• Documentation for service behavior and integration points; supported operations and cross-team onboarding.</w:t>
       </w:r>
     </w:p>
     <w:p>
@@ -455,22 +455,22 @@
           <w:sz w:val="22"/>
           <w:szCs w:val="22"/>
         </w:rPr>
-        <w:t xml:space="preserve">• Added and maintained automated tests (JUnit, Mockito) for core services to protect refactors and production stability.</w:t>
-      </w:r>
-    </w:p>
-    <w:p>
-      <w:pPr>
-        <w:spacing w:after="20"/>
-      </w:pPr>
-      <w:r>
-        <w:rPr>
-          <w:rFonts w:ascii="Times New Roman" w:cs="Times New Roman" w:eastAsia="Times New Roman" w:hAnsi="Times New Roman"/>
-          <w:b/>
-          <w:bCs/>
-          <w:sz w:val="22"/>
-          <w:szCs w:val="22"/>
-        </w:rPr>
-        <w:t xml:space="preserve">Software Engineer – Infosys</w:t>
+        <w:t xml:space="preserve">• JUnit and Mockito for core services to protect refactors and production stability.</w:t>
+      </w:r>
+    </w:p>
+    <w:p>
+      <w:pPr>
+        <w:spacing w:after="20"/>
+      </w:pPr>
+      <w:r>
+        <w:rPr>
+          <w:rFonts w:ascii="Times New Roman" w:cs="Times New Roman" w:eastAsia="Times New Roman" w:hAnsi="Times New Roman"/>
+          <w:b/>
+          <w:bCs/>
+          <w:sz w:val="22"/>
+          <w:szCs w:val="22"/>
+        </w:rPr>
+        <w:t xml:space="preserve">System Engineer – Infosys</w:t>
       </w:r>
     </w:p>
     <w:p>
@@ -496,33 +496,33 @@
           <w:sz w:val="22"/>
           <w:szCs w:val="22"/>
         </w:rPr>
-        <w:t xml:space="preserve">• Developed backend services with Java, Spring Boot, and REST APIs for vehicle manufacturing and supply chain analytics; integrated Oracle and PostgreSQL.</w:t>
-      </w:r>
-    </w:p>
-    <w:p>
-      <w:pPr>
-        <w:spacing w:after="20"/>
-      </w:pPr>
-      <w:r>
-        <w:rPr>
-          <w:rFonts w:ascii="Times New Roman" w:cs="Times New Roman" w:eastAsia="Times New Roman" w:hAnsi="Times New Roman"/>
-          <w:sz w:val="22"/>
-          <w:szCs w:val="22"/>
-        </w:rPr>
-        <w:t xml:space="preserve">• Designed ETL workflows integrating vehicle production, dealer management, and logistics data; built backend processing for analytics and reporting.</w:t>
-      </w:r>
-    </w:p>
-    <w:p>
-      <w:pPr>
-        <w:spacing w:after="20"/>
-      </w:pPr>
-      <w:r>
-        <w:rPr>
-          <w:rFonts w:ascii="Times New Roman" w:cs="Times New Roman" w:eastAsia="Times New Roman" w:hAnsi="Times New Roman"/>
-          <w:sz w:val="22"/>
-          <w:szCs w:val="22"/>
-        </w:rPr>
-        <w:t xml:space="preserve">• Optimized SQL queries for dashboards; improved query performance by 30%; reduced load times for 100+ users.</w:t>
+        <w:t xml:space="preserve">• Backend systems: Java, Spring Boot, and REST APIs for vehicle manufacturing and supply chain analytics; Oracle and PostgreSQL integration.</w:t>
+      </w:r>
+    </w:p>
+    <w:p>
+      <w:pPr>
+        <w:spacing w:after="20"/>
+      </w:pPr>
+      <w:r>
+        <w:rPr>
+          <w:rFonts w:ascii="Times New Roman" w:cs="Times New Roman" w:eastAsia="Times New Roman" w:hAnsi="Times New Roman"/>
+          <w:sz w:val="22"/>
+          <w:szCs w:val="22"/>
+        </w:rPr>
+        <w:t xml:space="preserve">• Designed ETL workflows for vehicle production, dealer management, and logistics data; backend processing for analytics and reporting pipelines.</w:t>
+      </w:r>
+    </w:p>
+    <w:p>
+      <w:pPr>
+        <w:spacing w:after="20"/>
+      </w:pPr>
+      <w:r>
+        <w:rPr>
+          <w:rFonts w:ascii="Times New Roman" w:cs="Times New Roman" w:eastAsia="Times New Roman" w:hAnsi="Times New Roman"/>
+          <w:sz w:val="22"/>
+          <w:szCs w:val="22"/>
+        </w:rPr>
+        <w:t xml:space="preserve">• Performance: optimized SQL for analytics and reporting workloads; improved query performance by 30%; reduced load times for 100+ users.</w:t>
       </w:r>
     </w:p>
     <w:p>
@@ -535,22 +535,22 @@
           <w:sz w:val="22"/>
           <w:szCs w:val="22"/>
         </w:rPr>
-        <w:t xml:space="preserve">• Worked in Agile squads with analysts and QA to clarify acceptance criteria and ship incremental enhancements.</w:t>
-      </w:r>
-    </w:p>
-    <w:p>
-      <w:pPr>
-        <w:spacing w:after="20"/>
-      </w:pPr>
-      <w:r>
-        <w:rPr>
-          <w:rFonts w:ascii="Times New Roman" w:cs="Times New Roman" w:eastAsia="Times New Roman" w:hAnsi="Times New Roman"/>
-          <w:b/>
-          <w:bCs/>
-          <w:sz w:val="22"/>
-          <w:szCs w:val="22"/>
-        </w:rPr>
-        <w:t xml:space="preserve">Associate Software Engineer – Elder Pharmaceuticals</w:t>
+        <w:t xml:space="preserve">• Agile squads with analysts and QA: acceptance criteria, incremental delivery, and reliable APIs supporting operational and reporting consumers.</w:t>
+      </w:r>
+    </w:p>
+    <w:p>
+      <w:pPr>
+        <w:spacing w:after="20"/>
+      </w:pPr>
+      <w:r>
+        <w:rPr>
+          <w:rFonts w:ascii="Times New Roman" w:cs="Times New Roman" w:eastAsia="Times New Roman" w:hAnsi="Times New Roman"/>
+          <w:b/>
+          <w:bCs/>
+          <w:sz w:val="22"/>
+          <w:szCs w:val="22"/>
+        </w:rPr>
+        <w:t xml:space="preserve">Associate System Engineer – Elder Pharmaceuticals</w:t>
       </w:r>
     </w:p>
     <w:p>
@@ -576,33 +576,33 @@
           <w:sz w:val="22"/>
           <w:szCs w:val="22"/>
         </w:rPr>
-        <w:t xml:space="preserve">• Developed Spring Boot and Node.js backend services for production monitoring; built REST APIs for ERP integration with Oracle and PostgreSQL.</w:t>
-      </w:r>
-    </w:p>
-    <w:p>
-      <w:pPr>
-        <w:spacing w:after="20"/>
-      </w:pPr>
-      <w:r>
-        <w:rPr>
-          <w:rFonts w:ascii="Times New Roman" w:cs="Times New Roman" w:eastAsia="Times New Roman" w:hAnsi="Times New Roman"/>
-          <w:sz w:val="22"/>
-          <w:szCs w:val="22"/>
-        </w:rPr>
-        <w:t xml:space="preserve">• Designed ETL workflows consolidating laboratory, quality control, and inventory data; built dashboards with AngularJS and React; reduced manual entry by 70%.</w:t>
-      </w:r>
-    </w:p>
-    <w:p>
-      <w:pPr>
-        <w:spacing w:after="20"/>
-      </w:pPr>
-      <w:r>
-        <w:rPr>
-          <w:rFonts w:ascii="Times New Roman" w:cs="Times New Roman" w:eastAsia="Times New Roman" w:hAnsi="Times New Roman"/>
-          <w:sz w:val="22"/>
-          <w:szCs w:val="22"/>
-        </w:rPr>
-        <w:t xml:space="preserve">• Implemented data validation and SQL-based compliance reports; automated CI/CD with Jenkins and Maven.</w:t>
+        <w:t xml:space="preserve">• Backend: Spring Boot and Node.js services for production monitoring; REST APIs for ERP integration with Oracle and PostgreSQL.</w:t>
+      </w:r>
+    </w:p>
+    <w:p>
+      <w:pPr>
+        <w:spacing w:after="20"/>
+      </w:pPr>
+      <w:r>
+        <w:rPr>
+          <w:rFonts w:ascii="Times New Roman" w:cs="Times New Roman" w:eastAsia="Times New Roman" w:hAnsi="Times New Roman"/>
+          <w:sz w:val="22"/>
+          <w:szCs w:val="22"/>
+        </w:rPr>
+        <w:t xml:space="preserve">• Frontend: AngularJS and React dashboards for laboratory, quality control, and inventory visibility; reduced manual entry by 70%.</w:t>
+      </w:r>
+    </w:p>
+    <w:p>
+      <w:pPr>
+        <w:spacing w:after="20"/>
+      </w:pPr>
+      <w:r>
+        <w:rPr>
+          <w:rFonts w:ascii="Times New Roman" w:cs="Times New Roman" w:eastAsia="Times New Roman" w:hAnsi="Times New Roman"/>
+          <w:sz w:val="22"/>
+          <w:szCs w:val="22"/>
+        </w:rPr>
+        <w:t xml:space="preserve">• ETL workflows consolidating lab, QC, and inventory data; validation and SQL-based compliance reporting.</w:t>
       </w:r>
     </w:p>
     <w:p>
@@ -615,7 +615,7 @@
           <w:sz w:val="22"/>
           <w:szCs w:val="22"/>
         </w:rPr>
-        <w:t xml:space="preserve">• Applied validation and audit-friendly reporting patterns suitable for regulated operational data.</w:t>
+        <w:t xml:space="preserve">• CI/CD automation with Jenkins and Maven; audit-friendly reporting patterns for regulated operational data.</w:t>
       </w:r>
     </w:p>
     <w:p>
@@ -862,7 +862,7 @@
           <w:sz w:val="22"/>
           <w:szCs w:val="22"/>
         </w:rPr>
-        <w:t xml:space="preserve">• Designed and developed full-stack application using Spring Boot, JWT and role-based access, and React; deployed on AWS with Docker for retirement planning and portfolio management.</w:t>
+        <w:t xml:space="preserve">• Full stack: Spring Boot backend, JWT and role-based access, React UI; AWS and Docker for retirement planning and portfolio management.</w:t>
       </w:r>
     </w:p>
     <w:p>
@@ -875,7 +875,7 @@
           <w:sz w:val="22"/>
           <w:szCs w:val="22"/>
         </w:rPr>
-        <w:t xml:space="preserve">• Implemented REST APIs for authentication and portfolio tracking; integrated PostgreSQL and Redis for persistent storage and session management.</w:t>
+        <w:t xml:space="preserve">• REST APIs for authentication and portfolio tracking; PostgreSQL and Redis for persistence and session management.</w:t>
       </w:r>
     </w:p>
     <w:p>
@@ -903,7 +903,7 @@
           <w:sz w:val="22"/>
           <w:szCs w:val="22"/>
         </w:rPr>
-        <w:t xml:space="preserve">• Designed and developed full-stack platform with Spring Boot, React, and MySQL for menu management, order processing, inventory, and sales analytics.</w:t>
+        <w:t xml:space="preserve">• Full stack: Spring Boot, React, and MySQL for menu management, orders, inventory, and sales analytics.</w:t>
       </w:r>
     </w:p>
     <w:p>
@@ -916,7 +916,7 @@
           <w:sz w:val="22"/>
           <w:szCs w:val="22"/>
         </w:rPr>
-        <w:t xml:space="preserve">• Built REST APIs for orders and inventory synchronization; delivered admin dashboard with React that reduced manual operations by 60%.</w:t>
+        <w:t xml:space="preserve">• REST APIs for orders and inventory sync; React admin dashboard; reduced manual operations by 60%.</w:t>
       </w:r>
     </w:p>
     <w:p>
@@ -944,7 +944,7 @@
           <w:sz w:val="22"/>
           <w:szCs w:val="22"/>
         </w:rPr>
-        <w:t xml:space="preserve">• Designed and developed REST API with Spring Boot, JPA, and H2; implemented JWT-based authentication and role-based access control with Spring Security.</w:t>
+        <w:t xml:space="preserve">• Spring Boot, JPA, H2; JWT authentication and RBAC with Spring Security.</w:t>
       </w:r>
     </w:p>
     <w:p>
@@ -957,7 +957,7 @@
           <w:sz w:val="22"/>
           <w:szCs w:val="22"/>
         </w:rPr>
-        <w:t xml:space="preserve">• Implemented endpoints for registration, login, profile management, and audit logging.</w:t>
+        <w:t xml:space="preserve">• Endpoints for registration, login, profile management, and audit logging.</w:t>
       </w:r>
     </w:p>
     <w:sectPr>

</xml_diff>

<commit_message>
Full-time resume: ATS-friendly action-verb bullets and tightened summary.
Made-with: Cursor
</commit_message>
<xml_diff>
--- a/public/Java_FullStack_FullTime_Resume.docx
+++ b/public/Java_FullStack_FullTime_Resume.docx
@@ -43,7 +43,7 @@
           <w:sz w:val="24"/>
           <w:szCs w:val="24"/>
         </w:rPr>
-        <w:t xml:space="preserve">Java Full Stack Engineer | React &amp; Angular | Spring Boot | AWS Cloud</w:t>
+        <w:t xml:space="preserve">Java Full Stack Engineer | Spring Boot | React | Angular | AWS</w:t>
       </w:r>
     </w:p>
     <w:p>
@@ -88,7 +88,7 @@
           <w:sz w:val="22"/>
           <w:szCs w:val="22"/>
         </w:rPr>
-        <w:t xml:space="preserve">Java Full Stack Engineer with 5+ years owning the full SDLC across frontend, backend, and cloud. Backend: Java, Spring Boot, microservices, REST APIs, Spring Security (OAuth2, JWT, RBAC), Hibernate/JPA, and event-driven integration (Kafka, RabbitMQ). Frontend: responsive web UIs with React and Angular. Cloud &amp; DevOps: AWS, Docker, Kubernetes, Terraform, CI/CD (Jenkins, Bitbucket), and DevSecOps-minded release practices. Quality: JUnit, Mockito, and measurable KPIs (uptime, latency, defect reduction). Delivered systems for financial services (retirement, insurance, asset management), energy, automotive, and regulated industries. AWS Certified (DevOps Professional, Solutions Architect Associate), Terraform Associate. Agile collaboration with product, QA, and platform teams.</w:t>
+        <w:t xml:space="preserve">Java Full Stack Engineer with 5+ years delivering production systems across the SDLC: Java and Spring Boot microservices, REST APIs, React and Angular, and cloud delivery on AWS, Docker, and Kubernetes. Domains include financial services (retirement, insurance, asset management), energy, automotive, and regulated enterprise environments. Deep experience with OAuth2, JWT, RBAC (Spring Security), Kafka and RabbitMQ, CI/CD (Jenkins, Bitbucket), automated testing (JUnit, Mockito), and observability (Prometheus, Grafana). AWS Certified DevOps Engineer – Professional, AWS Solutions Architect – Associate; HashiCorp Terraform Associate. Collaborates in Agile teams with product, QA, and platform engineering.</w:t>
       </w:r>
     </w:p>
     <w:p>
@@ -119,7 +119,7 @@
           <w:sz w:val="22"/>
           <w:szCs w:val="22"/>
         </w:rPr>
-        <w:t xml:space="preserve">Frontend: React, Angular, responsive UI, REST integration | Backend: Java (11, 17), Spring Boot, microservices, REST APIs, Spring Security (OAuth2, JWT, RBAC), Hibernate/JPA, Node.js | Cloud &amp; DevOps: AWS (EC2, S3, RDS, Lambda, ECS), Docker, Kubernetes, Terraform, CI/CD (Jenkins, Bitbucket), infrastructure as code | Data &amp; messaging: MySQL, PostgreSQL, MongoDB, Oracle, Redis, Kafka, RabbitMQ | Quality &amp; observability: JUnit, Mockito, Prometheus, Grafana</w:t>
+        <w:t xml:space="preserve">Frontend: React, Angular, responsive UI, REST clients | Backend: Java 11/17, Spring Boot, microservices, REST APIs, Spring Security (OAuth2, JWT, RBAC), Hibernate/JPA, Node.js | Cloud &amp; DevOps: AWS (EC2, S3, RDS, Lambda, ECS), Docker, Kubernetes, Terraform, Jenkins, Bitbucket, CI/CD, infrastructure as code | Data &amp; messaging: Oracle, MySQL, PostgreSQL, MongoDB, Redis, Kafka, RabbitMQ | Quality: JUnit, Mockito, Prometheus, Grafana</w:t>
       </w:r>
     </w:p>
     <w:p>
@@ -178,59 +178,59 @@
           <w:sz w:val="22"/>
           <w:szCs w:val="22"/>
         </w:rPr>
-        <w:t xml:space="preserve">• Engineered migration from legacy Spring MVC to Java 17 / Spring Boot microservices; owned technical design through deployment; reduced production incidents by 40% and deployment time from 2 hours to 15 minutes.</w:t>
-      </w:r>
-    </w:p>
-    <w:p>
-      <w:pPr>
-        <w:spacing w:after="20"/>
-      </w:pPr>
-      <w:r>
-        <w:rPr>
-          <w:rFonts w:ascii="Times New Roman" w:cs="Times New Roman" w:eastAsia="Times New Roman" w:hAnsi="Times New Roman"/>
-          <w:sz w:val="22"/>
-          <w:szCs w:val="22"/>
-        </w:rPr>
-        <w:t xml:space="preserve">• Designed scalable, modular microservices architecture ensuring high availability, maintainability, and performance for enterprise applications.</w:t>
-      </w:r>
-    </w:p>
-    <w:p>
-      <w:pPr>
-        <w:spacing w:after="20"/>
-      </w:pPr>
-      <w:r>
-        <w:rPr>
-          <w:rFonts w:ascii="Times New Roman" w:cs="Times New Roman" w:eastAsia="Times New Roman" w:hAnsi="Times New Roman"/>
-          <w:sz w:val="22"/>
-          <w:szCs w:val="22"/>
-        </w:rPr>
-        <w:t xml:space="preserve">• Built event-driven architecture with Redis, RabbitMQ, and Kafka; processed 10K+ transactions daily with 99.9% uptime; implemented retry and circuit breaker patterns for resiliency.</w:t>
-      </w:r>
-    </w:p>
-    <w:p>
-      <w:pPr>
-        <w:spacing w:after="20"/>
-      </w:pPr>
-      <w:r>
-        <w:rPr>
-          <w:rFonts w:ascii="Times New Roman" w:cs="Times New Roman" w:eastAsia="Times New Roman" w:hAnsi="Times New Roman"/>
-          <w:sz w:val="22"/>
-          <w:szCs w:val="22"/>
-        </w:rPr>
-        <w:t xml:space="preserve">• Full stack delivery: sub-200ms REST APIs with Spring Security and OAuth2 for 500+ concurrent users; responsive Angular and React front ends; Prometheus and Grafana for SLO-style monitoring.</w:t>
-      </w:r>
-    </w:p>
-    <w:p>
-      <w:pPr>
-        <w:spacing w:after="20"/>
-      </w:pPr>
-      <w:r>
-        <w:rPr>
-          <w:rFonts w:ascii="Times New Roman" w:cs="Times New Roman" w:eastAsia="Times New Roman" w:hAnsi="Times New Roman"/>
-          <w:sz w:val="22"/>
-          <w:szCs w:val="22"/>
-        </w:rPr>
-        <w:t xml:space="preserve">• Automated regression and service-level testing with JUnit and Mockito; aligned test coverage with release criteria and defect KPIs.</w:t>
+        <w:t xml:space="preserve">• Cut production incidents 40% and deployment time from 2 hours to 15 minutes by leading migration from legacy Spring MVC to Java 17 and Spring Boot microservices end to end.</w:t>
+      </w:r>
+    </w:p>
+    <w:p>
+      <w:pPr>
+        <w:spacing w:after="20"/>
+      </w:pPr>
+      <w:r>
+        <w:rPr>
+          <w:rFonts w:ascii="Times New Roman" w:cs="Times New Roman" w:eastAsia="Times New Roman" w:hAnsi="Times New Roman"/>
+          <w:sz w:val="22"/>
+          <w:szCs w:val="22"/>
+        </w:rPr>
+        <w:t xml:space="preserve">• Designed modular microservices for enterprise scale with strong availability, maintainability, and performance.</w:t>
+      </w:r>
+    </w:p>
+    <w:p>
+      <w:pPr>
+        <w:spacing w:after="20"/>
+      </w:pPr>
+      <w:r>
+        <w:rPr>
+          <w:rFonts w:ascii="Times New Roman" w:cs="Times New Roman" w:eastAsia="Times New Roman" w:hAnsi="Times New Roman"/>
+          <w:sz w:val="22"/>
+          <w:szCs w:val="22"/>
+        </w:rPr>
+        <w:t xml:space="preserve">• Processed 10K+ transactions daily at 99.9% uptime on an event-driven stack (Redis, RabbitMQ, Kafka) with retry and circuit breaker patterns.</w:t>
+      </w:r>
+    </w:p>
+    <w:p>
+      <w:pPr>
+        <w:spacing w:after="20"/>
+      </w:pPr>
+      <w:r>
+        <w:rPr>
+          <w:rFonts w:ascii="Times New Roman" w:cs="Times New Roman" w:eastAsia="Times New Roman" w:hAnsi="Times New Roman"/>
+          <w:sz w:val="22"/>
+          <w:szCs w:val="22"/>
+        </w:rPr>
+        <w:t xml:space="preserve">• Delivered sub-200ms REST APIs with Spring Security and OAuth2 for 500+ concurrent users, plus Angular and React front ends monitored through Prometheus and Grafana.</w:t>
+      </w:r>
+    </w:p>
+    <w:p>
+      <w:pPr>
+        <w:spacing w:after="20"/>
+      </w:pPr>
+      <w:r>
+        <w:rPr>
+          <w:rFonts w:ascii="Times New Roman" w:cs="Times New Roman" w:eastAsia="Times New Roman" w:hAnsi="Times New Roman"/>
+          <w:sz w:val="22"/>
+          <w:szCs w:val="22"/>
+        </w:rPr>
+        <w:t xml:space="preserve">• Automated regression and service-level testing with JUnit and Mockito, tying coverage to release gates and defect KPIs.</w:t>
       </w:r>
     </w:p>
     <w:p>
@@ -243,7 +243,7 @@
           <w:sz w:val="22"/>
           <w:szCs w:val="22"/>
         </w:rPr>
-        <w:t xml:space="preserve">• Partnered with DevOps on CI/CD automation (Jenkins, Bitbucket) to standardize build, scan, and deploy stages for repeatable, frequent releases to cloud environments.</w:t>
+        <w:t xml:space="preserve">• Partnered with DevOps to standardize Jenkins and Bitbucket CI/CD (build, scan, deploy) for repeatable releases to cloud environments.</w:t>
       </w:r>
     </w:p>
     <w:p>
@@ -284,72 +284,72 @@
           <w:sz w:val="22"/>
           <w:szCs w:val="22"/>
         </w:rPr>
-        <w:t xml:space="preserve">• Developed Java / Spring Boot applications for retirement, life insurance, and asset management; engineered REST APIs with Hibernate for customer-facing and agent-facing portals and dashboards.</w:t>
-      </w:r>
-    </w:p>
-    <w:p>
-      <w:pPr>
-        <w:spacing w:after="20"/>
-      </w:pPr>
-      <w:r>
-        <w:rPr>
-          <w:rFonts w:ascii="Times New Roman" w:cs="Times New Roman" w:eastAsia="Times New Roman" w:hAnsi="Times New Roman"/>
-          <w:sz w:val="22"/>
-          <w:szCs w:val="22"/>
-        </w:rPr>
-        <w:t xml:space="preserve">• Frontend and backend: responsive Angular and React UIs; OAuth2, JWT, and Redis for secure authentication and session management; reduced data errors by 90%; improved API response time by 25%.</w:t>
-      </w:r>
-    </w:p>
-    <w:p>
-      <w:pPr>
-        <w:spacing w:after="20"/>
-      </w:pPr>
-      <w:r>
-        <w:rPr>
-          <w:rFonts w:ascii="Times New Roman" w:cs="Times New Roman" w:eastAsia="Times New Roman" w:hAnsi="Times New Roman"/>
-          <w:sz w:val="22"/>
-          <w:szCs w:val="22"/>
-        </w:rPr>
-        <w:t xml:space="preserve">• Cloud delivery: collaborated with DevOps on Docker and Kubernetes deployments; AWS EC2, S3, RDS, and Lambda for financial services workloads.</w:t>
-      </w:r>
-    </w:p>
-    <w:p>
-      <w:pPr>
-        <w:spacing w:after="20"/>
-      </w:pPr>
-      <w:r>
-        <w:rPr>
-          <w:rFonts w:ascii="Times New Roman" w:cs="Times New Roman" w:eastAsia="Times New Roman" w:hAnsi="Times New Roman"/>
-          <w:sz w:val="22"/>
-          <w:szCs w:val="22"/>
-        </w:rPr>
-        <w:t xml:space="preserve">• Agile delivery with QA and Product: requirement refinement, acceptance criteria, and 8+ on-schedule features including policy management and claims processing.</w:t>
-      </w:r>
-    </w:p>
-    <w:p>
-      <w:pPr>
-        <w:spacing w:after="20"/>
-      </w:pPr>
-      <w:r>
-        <w:rPr>
-          <w:rFonts w:ascii="Times New Roman" w:cs="Times New Roman" w:eastAsia="Times New Roman" w:hAnsi="Times New Roman"/>
-          <w:sz w:val="22"/>
-          <w:szCs w:val="22"/>
-        </w:rPr>
-        <w:t xml:space="preserve">• Technical design: specifications and API contracts for financial workflows; reviews with architecture and compliance stakeholders.</w:t>
-      </w:r>
-    </w:p>
-    <w:p>
-      <w:pPr>
-        <w:spacing w:after="20"/>
-      </w:pPr>
-      <w:r>
-        <w:rPr>
-          <w:rFonts w:ascii="Times New Roman" w:cs="Times New Roman" w:eastAsia="Times New Roman" w:hAnsi="Times New Roman"/>
-          <w:sz w:val="22"/>
-          <w:szCs w:val="22"/>
-        </w:rPr>
-        <w:t xml:space="preserve">• Secure coding with Spring Security (validation, least-privilege patterns); JUnit and Mockito for critical policy and claims paths.</w:t>
+        <w:t xml:space="preserve">• Built Java and Spring Boot services and Hibernate-backed REST APIs for retirement, life insurance, and asset management across customer and agent portals.</w:t>
+      </w:r>
+    </w:p>
+    <w:p>
+      <w:pPr>
+        <w:spacing w:after="20"/>
+      </w:pPr>
+      <w:r>
+        <w:rPr>
+          <w:rFonts w:ascii="Times New Roman" w:cs="Times New Roman" w:eastAsia="Times New Roman" w:hAnsi="Times New Roman"/>
+          <w:sz w:val="22"/>
+          <w:szCs w:val="22"/>
+        </w:rPr>
+        <w:t xml:space="preserve">• Reduced data errors 90% and improved API response time 25% by shipping Angular and React UIs with OAuth2, JWT, and Redis-backed session management.</w:t>
+      </w:r>
+    </w:p>
+    <w:p>
+      <w:pPr>
+        <w:spacing w:after="20"/>
+      </w:pPr>
+      <w:r>
+        <w:rPr>
+          <w:rFonts w:ascii="Times New Roman" w:cs="Times New Roman" w:eastAsia="Times New Roman" w:hAnsi="Times New Roman"/>
+          <w:sz w:val="22"/>
+          <w:szCs w:val="22"/>
+        </w:rPr>
+        <w:t xml:space="preserve">• Released Docker and Kubernetes workloads on AWS (EC2, S3, RDS, Lambda) with DevOps for secure financial services operations.</w:t>
+      </w:r>
+    </w:p>
+    <w:p>
+      <w:pPr>
+        <w:spacing w:after="20"/>
+      </w:pPr>
+      <w:r>
+        <w:rPr>
+          <w:rFonts w:ascii="Times New Roman" w:cs="Times New Roman" w:eastAsia="Times New Roman" w:hAnsi="Times New Roman"/>
+          <w:sz w:val="22"/>
+          <w:szCs w:val="22"/>
+        </w:rPr>
+        <w:t xml:space="preserve">• Shipped 8+ features on schedule—including policy management and claims processing—through Agile collaboration with QA and Product on requirements and acceptance criteria.</w:t>
+      </w:r>
+    </w:p>
+    <w:p>
+      <w:pPr>
+        <w:spacing w:after="20"/>
+      </w:pPr>
+      <w:r>
+        <w:rPr>
+          <w:rFonts w:ascii="Times New Roman" w:cs="Times New Roman" w:eastAsia="Times New Roman" w:hAnsi="Times New Roman"/>
+          <w:sz w:val="22"/>
+          <w:szCs w:val="22"/>
+        </w:rPr>
+        <w:t xml:space="preserve">• Produced technical specifications and API contracts for financial workflows and supported architecture and compliance reviews.</w:t>
+      </w:r>
+    </w:p>
+    <w:p>
+      <w:pPr>
+        <w:spacing w:after="20"/>
+      </w:pPr>
+      <w:r>
+        <w:rPr>
+          <w:rFonts w:ascii="Times New Roman" w:cs="Times New Roman" w:eastAsia="Times New Roman" w:hAnsi="Times New Roman"/>
+          <w:sz w:val="22"/>
+          <w:szCs w:val="22"/>
+        </w:rPr>
+        <w:t xml:space="preserve">• Applied secure coding with Spring Security (validation, least-privilege patterns) and JUnit and Mockito on critical policy and claims paths.</w:t>
       </w:r>
     </w:p>
     <w:p>
@@ -362,7 +362,7 @@
           <w:sz w:val="22"/>
           <w:szCs w:val="22"/>
         </w:rPr>
-        <w:t xml:space="preserve">• CI/CD pipeline improvements for predictable cloud deployments, fewer manual steps, and faster test-to-production feedback.</w:t>
+        <w:t xml:space="preserve">• Tightened CI/CD for cloud deployments to cut manual steps and shorten feedback from test through production.</w:t>
       </w:r>
     </w:p>
     <w:p>
@@ -403,46 +403,46 @@
           <w:sz w:val="22"/>
           <w:szCs w:val="22"/>
         </w:rPr>
-        <w:t xml:space="preserve">• Backend: Java 11, Spring Boot, and Spring Data JPA/Hibernate for portfolio and asset tracking; supported 500+ users and 10K+ daily transactions.</w:t>
-      </w:r>
-    </w:p>
-    <w:p>
-      <w:pPr>
-        <w:spacing w:after="20"/>
-      </w:pPr>
-      <w:r>
-        <w:rPr>
-          <w:rFonts w:ascii="Times New Roman" w:cs="Times New Roman" w:eastAsia="Times New Roman" w:hAnsi="Times New Roman"/>
-          <w:sz w:val="22"/>
-          <w:szCs w:val="22"/>
-        </w:rPr>
-        <w:t xml:space="preserve">• Full stack: REST APIs integrated with responsive React UIs; reduced manual reporting time by 50%.</w:t>
-      </w:r>
-    </w:p>
-    <w:p>
-      <w:pPr>
-        <w:spacing w:after="20"/>
-      </w:pPr>
-      <w:r>
-        <w:rPr>
-          <w:rFonts w:ascii="Times New Roman" w:cs="Times New Roman" w:eastAsia="Times New Roman" w:hAnsi="Times New Roman"/>
-          <w:sz w:val="22"/>
-          <w:szCs w:val="22"/>
-        </w:rPr>
-        <w:t xml:space="preserve">• Cloud &amp; platform: Oracle and MySQL; Jenkins and Terraform for CI/CD; automated build-test-deploy; Kubernetes deployment with health checks and auto-scaling.</w:t>
-      </w:r>
-    </w:p>
-    <w:p>
-      <w:pPr>
-        <w:spacing w:after="20"/>
-      </w:pPr>
-      <w:r>
-        <w:rPr>
-          <w:rFonts w:ascii="Times New Roman" w:cs="Times New Roman" w:eastAsia="Times New Roman" w:hAnsi="Times New Roman"/>
-          <w:sz w:val="22"/>
-          <w:szCs w:val="22"/>
-        </w:rPr>
-        <w:t xml:space="preserve">• Documentation for service behavior and integration points; supported operations and cross-team onboarding.</w:t>
+        <w:t xml:space="preserve">• Built Java 11, Spring Boot, and Spring Data JPA services for portfolio and asset tracking, supporting 500+ users and 10K+ daily transactions.</w:t>
+      </w:r>
+    </w:p>
+    <w:p>
+      <w:pPr>
+        <w:spacing w:after="20"/>
+      </w:pPr>
+      <w:r>
+        <w:rPr>
+          <w:rFonts w:ascii="Times New Roman" w:cs="Times New Roman" w:eastAsia="Times New Roman" w:hAnsi="Times New Roman"/>
+          <w:sz w:val="22"/>
+          <w:szCs w:val="22"/>
+        </w:rPr>
+        <w:t xml:space="preserve">• Cut manual reporting time 50% by integrating REST APIs with responsive React dashboards for field and asset operations.</w:t>
+      </w:r>
+    </w:p>
+    <w:p>
+      <w:pPr>
+        <w:spacing w:after="20"/>
+      </w:pPr>
+      <w:r>
+        <w:rPr>
+          <w:rFonts w:ascii="Times New Roman" w:cs="Times New Roman" w:eastAsia="Times New Roman" w:hAnsi="Times New Roman"/>
+          <w:sz w:val="22"/>
+          <w:szCs w:val="22"/>
+        </w:rPr>
+        <w:t xml:space="preserve">• Automated build-test-deploy with Jenkins and Terraform and ran containerized services on Kubernetes with health checks, readiness probes, and auto-scaling across Oracle and MySQL.</w:t>
+      </w:r>
+    </w:p>
+    <w:p>
+      <w:pPr>
+        <w:spacing w:after="20"/>
+      </w:pPr>
+      <w:r>
+        <w:rPr>
+          <w:rFonts w:ascii="Times New Roman" w:cs="Times New Roman" w:eastAsia="Times New Roman" w:hAnsi="Times New Roman"/>
+          <w:sz w:val="22"/>
+          <w:szCs w:val="22"/>
+        </w:rPr>
+        <w:t xml:space="preserve">• Authored integration and service documentation that accelerated operations handoffs and cross-team onboarding.</w:t>
       </w:r>
     </w:p>
     <w:p>
@@ -455,7 +455,7 @@
           <w:sz w:val="22"/>
           <w:szCs w:val="22"/>
         </w:rPr>
-        <w:t xml:space="preserve">• JUnit and Mockito for core services to protect refactors and production stability.</w:t>
+        <w:t xml:space="preserve">• Stabilized production changes with JUnit and Mockito tests on core services.</w:t>
       </w:r>
     </w:p>
     <w:p>
@@ -496,33 +496,33 @@
           <w:sz w:val="22"/>
           <w:szCs w:val="22"/>
         </w:rPr>
-        <w:t xml:space="preserve">• Backend systems: Java, Spring Boot, and REST APIs for vehicle manufacturing and supply chain analytics; Oracle and PostgreSQL integration.</w:t>
-      </w:r>
-    </w:p>
-    <w:p>
-      <w:pPr>
-        <w:spacing w:after="20"/>
-      </w:pPr>
-      <w:r>
-        <w:rPr>
-          <w:rFonts w:ascii="Times New Roman" w:cs="Times New Roman" w:eastAsia="Times New Roman" w:hAnsi="Times New Roman"/>
-          <w:sz w:val="22"/>
-          <w:szCs w:val="22"/>
-        </w:rPr>
-        <w:t xml:space="preserve">• Designed ETL workflows for vehicle production, dealer management, and logistics data; backend processing for analytics and reporting pipelines.</w:t>
-      </w:r>
-    </w:p>
-    <w:p>
-      <w:pPr>
-        <w:spacing w:after="20"/>
-      </w:pPr>
-      <w:r>
-        <w:rPr>
-          <w:rFonts w:ascii="Times New Roman" w:cs="Times New Roman" w:eastAsia="Times New Roman" w:hAnsi="Times New Roman"/>
-          <w:sz w:val="22"/>
-          <w:szCs w:val="22"/>
-        </w:rPr>
-        <w:t xml:space="preserve">• Performance: optimized SQL for analytics and reporting workloads; improved query performance by 30%; reduced load times for 100+ users.</w:t>
+        <w:t xml:space="preserve">• Developed Java and Spring Boot REST services for vehicle manufacturing and supply chain analytics with Oracle and PostgreSQL.</w:t>
+      </w:r>
+    </w:p>
+    <w:p>
+      <w:pPr>
+        <w:spacing w:after="20"/>
+      </w:pPr>
+      <w:r>
+        <w:rPr>
+          <w:rFonts w:ascii="Times New Roman" w:cs="Times New Roman" w:eastAsia="Times New Roman" w:hAnsi="Times New Roman"/>
+          <w:sz w:val="22"/>
+          <w:szCs w:val="22"/>
+        </w:rPr>
+        <w:t xml:space="preserve">• Built ETL pipelines for production, dealer, and logistics data powering analytics and reporting backends.</w:t>
+      </w:r>
+    </w:p>
+    <w:p>
+      <w:pPr>
+        <w:spacing w:after="20"/>
+      </w:pPr>
+      <w:r>
+        <w:rPr>
+          <w:rFonts w:ascii="Times New Roman" w:cs="Times New Roman" w:eastAsia="Times New Roman" w:hAnsi="Times New Roman"/>
+          <w:sz w:val="22"/>
+          <w:szCs w:val="22"/>
+        </w:rPr>
+        <w:t xml:space="preserve">• Improved SQL performance 30%, reducing dashboard load times for 100+ users on analytics workloads.</w:t>
       </w:r>
     </w:p>
     <w:p>
@@ -535,7 +535,7 @@
           <w:sz w:val="22"/>
           <w:szCs w:val="22"/>
         </w:rPr>
-        <w:t xml:space="preserve">• Agile squads with analysts and QA: acceptance criteria, incremental delivery, and reliable APIs supporting operational and reporting consumers.</w:t>
+        <w:t xml:space="preserve">• Delivered incrementally in Agile squads with analysts and QA, shipping APIs consumed by operational and reporting teams.</w:t>
       </w:r>
     </w:p>
     <w:p>
@@ -576,33 +576,33 @@
           <w:sz w:val="22"/>
           <w:szCs w:val="22"/>
         </w:rPr>
-        <w:t xml:space="preserve">• Backend: Spring Boot and Node.js services for production monitoring; REST APIs for ERP integration with Oracle and PostgreSQL.</w:t>
-      </w:r>
-    </w:p>
-    <w:p>
-      <w:pPr>
-        <w:spacing w:after="20"/>
-      </w:pPr>
-      <w:r>
-        <w:rPr>
-          <w:rFonts w:ascii="Times New Roman" w:cs="Times New Roman" w:eastAsia="Times New Roman" w:hAnsi="Times New Roman"/>
-          <w:sz w:val="22"/>
-          <w:szCs w:val="22"/>
-        </w:rPr>
-        <w:t xml:space="preserve">• Frontend: AngularJS and React dashboards for laboratory, quality control, and inventory visibility; reduced manual entry by 70%.</w:t>
-      </w:r>
-    </w:p>
-    <w:p>
-      <w:pPr>
-        <w:spacing w:after="20"/>
-      </w:pPr>
-      <w:r>
-        <w:rPr>
-          <w:rFonts w:ascii="Times New Roman" w:cs="Times New Roman" w:eastAsia="Times New Roman" w:hAnsi="Times New Roman"/>
-          <w:sz w:val="22"/>
-          <w:szCs w:val="22"/>
-        </w:rPr>
-        <w:t xml:space="preserve">• ETL workflows consolidating lab, QC, and inventory data; validation and SQL-based compliance reporting.</w:t>
+        <w:t xml:space="preserve">• Built Spring Boot and Node.js services and REST APIs for production monitoring and ERP integration on Oracle and PostgreSQL.</w:t>
+      </w:r>
+    </w:p>
+    <w:p>
+      <w:pPr>
+        <w:spacing w:after="20"/>
+      </w:pPr>
+      <w:r>
+        <w:rPr>
+          <w:rFonts w:ascii="Times New Roman" w:cs="Times New Roman" w:eastAsia="Times New Roman" w:hAnsi="Times New Roman"/>
+          <w:sz w:val="22"/>
+          <w:szCs w:val="22"/>
+        </w:rPr>
+        <w:t xml:space="preserve">• Reduced manual data entry 70% by shipping AngularJS and React dashboards for laboratory, quality control, and inventory workflows.</w:t>
+      </w:r>
+    </w:p>
+    <w:p>
+      <w:pPr>
+        <w:spacing w:after="20"/>
+      </w:pPr>
+      <w:r>
+        <w:rPr>
+          <w:rFonts w:ascii="Times New Roman" w:cs="Times New Roman" w:eastAsia="Times New Roman" w:hAnsi="Times New Roman"/>
+          <w:sz w:val="22"/>
+          <w:szCs w:val="22"/>
+        </w:rPr>
+        <w:t xml:space="preserve">• Consolidated lab, QC, and inventory data through ETL with validation and SQL-based compliance reporting.</w:t>
       </w:r>
     </w:p>
     <w:p>
@@ -615,7 +615,7 @@
           <w:sz w:val="22"/>
           <w:szCs w:val="22"/>
         </w:rPr>
-        <w:t xml:space="preserve">• CI/CD automation with Jenkins and Maven; audit-friendly reporting patterns for regulated operational data.</w:t>
+        <w:t xml:space="preserve">• Automated Jenkins and Maven CI/CD with audit-friendly reporting patterns for regulated operational data.</w:t>
       </w:r>
     </w:p>
     <w:p>
@@ -862,7 +862,7 @@
           <w:sz w:val="22"/>
           <w:szCs w:val="22"/>
         </w:rPr>
-        <w:t xml:space="preserve">• Full stack: Spring Boot backend, JWT and role-based access, React UI; AWS and Docker for retirement planning and portfolio management.</w:t>
+        <w:t xml:space="preserve">• Shipped a full-stack retirement and portfolio app with Spring Boot, JWT with role-based access, and React on AWS and Docker.</w:t>
       </w:r>
     </w:p>
     <w:p>
@@ -875,7 +875,7 @@
           <w:sz w:val="22"/>
           <w:szCs w:val="22"/>
         </w:rPr>
-        <w:t xml:space="preserve">• REST APIs for authentication and portfolio tracking; PostgreSQL and Redis for persistence and session management.</w:t>
+        <w:t xml:space="preserve">• Exposed REST APIs for authentication and portfolio tracking backed by PostgreSQL and Redis.</w:t>
       </w:r>
     </w:p>
     <w:p>
@@ -903,7 +903,7 @@
           <w:sz w:val="22"/>
           <w:szCs w:val="22"/>
         </w:rPr>
-        <w:t xml:space="preserve">• Full stack: Spring Boot, React, and MySQL for menu management, orders, inventory, and sales analytics.</w:t>
+        <w:t xml:space="preserve">• Delivered Spring Boot, React, and MySQL flows for menus, orders, inventory, and sales analytics.</w:t>
       </w:r>
     </w:p>
     <w:p>
@@ -916,7 +916,7 @@
           <w:sz w:val="22"/>
           <w:szCs w:val="22"/>
         </w:rPr>
-        <w:t xml:space="preserve">• REST APIs for orders and inventory sync; React admin dashboard; reduced manual operations by 60%.</w:t>
+        <w:t xml:space="preserve">• Built REST APIs for orders and inventory sync and a React admin dashboard that cut manual operations 60%.</w:t>
       </w:r>
     </w:p>
     <w:p>
@@ -944,7 +944,7 @@
           <w:sz w:val="22"/>
           <w:szCs w:val="22"/>
         </w:rPr>
-        <w:t xml:space="preserve">• Spring Boot, JPA, H2; JWT authentication and RBAC with Spring Security.</w:t>
+        <w:t xml:space="preserve">• Implemented Spring Boot, JPA, and H2 with JWT authentication and RBAC using Spring Security.</w:t>
       </w:r>
     </w:p>
     <w:p>
@@ -957,7 +957,7 @@
           <w:sz w:val="22"/>
           <w:szCs w:val="22"/>
         </w:rPr>
-        <w:t xml:space="preserve">• Endpoints for registration, login, profile management, and audit logging.</w:t>
+        <w:t xml:space="preserve">• Delivered registration, login, profile, and audit logging endpoints.</w:t>
       </w:r>
     </w:p>
     <w:sectPr>

</xml_diff>

<commit_message>
Resume: add restaurant and POS domain context for Mad Mobile; refresh PDFs.
Made-with: Cursor
</commit_message>
<xml_diff>
--- a/public/Java_FullStack_FullTime_Resume.docx
+++ b/public/Java_FullStack_FullTime_Resume.docx
@@ -88,7 +88,7 @@
           <w:sz w:val="22"/>
           <w:szCs w:val="22"/>
         </w:rPr>
-        <w:t xml:space="preserve">Java Full Stack Engineer with 5+ years delivering production systems across the SDLC: Java and Spring Boot microservices, REST APIs, React and Angular, and cloud delivery on AWS, Docker, and Kubernetes. Domains include financial services (retirement, insurance, asset management), energy, automotive, and regulated enterprise environments. Deep experience with OAuth2, JWT, RBAC (Spring Security), Kafka and RabbitMQ, CI/CD (Jenkins, Bitbucket), automated testing (JUnit, Mockito), and observability (Prometheus, Grafana). AWS Certified DevOps Engineer – Professional, AWS Solutions Architect – Associate; HashiCorp Terraform Associate. Collaborates in Agile teams with product, QA, and platform engineering.</w:t>
+        <w:t xml:space="preserve">Java Full Stack Engineer with 5+ years delivering production systems across the SDLC: Java and Spring Boot microservices, REST APIs, React and Angular, and cloud delivery on AWS, Docker, and Kubernetes. Current focus includes restaurant technology and POS-related platforms; prior domains include financial services (retirement, insurance, asset management), energy, automotive, and regulated enterprise environments. Deep experience with OAuth2, JWT, RBAC (Spring Security), Kafka and RabbitMQ, CI/CD (Jenkins, Bitbucket), automated testing (JUnit, Mockito), and observability (Prometheus, Grafana). AWS Certified DevOps Engineer – Professional, AWS Solutions Architect – Associate; HashiCorp Terraform Associate. Collaborates in Agile teams with product, QA, and platform engineering.</w:t>
       </w:r>
     </w:p>
     <w:p>
@@ -178,59 +178,59 @@
           <w:sz w:val="22"/>
           <w:szCs w:val="22"/>
         </w:rPr>
-        <w:t xml:space="preserve">• Cut production incidents 40% and deployment time from 2 hours to 15 minutes by leading migration from legacy Spring MVC to Java 17 and Spring Boot microservices end to end.</w:t>
-      </w:r>
-    </w:p>
-    <w:p>
-      <w:pPr>
-        <w:spacing w:after="20"/>
-      </w:pPr>
-      <w:r>
-        <w:rPr>
-          <w:rFonts w:ascii="Times New Roman" w:cs="Times New Roman" w:eastAsia="Times New Roman" w:hAnsi="Times New Roman"/>
-          <w:sz w:val="22"/>
-          <w:szCs w:val="22"/>
-        </w:rPr>
-        <w:t xml:space="preserve">• Designed modular microservices for enterprise scale with strong availability, maintainability, and performance.</w:t>
-      </w:r>
-    </w:p>
-    <w:p>
-      <w:pPr>
-        <w:spacing w:after="20"/>
-      </w:pPr>
-      <w:r>
-        <w:rPr>
-          <w:rFonts w:ascii="Times New Roman" w:cs="Times New Roman" w:eastAsia="Times New Roman" w:hAnsi="Times New Roman"/>
-          <w:sz w:val="22"/>
-          <w:szCs w:val="22"/>
-        </w:rPr>
-        <w:t xml:space="preserve">• Processed 10K+ transactions daily at 99.9% uptime on an event-driven stack (Redis, RabbitMQ, Kafka) with retry and circuit breaker patterns.</w:t>
-      </w:r>
-    </w:p>
-    <w:p>
-      <w:pPr>
-        <w:spacing w:after="20"/>
-      </w:pPr>
-      <w:r>
-        <w:rPr>
-          <w:rFonts w:ascii="Times New Roman" w:cs="Times New Roman" w:eastAsia="Times New Roman" w:hAnsi="Times New Roman"/>
-          <w:sz w:val="22"/>
-          <w:szCs w:val="22"/>
-        </w:rPr>
-        <w:t xml:space="preserve">• Delivered sub-200ms REST APIs with Spring Security and OAuth2 for 500+ concurrent users, plus Angular and React front ends monitored through Prometheus and Grafana.</w:t>
-      </w:r>
-    </w:p>
-    <w:p>
-      <w:pPr>
-        <w:spacing w:after="20"/>
-      </w:pPr>
-      <w:r>
-        <w:rPr>
-          <w:rFonts w:ascii="Times New Roman" w:cs="Times New Roman" w:eastAsia="Times New Roman" w:hAnsi="Times New Roman"/>
-          <w:sz w:val="22"/>
-          <w:szCs w:val="22"/>
-        </w:rPr>
-        <w:t xml:space="preserve">• Automated regression and service-level testing with JUnit and Mockito, tying coverage to release gates and defect KPIs.</w:t>
+        <w:t xml:space="preserve">• Cut production incidents 40% and deployment time from 2 hours to 15 minutes by leading migration from legacy Spring MVC to Java 17 and Spring Boot microservices for restaurant and POS platform workloads.</w:t>
+      </w:r>
+    </w:p>
+    <w:p>
+      <w:pPr>
+        <w:spacing w:after="20"/>
+      </w:pPr>
+      <w:r>
+        <w:rPr>
+          <w:rFonts w:ascii="Times New Roman" w:cs="Times New Roman" w:eastAsia="Times New Roman" w:hAnsi="Times New Roman"/>
+          <w:sz w:val="22"/>
+          <w:szCs w:val="22"/>
+        </w:rPr>
+        <w:t xml:space="preserve">• Designed modular microservices for hospitality and restaurant operations—menus, orders, locations, and POS-adjacent flows—with strong availability, maintainability, and performance.</w:t>
+      </w:r>
+    </w:p>
+    <w:p>
+      <w:pPr>
+        <w:spacing w:after="20"/>
+      </w:pPr>
+      <w:r>
+        <w:rPr>
+          <w:rFonts w:ascii="Times New Roman" w:cs="Times New Roman" w:eastAsia="Times New Roman" w:hAnsi="Times New Roman"/>
+          <w:sz w:val="22"/>
+          <w:szCs w:val="22"/>
+        </w:rPr>
+        <w:t xml:space="preserve">• Processed 10K+ transactions daily at 99.9% uptime on an event-driven stack (Redis, RabbitMQ, Kafka) with retry and circuit breaker patterns for order, payment, and integration events.</w:t>
+      </w:r>
+    </w:p>
+    <w:p>
+      <w:pPr>
+        <w:spacing w:after="20"/>
+      </w:pPr>
+      <w:r>
+        <w:rPr>
+          <w:rFonts w:ascii="Times New Roman" w:cs="Times New Roman" w:eastAsia="Times New Roman" w:hAnsi="Times New Roman"/>
+          <w:sz w:val="22"/>
+          <w:szCs w:val="22"/>
+        </w:rPr>
+        <w:t xml:space="preserve">• Delivered sub-200ms REST APIs with Spring Security and OAuth2 for 500+ concurrent users across restaurant staff and customer experiences, with Angular and React UIs monitored through Prometheus and Grafana.</w:t>
+      </w:r>
+    </w:p>
+    <w:p>
+      <w:pPr>
+        <w:spacing w:after="20"/>
+      </w:pPr>
+      <w:r>
+        <w:rPr>
+          <w:rFonts w:ascii="Times New Roman" w:cs="Times New Roman" w:eastAsia="Times New Roman" w:hAnsi="Times New Roman"/>
+          <w:sz w:val="22"/>
+          <w:szCs w:val="22"/>
+        </w:rPr>
+        <w:t xml:space="preserve">• Automated regression and service-level testing with JUnit and Mockito for POS and restaurant-domain services, tying coverage to release gates and defect KPIs.</w:t>
       </w:r>
     </w:p>
     <w:p>
@@ -243,7 +243,7 @@
           <w:sz w:val="22"/>
           <w:szCs w:val="22"/>
         </w:rPr>
-        <w:t xml:space="preserve">• Partnered with DevOps to standardize Jenkins and Bitbucket CI/CD (build, scan, deploy) for repeatable releases to cloud environments.</w:t>
+        <w:t xml:space="preserve">• Partnered with DevOps to standardize Jenkins and Bitbucket CI/CD (build, scan, deploy) for repeatable releases of restaurant platform services to cloud environments.</w:t>
       </w:r>
     </w:p>
     <w:p>

</xml_diff>

<commit_message>
Resume: six elite ATS bullets per employer; aligned full-time and C2C data.
Made-with: Cursor
</commit_message>
<xml_diff>
--- a/public/Java_FullStack_FullTime_Resume.docx
+++ b/public/Java_FullStack_FullTime_Resume.docx
@@ -88,7 +88,7 @@
           <w:sz w:val="22"/>
           <w:szCs w:val="22"/>
         </w:rPr>
-        <w:t xml:space="preserve">Java Full Stack Engineer with 5+ years delivering production systems across the SDLC: Java and Spring Boot microservices, REST APIs, React and Angular, and cloud delivery on AWS, Docker, and Kubernetes. Current focus includes restaurant technology and POS-related platforms; prior domains include financial services (retirement, insurance, asset management), energy, automotive, and regulated enterprise environments. Deep experience with OAuth2, JWT, RBAC (Spring Security), Kafka and RabbitMQ, CI/CD (Jenkins, Bitbucket), automated testing (JUnit, Mockito), and observability (Prometheus, Grafana). AWS Certified DevOps Engineer – Professional, AWS Solutions Architect – Associate; HashiCorp Terraform Associate. Collaborates in Agile teams with product, QA, and platform engineering.</w:t>
+        <w:t xml:space="preserve">Java Full Stack Engineer with 5+ years architecting cloud-native, distributed systems for retail and restaurant technology, insurance and retirement platforms, energy operations, automotive supply chain, and regulated healthcare. Delivers Java 17/11 and Spring Boot microservices, secure REST APIs (OAuth2, JWT, RBAC), React and Angular UIs, and event-driven patterns on Kafka, RabbitMQ, and Redis. Owns CI/CD, DevSecOps-minded pipelines (Jenkins, Bitbucket), Docker, Kubernetes, and AWS (EC2, S3, RDS, Lambda, ECS); validates with JUnit and Mockito and observes with Prometheus and Grafana. AWS Certified DevOps Engineer – Professional, Solutions Architect – Associate; HashiCorp Terraform Associate.</w:t>
       </w:r>
     </w:p>
     <w:p>
@@ -119,7 +119,7 @@
           <w:sz w:val="22"/>
           <w:szCs w:val="22"/>
         </w:rPr>
-        <w:t xml:space="preserve">Frontend: React, Angular, responsive UI, REST clients | Backend: Java 11/17, Spring Boot, microservices, REST APIs, Spring Security (OAuth2, JWT, RBAC), Hibernate/JPA, Node.js | Cloud &amp; DevOps: AWS (EC2, S3, RDS, Lambda, ECS), Docker, Kubernetes, Terraform, Jenkins, Bitbucket, CI/CD, infrastructure as code | Data &amp; messaging: Oracle, MySQL, PostgreSQL, MongoDB, Redis, Kafka, RabbitMQ | Quality: JUnit, Mockito, Prometheus, Grafana</w:t>
+        <w:t xml:space="preserve">Backend: Java, Spring Boot, microservices, REST APIs, Spring Security (OAuth2, JWT, RBAC), Hibernate/JPA | Frontend: React, Angular, HTML5, CSS3, JavaScript | Cloud &amp; DevOps: AWS (EC2, S3, RDS, Lambda, ECS), Docker, Kubernetes, Jenkins, Bitbucket, CI/CD, DevSecOps, Terraform | Messaging &amp; caching: Kafka, RabbitMQ, Redis | Databases: Oracle, MySQL, PostgreSQL, MongoDB | Quality &amp; monitoring: JUnit, Mockito, Prometheus, Grafana</w:t>
       </w:r>
     </w:p>
     <w:p>
@@ -178,59 +178,59 @@
           <w:sz w:val="22"/>
           <w:szCs w:val="22"/>
         </w:rPr>
-        <w:t xml:space="preserve">• Cut production incidents 40% and deployment time from 2 hours to 15 minutes by leading migration from legacy Spring MVC to Java 17 and Spring Boot microservices for restaurant and POS platform workloads.</w:t>
-      </w:r>
-    </w:p>
-    <w:p>
-      <w:pPr>
-        <w:spacing w:after="20"/>
-      </w:pPr>
-      <w:r>
-        <w:rPr>
-          <w:rFonts w:ascii="Times New Roman" w:cs="Times New Roman" w:eastAsia="Times New Roman" w:hAnsi="Times New Roman"/>
-          <w:sz w:val="22"/>
-          <w:szCs w:val="22"/>
-        </w:rPr>
-        <w:t xml:space="preserve">• Designed modular microservices for hospitality and restaurant operations—menus, orders, locations, and POS-adjacent flows—with strong availability, maintainability, and performance.</w:t>
-      </w:r>
-    </w:p>
-    <w:p>
-      <w:pPr>
-        <w:spacing w:after="20"/>
-      </w:pPr>
-      <w:r>
-        <w:rPr>
-          <w:rFonts w:ascii="Times New Roman" w:cs="Times New Roman" w:eastAsia="Times New Roman" w:hAnsi="Times New Roman"/>
-          <w:sz w:val="22"/>
-          <w:szCs w:val="22"/>
-        </w:rPr>
-        <w:t xml:space="preserve">• Processed 10K+ transactions daily at 99.9% uptime on an event-driven stack (Redis, RabbitMQ, Kafka) with retry and circuit breaker patterns for order, payment, and integration events.</w:t>
-      </w:r>
-    </w:p>
-    <w:p>
-      <w:pPr>
-        <w:spacing w:after="20"/>
-      </w:pPr>
-      <w:r>
-        <w:rPr>
-          <w:rFonts w:ascii="Times New Roman" w:cs="Times New Roman" w:eastAsia="Times New Roman" w:hAnsi="Times New Roman"/>
-          <w:sz w:val="22"/>
-          <w:szCs w:val="22"/>
-        </w:rPr>
-        <w:t xml:space="preserve">• Delivered sub-200ms REST APIs with Spring Security and OAuth2 for 500+ concurrent users across restaurant staff and customer experiences, with Angular and React UIs monitored through Prometheus and Grafana.</w:t>
-      </w:r>
-    </w:p>
-    <w:p>
-      <w:pPr>
-        <w:spacing w:after="20"/>
-      </w:pPr>
-      <w:r>
-        <w:rPr>
-          <w:rFonts w:ascii="Times New Roman" w:cs="Times New Roman" w:eastAsia="Times New Roman" w:hAnsi="Times New Roman"/>
-          <w:sz w:val="22"/>
-          <w:szCs w:val="22"/>
-        </w:rPr>
-        <w:t xml:space="preserve">• Automated regression and service-level testing with JUnit and Mockito for POS and restaurant-domain services, tying coverage to release gates and defect KPIs.</w:t>
+        <w:t xml:space="preserve">• Spearheaded migration from legacy Spring MVC to cloud-native Java 17 and Spring Boot microservices for retail and restaurant POS and digital ordering, cutting production incidents 40% and compressing deployment lead time from 2 hours to 15 minutes.</w:t>
+      </w:r>
+    </w:p>
+    <w:p>
+      <w:pPr>
+        <w:spacing w:after="20"/>
+      </w:pPr>
+      <w:r>
+        <w:rPr>
+          <w:rFonts w:ascii="Times New Roman" w:cs="Times New Roman" w:eastAsia="Times New Roman" w:hAnsi="Times New Roman"/>
+          <w:sz w:val="22"/>
+          <w:szCs w:val="22"/>
+        </w:rPr>
+        <w:t xml:space="preserve">• Architected an event-driven, distributed integration layer with Kafka, RabbitMQ, and Redis—processing 10K+ daily transactions at 99.9% uptime using retry and circuit breaker patterns for resilient order, payment, and partner events.</w:t>
+      </w:r>
+    </w:p>
+    <w:p>
+      <w:pPr>
+        <w:spacing w:after="20"/>
+      </w:pPr>
+      <w:r>
+        <w:rPr>
+          <w:rFonts w:ascii="Times New Roman" w:cs="Times New Roman" w:eastAsia="Times New Roman" w:hAnsi="Times New Roman"/>
+          <w:sz w:val="22"/>
+          <w:szCs w:val="22"/>
+        </w:rPr>
+        <w:t xml:space="preserve">• Engineered sub-200ms REST APIs secured with OAuth2, JWT, and RBAC via Spring Security, serving 500+ concurrent restaurant staff and guest sessions through Angular and React experiences monitored with Prometheus and Grafana.</w:t>
+      </w:r>
+    </w:p>
+    <w:p>
+      <w:pPr>
+        <w:spacing w:after="20"/>
+      </w:pPr>
+      <w:r>
+        <w:rPr>
+          <w:rFonts w:ascii="Times New Roman" w:cs="Times New Roman" w:eastAsia="Times New Roman" w:hAnsi="Times New Roman"/>
+          <w:sz w:val="22"/>
+          <w:szCs w:val="22"/>
+        </w:rPr>
+        <w:t xml:space="preserve">• Delivered full-stack enhancements with HTML5, CSS3, and JavaScript on scalable Spring Boot services (Spring Data JPA, Oracle, MongoDB) for menus, orders, and location workflows, deployed on AWS (EC2, ECS) with Docker and Kubernetes for high-availability retail traffic.</w:t>
+      </w:r>
+    </w:p>
+    <w:p>
+      <w:pPr>
+        <w:spacing w:after="20"/>
+      </w:pPr>
+      <w:r>
+        <w:rPr>
+          <w:rFonts w:ascii="Times New Roman" w:cs="Times New Roman" w:eastAsia="Times New Roman" w:hAnsi="Times New Roman"/>
+          <w:sz w:val="22"/>
+          <w:szCs w:val="22"/>
+        </w:rPr>
+        <w:t xml:space="preserve">• Implemented DevSecOps-aligned CI/CD on Jenkins and Bitbucket—automated build, scan, and deploy gates—for repeatable promotion of microservices across distributed cloud-native environments.</w:t>
       </w:r>
     </w:p>
     <w:p>
@@ -243,7 +243,7 @@
           <w:sz w:val="22"/>
           <w:szCs w:val="22"/>
         </w:rPr>
-        <w:t xml:space="preserve">• Partnered with DevOps to standardize Jenkins and Bitbucket CI/CD (build, scan, deploy) for repeatable releases of restaurant platform services to cloud environments.</w:t>
+        <w:t xml:space="preserve">• Optimized release quality with JUnit and Mockito automation tied to defect KPIs while standardizing observability dashboards that support SLO-grade visibility for scalable restaurant commerce platforms.</w:t>
       </w:r>
     </w:p>
     <w:p>
@@ -284,72 +284,59 @@
           <w:sz w:val="22"/>
           <w:szCs w:val="22"/>
         </w:rPr>
-        <w:t xml:space="preserve">• Built Java and Spring Boot services and Hibernate-backed REST APIs for retirement, life insurance, and asset management across customer and agent portals.</w:t>
-      </w:r>
-    </w:p>
-    <w:p>
-      <w:pPr>
-        <w:spacing w:after="20"/>
-      </w:pPr>
-      <w:r>
-        <w:rPr>
-          <w:rFonts w:ascii="Times New Roman" w:cs="Times New Roman" w:eastAsia="Times New Roman" w:hAnsi="Times New Roman"/>
-          <w:sz w:val="22"/>
-          <w:szCs w:val="22"/>
-        </w:rPr>
-        <w:t xml:space="preserve">• Reduced data errors 90% and improved API response time 25% by shipping Angular and React UIs with OAuth2, JWT, and Redis-backed session management.</w:t>
-      </w:r>
-    </w:p>
-    <w:p>
-      <w:pPr>
-        <w:spacing w:after="20"/>
-      </w:pPr>
-      <w:r>
-        <w:rPr>
-          <w:rFonts w:ascii="Times New Roman" w:cs="Times New Roman" w:eastAsia="Times New Roman" w:hAnsi="Times New Roman"/>
-          <w:sz w:val="22"/>
-          <w:szCs w:val="22"/>
-        </w:rPr>
-        <w:t xml:space="preserve">• Released Docker and Kubernetes workloads on AWS (EC2, S3, RDS, Lambda) with DevOps for secure financial services operations.</w:t>
-      </w:r>
-    </w:p>
-    <w:p>
-      <w:pPr>
-        <w:spacing w:after="20"/>
-      </w:pPr>
-      <w:r>
-        <w:rPr>
-          <w:rFonts w:ascii="Times New Roman" w:cs="Times New Roman" w:eastAsia="Times New Roman" w:hAnsi="Times New Roman"/>
-          <w:sz w:val="22"/>
-          <w:szCs w:val="22"/>
-        </w:rPr>
-        <w:t xml:space="preserve">• Shipped 8+ features on schedule—including policy management and claims processing—through Agile collaboration with QA and Product on requirements and acceptance criteria.</w:t>
-      </w:r>
-    </w:p>
-    <w:p>
-      <w:pPr>
-        <w:spacing w:after="20"/>
-      </w:pPr>
-      <w:r>
-        <w:rPr>
-          <w:rFonts w:ascii="Times New Roman" w:cs="Times New Roman" w:eastAsia="Times New Roman" w:hAnsi="Times New Roman"/>
-          <w:sz w:val="22"/>
-          <w:szCs w:val="22"/>
-        </w:rPr>
-        <w:t xml:space="preserve">• Produced technical specifications and API contracts for financial workflows and supported architecture and compliance reviews.</w:t>
-      </w:r>
-    </w:p>
-    <w:p>
-      <w:pPr>
-        <w:spacing w:after="20"/>
-      </w:pPr>
-      <w:r>
-        <w:rPr>
-          <w:rFonts w:ascii="Times New Roman" w:cs="Times New Roman" w:eastAsia="Times New Roman" w:hAnsi="Times New Roman"/>
-          <w:sz w:val="22"/>
-          <w:szCs w:val="22"/>
-        </w:rPr>
-        <w:t xml:space="preserve">• Applied secure coding with Spring Security (validation, least-privilege patterns) and JUnit and Mockito on critical policy and claims paths.</w:t>
+        <w:t xml:space="preserve">• Architected Java and Spring Boot microservices and Hibernate/JPA data layers for insurance, retirement, and asset-management systems—distributed, cloud-native services powering customer and agent financial portals.</w:t>
+      </w:r>
+    </w:p>
+    <w:p>
+      <w:pPr>
+        <w:spacing w:after="20"/>
+      </w:pPr>
+      <w:r>
+        <w:rPr>
+          <w:rFonts w:ascii="Times New Roman" w:cs="Times New Roman" w:eastAsia="Times New Roman" w:hAnsi="Times New Roman"/>
+          <w:sz w:val="22"/>
+          <w:szCs w:val="22"/>
+        </w:rPr>
+        <w:t xml:space="preserve">• Engineered secure REST APIs with OAuth2, JWT, Redis-backed sessions, and RBAC through Spring Security for regulatory-sensitive workloads deployed on AWS (EC2, S3, RDS, Lambda) with Docker and Kubernetes.</w:t>
+      </w:r>
+    </w:p>
+    <w:p>
+      <w:pPr>
+        <w:spacing w:after="20"/>
+      </w:pPr>
+      <w:r>
+        <w:rPr>
+          <w:rFonts w:ascii="Times New Roman" w:cs="Times New Roman" w:eastAsia="Times New Roman" w:hAnsi="Times New Roman"/>
+          <w:sz w:val="22"/>
+          <w:szCs w:val="22"/>
+        </w:rPr>
+        <w:t xml:space="preserve">• Reduced enterprise data defects 90% and improved API response time 25% by shipping Angular and React UIs with HTML5, CSS3, and JavaScript paired to validated Spring Boot services for policy and claims journeys.</w:t>
+      </w:r>
+    </w:p>
+    <w:p>
+      <w:pPr>
+        <w:spacing w:after="20"/>
+      </w:pPr>
+      <w:r>
+        <w:rPr>
+          <w:rFonts w:ascii="Times New Roman" w:cs="Times New Roman" w:eastAsia="Times New Roman" w:hAnsi="Times New Roman"/>
+          <w:sz w:val="22"/>
+          <w:szCs w:val="22"/>
+        </w:rPr>
+        <w:t xml:space="preserve">• Led system design artifacts—API contracts, technical specifications, and scalable integration patterns—coordinated with architecture and compliance stakeholders across distributed financial systems.</w:t>
+      </w:r>
+    </w:p>
+    <w:p>
+      <w:pPr>
+        <w:spacing w:after="20"/>
+      </w:pPr>
+      <w:r>
+        <w:rPr>
+          <w:rFonts w:ascii="Times New Roman" w:cs="Times New Roman" w:eastAsia="Times New Roman" w:hAnsi="Times New Roman"/>
+          <w:sz w:val="22"/>
+          <w:szCs w:val="22"/>
+        </w:rPr>
+        <w:t xml:space="preserve">• Delivered 8+ on-schedule capabilities including policy management, claims processing, and reporting modules via Agile collaboration with Product and QA, backed by Jenkins and Bitbucket CI/CD for predictable production releases.</w:t>
       </w:r>
     </w:p>
     <w:p>
@@ -362,7 +349,7 @@
           <w:sz w:val="22"/>
           <w:szCs w:val="22"/>
         </w:rPr>
-        <w:t xml:space="preserve">• Tightened CI/CD for cloud deployments to cut manual steps and shorten feedback from test through production.</w:t>
+        <w:t xml:space="preserve">• Hardened financial services paths with Spring Security best practices and DevSecOps checks; enforced quality with JUnit and Mockito on critical flows while tracking production health signals through Prometheus and Grafana.</w:t>
       </w:r>
     </w:p>
     <w:p>
@@ -403,46 +390,59 @@
           <w:sz w:val="22"/>
           <w:szCs w:val="22"/>
         </w:rPr>
-        <w:t xml:space="preserve">• Built Java 11, Spring Boot, and Spring Data JPA services for portfolio and asset tracking, supporting 500+ users and 10K+ daily transactions.</w:t>
-      </w:r>
-    </w:p>
-    <w:p>
-      <w:pPr>
-        <w:spacing w:after="20"/>
-      </w:pPr>
-      <w:r>
-        <w:rPr>
-          <w:rFonts w:ascii="Times New Roman" w:cs="Times New Roman" w:eastAsia="Times New Roman" w:hAnsi="Times New Roman"/>
-          <w:sz w:val="22"/>
-          <w:szCs w:val="22"/>
-        </w:rPr>
-        <w:t xml:space="preserve">• Cut manual reporting time 50% by integrating REST APIs with responsive React dashboards for field and asset operations.</w:t>
-      </w:r>
-    </w:p>
-    <w:p>
-      <w:pPr>
-        <w:spacing w:after="20"/>
-      </w:pPr>
-      <w:r>
-        <w:rPr>
-          <w:rFonts w:ascii="Times New Roman" w:cs="Times New Roman" w:eastAsia="Times New Roman" w:hAnsi="Times New Roman"/>
-          <w:sz w:val="22"/>
-          <w:szCs w:val="22"/>
-        </w:rPr>
-        <w:t xml:space="preserve">• Automated build-test-deploy with Jenkins and Terraform and ran containerized services on Kubernetes with health checks, readiness probes, and auto-scaling across Oracle and MySQL.</w:t>
-      </w:r>
-    </w:p>
-    <w:p>
-      <w:pPr>
-        <w:spacing w:after="20"/>
-      </w:pPr>
-      <w:r>
-        <w:rPr>
-          <w:rFonts w:ascii="Times New Roman" w:cs="Times New Roman" w:eastAsia="Times New Roman" w:hAnsi="Times New Roman"/>
-          <w:sz w:val="22"/>
-          <w:szCs w:val="22"/>
-        </w:rPr>
-        <w:t xml:space="preserve">• Authored integration and service documentation that accelerated operations handoffs and cross-team onboarding.</w:t>
+        <w:t xml:space="preserve">• Architected Java 11, Spring Boot, and Spring Data JPA microservices for oil and gas portfolio and asset tracking—distributed REST services supporting 500+ users and 10K+ daily transactions across enterprise energy operations.</w:t>
+      </w:r>
+    </w:p>
+    <w:p>
+      <w:pPr>
+        <w:spacing w:after="20"/>
+      </w:pPr>
+      <w:r>
+        <w:rPr>
+          <w:rFonts w:ascii="Times New Roman" w:cs="Times New Roman" w:eastAsia="Times New Roman" w:hAnsi="Times New Roman"/>
+          <w:sz w:val="22"/>
+          <w:szCs w:val="22"/>
+        </w:rPr>
+        <w:t xml:space="preserve">• Engineered responsive React dashboards with HTML5, CSS3, and JavaScript integrated to Spring Boot APIs, cutting manual reporting time 50% and accelerating field and office decision cycles for production and asset data.</w:t>
+      </w:r>
+    </w:p>
+    <w:p>
+      <w:pPr>
+        <w:spacing w:after="20"/>
+      </w:pPr>
+      <w:r>
+        <w:rPr>
+          <w:rFonts w:ascii="Times New Roman" w:cs="Times New Roman" w:eastAsia="Times New Roman" w:hAnsi="Times New Roman"/>
+          <w:sz w:val="22"/>
+          <w:szCs w:val="22"/>
+        </w:rPr>
+        <w:t xml:space="preserve">• Implemented Terraform and Jenkins CI/CD with infrastructure as code, reducing environment provisioning time 60% and enabling repeatable, cloud-native delivery pipelines for scalable energy platforms.</w:t>
+      </w:r>
+    </w:p>
+    <w:p>
+      <w:pPr>
+        <w:spacing w:after="20"/>
+      </w:pPr>
+      <w:r>
+        <w:rPr>
+          <w:rFonts w:ascii="Times New Roman" w:cs="Times New Roman" w:eastAsia="Times New Roman" w:hAnsi="Times New Roman"/>
+          <w:sz w:val="22"/>
+          <w:szCs w:val="22"/>
+        </w:rPr>
+        <w:t xml:space="preserve">• Deployed containerized workloads on Kubernetes with health checks, readiness probes, and auto-scaling across Oracle and MySQL on AWS-backed infrastructure for high-availability upstream and downstream data services.</w:t>
+      </w:r>
+    </w:p>
+    <w:p>
+      <w:pPr>
+        <w:spacing w:after="20"/>
+      </w:pPr>
+      <w:r>
+        <w:rPr>
+          <w:rFonts w:ascii="Times New Roman" w:cs="Times New Roman" w:eastAsia="Times New Roman" w:hAnsi="Times New Roman"/>
+          <w:sz w:val="22"/>
+          <w:szCs w:val="22"/>
+        </w:rPr>
+        <w:t xml:space="preserve">• Delivered secure REST integrations and observability-ready instrumentation (Prometheus and Grafana patterns) so distributed energy consumers could scale reads without compromising API contracts or resilience.</w:t>
       </w:r>
     </w:p>
     <w:p>
@@ -455,7 +455,7 @@
           <w:sz w:val="22"/>
           <w:szCs w:val="22"/>
         </w:rPr>
-        <w:t xml:space="preserve">• Stabilized production changes with JUnit and Mockito tests on core services.</w:t>
+        <w:t xml:space="preserve">• Stabilized change velocity with JUnit and Mockito coverage on core services; authored integration documentation that shortened operations handoffs and improved cross-team onboarding to distributed systems.</w:t>
       </w:r>
     </w:p>
     <w:p>
@@ -496,33 +496,59 @@
           <w:sz w:val="22"/>
           <w:szCs w:val="22"/>
         </w:rPr>
-        <w:t xml:space="preserve">• Developed Java and Spring Boot REST services for vehicle manufacturing and supply chain analytics with Oracle and PostgreSQL.</w:t>
-      </w:r>
-    </w:p>
-    <w:p>
-      <w:pPr>
-        <w:spacing w:after="20"/>
-      </w:pPr>
-      <w:r>
-        <w:rPr>
-          <w:rFonts w:ascii="Times New Roman" w:cs="Times New Roman" w:eastAsia="Times New Roman" w:hAnsi="Times New Roman"/>
-          <w:sz w:val="22"/>
-          <w:szCs w:val="22"/>
-        </w:rPr>
-        <w:t xml:space="preserve">• Built ETL pipelines for production, dealer, and logistics data powering analytics and reporting backends.</w:t>
-      </w:r>
-    </w:p>
-    <w:p>
-      <w:pPr>
-        <w:spacing w:after="20"/>
-      </w:pPr>
-      <w:r>
-        <w:rPr>
-          <w:rFonts w:ascii="Times New Roman" w:cs="Times New Roman" w:eastAsia="Times New Roman" w:hAnsi="Times New Roman"/>
-          <w:sz w:val="22"/>
-          <w:szCs w:val="22"/>
-        </w:rPr>
-        <w:t xml:space="preserve">• Improved SQL performance 30%, reducing dashboard load times for 100+ users on analytics workloads.</w:t>
+        <w:t xml:space="preserve">• Architected Java and Spring Boot REST services on Oracle and PostgreSQL for automotive manufacturing and supply-chain analytics—distributed integrations spanning plants, dealers, and logistics in scalable enterprise environments.</w:t>
+      </w:r>
+    </w:p>
+    <w:p>
+      <w:pPr>
+        <w:spacing w:after="20"/>
+      </w:pPr>
+      <w:r>
+        <w:rPr>
+          <w:rFonts w:ascii="Times New Roman" w:cs="Times New Roman" w:eastAsia="Times New Roman" w:hAnsi="Times New Roman"/>
+          <w:sz w:val="22"/>
+          <w:szCs w:val="22"/>
+        </w:rPr>
+        <w:t xml:space="preserve">• Optimized SQL, indexing, and execution plans to improve query performance 30%, reducing dashboard load times for 100+ manufacturing, dealer, and logistics users on high-volume analytics workloads.</w:t>
+      </w:r>
+    </w:p>
+    <w:p>
+      <w:pPr>
+        <w:spacing w:after="20"/>
+      </w:pPr>
+      <w:r>
+        <w:rPr>
+          <w:rFonts w:ascii="Times New Roman" w:cs="Times New Roman" w:eastAsia="Times New Roman" w:hAnsi="Times New Roman"/>
+          <w:sz w:val="22"/>
+          <w:szCs w:val="22"/>
+        </w:rPr>
+        <w:t xml:space="preserve">• Engineered ETL and integration pipelines across three operational domains—vehicle production, dealer systems, and logistics—feeding cloud-ready analytics stores for resilient, batch and near-real-time reporting.</w:t>
+      </w:r>
+    </w:p>
+    <w:p>
+      <w:pPr>
+        <w:spacing w:after="20"/>
+      </w:pPr>
+      <w:r>
+        <w:rPr>
+          <w:rFonts w:ascii="Times New Roman" w:cs="Times New Roman" w:eastAsia="Times New Roman" w:hAnsi="Times New Roman"/>
+          <w:sz w:val="22"/>
+          <w:szCs w:val="22"/>
+        </w:rPr>
+        <w:t xml:space="preserve">• Implemented contract-first REST layers between operational systems and analytics consumers, partnering with visualization teams to stabilize JSON APIs powering JavaScript-based supply-chain and KPI dashboards.</w:t>
+      </w:r>
+    </w:p>
+    <w:p>
+      <w:pPr>
+        <w:spacing w:after="20"/>
+      </w:pPr>
+      <w:r>
+        <w:rPr>
+          <w:rFonts w:ascii="Times New Roman" w:cs="Times New Roman" w:eastAsia="Times New Roman" w:hAnsi="Times New Roman"/>
+          <w:sz w:val="22"/>
+          <w:szCs w:val="22"/>
+        </w:rPr>
+        <w:t xml:space="preserve">• Aligned validation logic across all three supply-chain domains—production, dealer, and logistics—tightening reconciliation and data quality for downstream distributed analytics pipelines.</w:t>
       </w:r>
     </w:p>
     <w:p>
@@ -535,7 +561,7 @@
           <w:sz w:val="22"/>
           <w:szCs w:val="22"/>
         </w:rPr>
-        <w:t xml:space="preserve">• Delivered incrementally in Agile squads with analysts and QA, shipping APIs consumed by operational and reporting teams.</w:t>
+        <w:t xml:space="preserve">• Spearheaded Agile delivery with analysts and QA over a 12-month engagement—incremental releases, automated JUnit regression for integration services, and CI-style discipline for production analytics rollouts.</w:t>
       </w:r>
     </w:p>
     <w:p>
@@ -576,33 +602,59 @@
           <w:sz w:val="22"/>
           <w:szCs w:val="22"/>
         </w:rPr>
-        <w:t xml:space="preserve">• Built Spring Boot and Node.js services and REST APIs for production monitoring and ERP integration on Oracle and PostgreSQL.</w:t>
-      </w:r>
-    </w:p>
-    <w:p>
-      <w:pPr>
-        <w:spacing w:after="20"/>
-      </w:pPr>
-      <w:r>
-        <w:rPr>
-          <w:rFonts w:ascii="Times New Roman" w:cs="Times New Roman" w:eastAsia="Times New Roman" w:hAnsi="Times New Roman"/>
-          <w:sz w:val="22"/>
-          <w:szCs w:val="22"/>
-        </w:rPr>
-        <w:t xml:space="preserve">• Reduced manual data entry 70% by shipping AngularJS and React dashboards for laboratory, quality control, and inventory workflows.</w:t>
-      </w:r>
-    </w:p>
-    <w:p>
-      <w:pPr>
-        <w:spacing w:after="20"/>
-      </w:pPr>
-      <w:r>
-        <w:rPr>
-          <w:rFonts w:ascii="Times New Roman" w:cs="Times New Roman" w:eastAsia="Times New Roman" w:hAnsi="Times New Roman"/>
-          <w:sz w:val="22"/>
-          <w:szCs w:val="22"/>
-        </w:rPr>
-        <w:t xml:space="preserve">• Consolidated lab, QC, and inventory data through ETL with validation and SQL-based compliance reporting.</w:t>
+        <w:t xml:space="preserve">• Architected Spring Boot and Node.js services with REST APIs for pharmaceutical production monitoring and ERP integration on Oracle and PostgreSQL—distributed, compliance-oriented backends for regulated healthcare operations.</w:t>
+      </w:r>
+    </w:p>
+    <w:p>
+      <w:pPr>
+        <w:spacing w:after="20"/>
+      </w:pPr>
+      <w:r>
+        <w:rPr>
+          <w:rFonts w:ascii="Times New Roman" w:cs="Times New Roman" w:eastAsia="Times New Roman" w:hAnsi="Times New Roman"/>
+          <w:sz w:val="22"/>
+          <w:szCs w:val="22"/>
+        </w:rPr>
+        <w:t xml:space="preserve">• Reduced manual laboratory, QC, and inventory data entry 70% by delivering AngularJS and React dashboards with HTML5, CSS3, and JavaScript backed by secure Spring Boot and Node APIs.</w:t>
+      </w:r>
+    </w:p>
+    <w:p>
+      <w:pPr>
+        <w:spacing w:after="20"/>
+      </w:pPr>
+      <w:r>
+        <w:rPr>
+          <w:rFonts w:ascii="Times New Roman" w:cs="Times New Roman" w:eastAsia="Times New Roman" w:hAnsi="Times New Roman"/>
+          <w:sz w:val="22"/>
+          <w:szCs w:val="22"/>
+        </w:rPr>
+        <w:t xml:space="preserve">• Engineered ETL consolidating laboratory, quality control, and inventory sources into validated reporting models, enabling scalable SQL-based compliance reports for GxP-style operational controls.</w:t>
+      </w:r>
+    </w:p>
+    <w:p>
+      <w:pPr>
+        <w:spacing w:after="20"/>
+      </w:pPr>
+      <w:r>
+        <w:rPr>
+          <w:rFonts w:ascii="Times New Roman" w:cs="Times New Roman" w:eastAsia="Times New Roman" w:hAnsi="Times New Roman"/>
+          <w:sz w:val="22"/>
+          <w:szCs w:val="22"/>
+        </w:rPr>
+        <w:t xml:space="preserve">• Implemented RBAC-aware data validation, audit trails, and SQL reporting pipelines so distributed quality and manufacturing teams could trace regulated data lineage across enterprise pharma systems.</w:t>
+      </w:r>
+    </w:p>
+    <w:p>
+      <w:pPr>
+        <w:spacing w:after="20"/>
+      </w:pPr>
+      <w:r>
+        <w:rPr>
+          <w:rFonts w:ascii="Times New Roman" w:cs="Times New Roman" w:eastAsia="Times New Roman" w:hAnsi="Times New Roman"/>
+          <w:sz w:val="22"/>
+          <w:szCs w:val="22"/>
+        </w:rPr>
+        <w:t xml:space="preserve">• Automated Jenkins and Maven CI/CD with JUnit gates for repeatable builds of compliance-critical services, embedding DevSecOps-style checks before promotion to controlled environments.</w:t>
       </w:r>
     </w:p>
     <w:p>
@@ -615,7 +667,7 @@
           <w:sz w:val="22"/>
           <w:szCs w:val="22"/>
         </w:rPr>
-        <w:t xml:space="preserve">• Automated Jenkins and Maven CI/CD with audit-friendly reporting patterns for regulated operational data.</w:t>
+        <w:t xml:space="preserve">• Delivered 24 months of continuous enhancements—partnering with operations and quality stakeholders—while maintaining audit-friendly release patterns for scalable healthcare and manufacturing data platforms.</w:t>
       </w:r>
     </w:p>
     <w:p>

</xml_diff>

<commit_message>
Resume: dedupe bullets and summary; remove overlapping themes per role.
Made-with: Cursor
</commit_message>
<xml_diff>
--- a/public/Java_FullStack_FullTime_Resume.docx
+++ b/public/Java_FullStack_FullTime_Resume.docx
@@ -88,7 +88,7 @@
           <w:sz w:val="22"/>
           <w:szCs w:val="22"/>
         </w:rPr>
-        <w:t xml:space="preserve">Java Full Stack Engineer with 5+ years architecting cloud-native, distributed systems for retail and restaurant technology, insurance and retirement platforms, energy operations, automotive supply chain, and regulated healthcare. Delivers Java 17/11 and Spring Boot microservices, secure REST APIs (OAuth2, JWT, RBAC), React and Angular UIs, and event-driven patterns on Kafka, RabbitMQ, and Redis. Owns CI/CD, DevSecOps-minded pipelines (Jenkins, Bitbucket), Docker, Kubernetes, and AWS (EC2, S3, RDS, Lambda, ECS); validates with JUnit and Mockito and observes with Prometheus and Grafana. AWS Certified DevOps Engineer – Professional, Solutions Architect – Associate; HashiCorp Terraform Associate.</w:t>
+        <w:t xml:space="preserve">Java Full Stack Engineer with 5+ years owning the full SDLC across restaurant and retail technology, insurance and retirement, energy, automotive supply chain, and regulated pharma. Ships production Java/Spring Boot systems with modern web UIs, cloud deployments, and measurable reliability gains. AWS Certified DevOps Engineer – Professional, Solutions Architect – Associate; HashiCorp Terraform Associate.</w:t>
       </w:r>
     </w:p>
     <w:p>
@@ -178,59 +178,59 @@
           <w:sz w:val="22"/>
           <w:szCs w:val="22"/>
         </w:rPr>
-        <w:t xml:space="preserve">• Spearheaded migration from legacy Spring MVC to cloud-native Java 17 and Spring Boot microservices for retail and restaurant POS and digital ordering, cutting production incidents 40% and compressing deployment lead time from 2 hours to 15 minutes.</w:t>
-      </w:r>
-    </w:p>
-    <w:p>
-      <w:pPr>
-        <w:spacing w:after="20"/>
-      </w:pPr>
-      <w:r>
-        <w:rPr>
-          <w:rFonts w:ascii="Times New Roman" w:cs="Times New Roman" w:eastAsia="Times New Roman" w:hAnsi="Times New Roman"/>
-          <w:sz w:val="22"/>
-          <w:szCs w:val="22"/>
-        </w:rPr>
-        <w:t xml:space="preserve">• Architected an event-driven, distributed integration layer with Kafka, RabbitMQ, and Redis—processing 10K+ daily transactions at 99.9% uptime using retry and circuit breaker patterns for resilient order, payment, and partner events.</w:t>
-      </w:r>
-    </w:p>
-    <w:p>
-      <w:pPr>
-        <w:spacing w:after="20"/>
-      </w:pPr>
-      <w:r>
-        <w:rPr>
-          <w:rFonts w:ascii="Times New Roman" w:cs="Times New Roman" w:eastAsia="Times New Roman" w:hAnsi="Times New Roman"/>
-          <w:sz w:val="22"/>
-          <w:szCs w:val="22"/>
-        </w:rPr>
-        <w:t xml:space="preserve">• Engineered sub-200ms REST APIs secured with OAuth2, JWT, and RBAC via Spring Security, serving 500+ concurrent restaurant staff and guest sessions through Angular and React experiences monitored with Prometheus and Grafana.</w:t>
-      </w:r>
-    </w:p>
-    <w:p>
-      <w:pPr>
-        <w:spacing w:after="20"/>
-      </w:pPr>
-      <w:r>
-        <w:rPr>
-          <w:rFonts w:ascii="Times New Roman" w:cs="Times New Roman" w:eastAsia="Times New Roman" w:hAnsi="Times New Roman"/>
-          <w:sz w:val="22"/>
-          <w:szCs w:val="22"/>
-        </w:rPr>
-        <w:t xml:space="preserve">• Delivered full-stack enhancements with HTML5, CSS3, and JavaScript on scalable Spring Boot services (Spring Data JPA, Oracle, MongoDB) for menus, orders, and location workflows, deployed on AWS (EC2, ECS) with Docker and Kubernetes for high-availability retail traffic.</w:t>
-      </w:r>
-    </w:p>
-    <w:p>
-      <w:pPr>
-        <w:spacing w:after="20"/>
-      </w:pPr>
-      <w:r>
-        <w:rPr>
-          <w:rFonts w:ascii="Times New Roman" w:cs="Times New Roman" w:eastAsia="Times New Roman" w:hAnsi="Times New Roman"/>
-          <w:sz w:val="22"/>
-          <w:szCs w:val="22"/>
-        </w:rPr>
-        <w:t xml:space="preserve">• Implemented DevSecOps-aligned CI/CD on Jenkins and Bitbucket—automated build, scan, and deploy gates—for repeatable promotion of microservices across distributed cloud-native environments.</w:t>
+        <w:t xml:space="preserve">• Led migration from legacy Spring MVC to Java 17 and Spring Boot microservices for retail and restaurant POS and digital ordering, cutting production incidents 40% and deployment lead time from 2 hours to 15 minutes.</w:t>
+      </w:r>
+    </w:p>
+    <w:p>
+      <w:pPr>
+        <w:spacing w:after="20"/>
+      </w:pPr>
+      <w:r>
+        <w:rPr>
+          <w:rFonts w:ascii="Times New Roman" w:cs="Times New Roman" w:eastAsia="Times New Roman" w:hAnsi="Times New Roman"/>
+          <w:sz w:val="22"/>
+          <w:szCs w:val="22"/>
+        </w:rPr>
+        <w:t xml:space="preserve">• Built an event-driven integration layer with Kafka, RabbitMQ, and Redis—10K+ daily transactions at 99.9% uptime—with retry and circuit breaker patterns for order, payment, and partner events.</w:t>
+      </w:r>
+    </w:p>
+    <w:p>
+      <w:pPr>
+        <w:spacing w:after="20"/>
+      </w:pPr>
+      <w:r>
+        <w:rPr>
+          <w:rFonts w:ascii="Times New Roman" w:cs="Times New Roman" w:eastAsia="Times New Roman" w:hAnsi="Times New Roman"/>
+          <w:sz w:val="22"/>
+          <w:szCs w:val="22"/>
+        </w:rPr>
+        <w:t xml:space="preserve">• Delivered sub-200ms REST APIs with Spring Security (OAuth2, JWT, RBAC) for 500+ concurrent users; Angular and React for staff and guest experiences.</w:t>
+      </w:r>
+    </w:p>
+    <w:p>
+      <w:pPr>
+        <w:spacing w:after="20"/>
+      </w:pPr>
+      <w:r>
+        <w:rPr>
+          <w:rFonts w:ascii="Times New Roman" w:cs="Times New Roman" w:eastAsia="Times New Roman" w:hAnsi="Times New Roman"/>
+          <w:sz w:val="22"/>
+          <w:szCs w:val="22"/>
+        </w:rPr>
+        <w:t xml:space="preserve">• Shipped menu, order, and location features end to end using Spring Data JPA with Oracle and MongoDB, HTML5/CSS3/JavaScript, and AWS (EC2, ECS) on Docker and Kubernetes.</w:t>
+      </w:r>
+    </w:p>
+    <w:p>
+      <w:pPr>
+        <w:spacing w:after="20"/>
+      </w:pPr>
+      <w:r>
+        <w:rPr>
+          <w:rFonts w:ascii="Times New Roman" w:cs="Times New Roman" w:eastAsia="Times New Roman" w:hAnsi="Times New Roman"/>
+          <w:sz w:val="22"/>
+          <w:szCs w:val="22"/>
+        </w:rPr>
+        <w:t xml:space="preserve">• Automated Jenkins and Bitbucket pipelines with build, scan, and deploy gates for repeatable production releases of microservices.</w:t>
       </w:r>
     </w:p>
     <w:p>
@@ -243,7 +243,7 @@
           <w:sz w:val="22"/>
           <w:szCs w:val="22"/>
         </w:rPr>
-        <w:t xml:space="preserve">• Optimized release quality with JUnit and Mockito automation tied to defect KPIs while standardizing observability dashboards that support SLO-grade visibility for scalable restaurant commerce platforms.</w:t>
+        <w:t xml:space="preserve">• Tied JUnit and Mockito suites to release gates; used Prometheus and Grafana for latency, errors, and defect KPI visibility.</w:t>
       </w:r>
     </w:p>
     <w:p>
@@ -284,59 +284,59 @@
           <w:sz w:val="22"/>
           <w:szCs w:val="22"/>
         </w:rPr>
-        <w:t xml:space="preserve">• Architected Java and Spring Boot microservices and Hibernate/JPA data layers for insurance, retirement, and asset-management systems—distributed, cloud-native services powering customer and agent financial portals.</w:t>
-      </w:r>
-    </w:p>
-    <w:p>
-      <w:pPr>
-        <w:spacing w:after="20"/>
-      </w:pPr>
-      <w:r>
-        <w:rPr>
-          <w:rFonts w:ascii="Times New Roman" w:cs="Times New Roman" w:eastAsia="Times New Roman" w:hAnsi="Times New Roman"/>
-          <w:sz w:val="22"/>
-          <w:szCs w:val="22"/>
-        </w:rPr>
-        <w:t xml:space="preserve">• Engineered secure REST APIs with OAuth2, JWT, Redis-backed sessions, and RBAC through Spring Security for regulatory-sensitive workloads deployed on AWS (EC2, S3, RDS, Lambda) with Docker and Kubernetes.</w:t>
-      </w:r>
-    </w:p>
-    <w:p>
-      <w:pPr>
-        <w:spacing w:after="20"/>
-      </w:pPr>
-      <w:r>
-        <w:rPr>
-          <w:rFonts w:ascii="Times New Roman" w:cs="Times New Roman" w:eastAsia="Times New Roman" w:hAnsi="Times New Roman"/>
-          <w:sz w:val="22"/>
-          <w:szCs w:val="22"/>
-        </w:rPr>
-        <w:t xml:space="preserve">• Reduced enterprise data defects 90% and improved API response time 25% by shipping Angular and React UIs with HTML5, CSS3, and JavaScript paired to validated Spring Boot services for policy and claims journeys.</w:t>
-      </w:r>
-    </w:p>
-    <w:p>
-      <w:pPr>
-        <w:spacing w:after="20"/>
-      </w:pPr>
-      <w:r>
-        <w:rPr>
-          <w:rFonts w:ascii="Times New Roman" w:cs="Times New Roman" w:eastAsia="Times New Roman" w:hAnsi="Times New Roman"/>
-          <w:sz w:val="22"/>
-          <w:szCs w:val="22"/>
-        </w:rPr>
-        <w:t xml:space="preserve">• Led system design artifacts—API contracts, technical specifications, and scalable integration patterns—coordinated with architecture and compliance stakeholders across distributed financial systems.</w:t>
-      </w:r>
-    </w:p>
-    <w:p>
-      <w:pPr>
-        <w:spacing w:after="20"/>
-      </w:pPr>
-      <w:r>
-        <w:rPr>
-          <w:rFonts w:ascii="Times New Roman" w:cs="Times New Roman" w:eastAsia="Times New Roman" w:hAnsi="Times New Roman"/>
-          <w:sz w:val="22"/>
-          <w:szCs w:val="22"/>
-        </w:rPr>
-        <w:t xml:space="preserve">• Delivered 8+ on-schedule capabilities including policy management, claims processing, and reporting modules via Agile collaboration with Product and QA, backed by Jenkins and Bitbucket CI/CD for predictable production releases.</w:t>
+        <w:t xml:space="preserve">• Built Spring Boot microservices with Hibernate/JPA for insurance, retirement, and asset management, powering customer and agent portals.</w:t>
+      </w:r>
+    </w:p>
+    <w:p>
+      <w:pPr>
+        <w:spacing w:after="20"/>
+      </w:pPr>
+      <w:r>
+        <w:rPr>
+          <w:rFonts w:ascii="Times New Roman" w:cs="Times New Roman" w:eastAsia="Times New Roman" w:hAnsi="Times New Roman"/>
+          <w:sz w:val="22"/>
+          <w:szCs w:val="22"/>
+        </w:rPr>
+        <w:t xml:space="preserve">• Deployed Docker and Kubernetes workloads on AWS (EC2, S3, RDS, Lambda) with OAuth2, JWT, Redis-backed sessions, and RBAC via Spring Security for regulatory-sensitive traffic.</w:t>
+      </w:r>
+    </w:p>
+    <w:p>
+      <w:pPr>
+        <w:spacing w:after="20"/>
+      </w:pPr>
+      <w:r>
+        <w:rPr>
+          <w:rFonts w:ascii="Times New Roman" w:cs="Times New Roman" w:eastAsia="Times New Roman" w:hAnsi="Times New Roman"/>
+          <w:sz w:val="22"/>
+          <w:szCs w:val="22"/>
+        </w:rPr>
+        <w:t xml:space="preserve">• Cut data defects 90% and improved API response time 25% with Angular and React (HTML5, CSS3, JavaScript) on validated Spring Boot services for policy and claims.</w:t>
+      </w:r>
+    </w:p>
+    <w:p>
+      <w:pPr>
+        <w:spacing w:after="20"/>
+      </w:pPr>
+      <w:r>
+        <w:rPr>
+          <w:rFonts w:ascii="Times New Roman" w:cs="Times New Roman" w:eastAsia="Times New Roman" w:hAnsi="Times New Roman"/>
+          <w:sz w:val="22"/>
+          <w:szCs w:val="22"/>
+        </w:rPr>
+        <w:t xml:space="preserve">• Authored API contracts and technical specifications; aligned integration design with architecture and compliance reviews.</w:t>
+      </w:r>
+    </w:p>
+    <w:p>
+      <w:pPr>
+        <w:spacing w:after="20"/>
+      </w:pPr>
+      <w:r>
+        <w:rPr>
+          <w:rFonts w:ascii="Times New Roman" w:cs="Times New Roman" w:eastAsia="Times New Roman" w:hAnsi="Times New Roman"/>
+          <w:sz w:val="22"/>
+          <w:szCs w:val="22"/>
+        </w:rPr>
+        <w:t xml:space="preserve">• Shipped 8+ on-schedule features—policy management, claims, reporting—through Agile work with Product and QA and Jenkins/Bitbucket CI/CD.</w:t>
       </w:r>
     </w:p>
     <w:p>
@@ -349,7 +349,7 @@
           <w:sz w:val="22"/>
           <w:szCs w:val="22"/>
         </w:rPr>
-        <w:t xml:space="preserve">• Hardened financial services paths with Spring Security best practices and DevSecOps checks; enforced quality with JUnit and Mockito on critical flows while tracking production health signals through Prometheus and Grafana.</w:t>
+        <w:t xml:space="preserve">• Protected policy and claims changes with JUnit and Mockito; monitored production health with Prometheus and Grafana.</w:t>
       </w:r>
     </w:p>
     <w:p>
@@ -390,59 +390,59 @@
           <w:sz w:val="22"/>
           <w:szCs w:val="22"/>
         </w:rPr>
-        <w:t xml:space="preserve">• Architected Java 11, Spring Boot, and Spring Data JPA microservices for oil and gas portfolio and asset tracking—distributed REST services supporting 500+ users and 10K+ daily transactions across enterprise energy operations.</w:t>
-      </w:r>
-    </w:p>
-    <w:p>
-      <w:pPr>
-        <w:spacing w:after="20"/>
-      </w:pPr>
-      <w:r>
-        <w:rPr>
-          <w:rFonts w:ascii="Times New Roman" w:cs="Times New Roman" w:eastAsia="Times New Roman" w:hAnsi="Times New Roman"/>
-          <w:sz w:val="22"/>
-          <w:szCs w:val="22"/>
-        </w:rPr>
-        <w:t xml:space="preserve">• Engineered responsive React dashboards with HTML5, CSS3, and JavaScript integrated to Spring Boot APIs, cutting manual reporting time 50% and accelerating field and office decision cycles for production and asset data.</w:t>
-      </w:r>
-    </w:p>
-    <w:p>
-      <w:pPr>
-        <w:spacing w:after="20"/>
-      </w:pPr>
-      <w:r>
-        <w:rPr>
-          <w:rFonts w:ascii="Times New Roman" w:cs="Times New Roman" w:eastAsia="Times New Roman" w:hAnsi="Times New Roman"/>
-          <w:sz w:val="22"/>
-          <w:szCs w:val="22"/>
-        </w:rPr>
-        <w:t xml:space="preserve">• Implemented Terraform and Jenkins CI/CD with infrastructure as code, reducing environment provisioning time 60% and enabling repeatable, cloud-native delivery pipelines for scalable energy platforms.</w:t>
-      </w:r>
-    </w:p>
-    <w:p>
-      <w:pPr>
-        <w:spacing w:after="20"/>
-      </w:pPr>
-      <w:r>
-        <w:rPr>
-          <w:rFonts w:ascii="Times New Roman" w:cs="Times New Roman" w:eastAsia="Times New Roman" w:hAnsi="Times New Roman"/>
-          <w:sz w:val="22"/>
-          <w:szCs w:val="22"/>
-        </w:rPr>
-        <w:t xml:space="preserve">• Deployed containerized workloads on Kubernetes with health checks, readiness probes, and auto-scaling across Oracle and MySQL on AWS-backed infrastructure for high-availability upstream and downstream data services.</w:t>
-      </w:r>
-    </w:p>
-    <w:p>
-      <w:pPr>
-        <w:spacing w:after="20"/>
-      </w:pPr>
-      <w:r>
-        <w:rPr>
-          <w:rFonts w:ascii="Times New Roman" w:cs="Times New Roman" w:eastAsia="Times New Roman" w:hAnsi="Times New Roman"/>
-          <w:sz w:val="22"/>
-          <w:szCs w:val="22"/>
-        </w:rPr>
-        <w:t xml:space="preserve">• Delivered secure REST integrations and observability-ready instrumentation (Prometheus and Grafana patterns) so distributed energy consumers could scale reads without compromising API contracts or resilience.</w:t>
+        <w:t xml:space="preserve">• Built Java 11, Spring Boot, and Spring Data JPA services for oil and gas portfolio and asset tracking—500+ users and 10K+ daily transactions.</w:t>
+      </w:r>
+    </w:p>
+    <w:p>
+      <w:pPr>
+        <w:spacing w:after="20"/>
+      </w:pPr>
+      <w:r>
+        <w:rPr>
+          <w:rFonts w:ascii="Times New Roman" w:cs="Times New Roman" w:eastAsia="Times New Roman" w:hAnsi="Times New Roman"/>
+          <w:sz w:val="22"/>
+          <w:szCs w:val="22"/>
+        </w:rPr>
+        <w:t xml:space="preserve">• Cut manual reporting time 50% with React dashboards (HTML5, CSS3, JavaScript) on Spring Boot APIs for field and office production and asset views.</w:t>
+      </w:r>
+    </w:p>
+    <w:p>
+      <w:pPr>
+        <w:spacing w:after="20"/>
+      </w:pPr>
+      <w:r>
+        <w:rPr>
+          <w:rFonts w:ascii="Times New Roman" w:cs="Times New Roman" w:eastAsia="Times New Roman" w:hAnsi="Times New Roman"/>
+          <w:sz w:val="22"/>
+          <w:szCs w:val="22"/>
+        </w:rPr>
+        <w:t xml:space="preserve">• Cut environment provisioning time 60% using Terraform and Jenkins with infrastructure as code and repeatable delivery pipelines.</w:t>
+      </w:r>
+    </w:p>
+    <w:p>
+      <w:pPr>
+        <w:spacing w:after="20"/>
+      </w:pPr>
+      <w:r>
+        <w:rPr>
+          <w:rFonts w:ascii="Times New Roman" w:cs="Times New Roman" w:eastAsia="Times New Roman" w:hAnsi="Times New Roman"/>
+          <w:sz w:val="22"/>
+          <w:szCs w:val="22"/>
+        </w:rPr>
+        <w:t xml:space="preserve">• Ran containerized services on Kubernetes (health checks, readiness probes, auto-scaling) with Oracle and MySQL on AWS.</w:t>
+      </w:r>
+    </w:p>
+    <w:p>
+      <w:pPr>
+        <w:spacing w:after="20"/>
+      </w:pPr>
+      <w:r>
+        <w:rPr>
+          <w:rFonts w:ascii="Times New Roman" w:cs="Times New Roman" w:eastAsia="Times New Roman" w:hAnsi="Times New Roman"/>
+          <w:sz w:val="22"/>
+          <w:szCs w:val="22"/>
+        </w:rPr>
+        <w:t xml:space="preserve">• Published stable REST contracts for upstream/downstream energy consumers; documented integration points to speed operations handoffs.</w:t>
       </w:r>
     </w:p>
     <w:p>
@@ -455,7 +455,7 @@
           <w:sz w:val="22"/>
           <w:szCs w:val="22"/>
         </w:rPr>
-        <w:t xml:space="preserve">• Stabilized change velocity with JUnit and Mockito coverage on core services; authored integration documentation that shortened operations handoffs and improved cross-team onboarding to distributed systems.</w:t>
+        <w:t xml:space="preserve">• Expanded JUnit and Mockito coverage on core services to reduce regression risk on production releases.</w:t>
       </w:r>
     </w:p>
     <w:p>
@@ -496,59 +496,59 @@
           <w:sz w:val="22"/>
           <w:szCs w:val="22"/>
         </w:rPr>
-        <w:t xml:space="preserve">• Architected Java and Spring Boot REST services on Oracle and PostgreSQL for automotive manufacturing and supply-chain analytics—distributed integrations spanning plants, dealers, and logistics in scalable enterprise environments.</w:t>
-      </w:r>
-    </w:p>
-    <w:p>
-      <w:pPr>
-        <w:spacing w:after="20"/>
-      </w:pPr>
-      <w:r>
-        <w:rPr>
-          <w:rFonts w:ascii="Times New Roman" w:cs="Times New Roman" w:eastAsia="Times New Roman" w:hAnsi="Times New Roman"/>
-          <w:sz w:val="22"/>
-          <w:szCs w:val="22"/>
-        </w:rPr>
-        <w:t xml:space="preserve">• Optimized SQL, indexing, and execution plans to improve query performance 30%, reducing dashboard load times for 100+ manufacturing, dealer, and logistics users on high-volume analytics workloads.</w:t>
-      </w:r>
-    </w:p>
-    <w:p>
-      <w:pPr>
-        <w:spacing w:after="20"/>
-      </w:pPr>
-      <w:r>
-        <w:rPr>
-          <w:rFonts w:ascii="Times New Roman" w:cs="Times New Roman" w:eastAsia="Times New Roman" w:hAnsi="Times New Roman"/>
-          <w:sz w:val="22"/>
-          <w:szCs w:val="22"/>
-        </w:rPr>
-        <w:t xml:space="preserve">• Engineered ETL and integration pipelines across three operational domains—vehicle production, dealer systems, and logistics—feeding cloud-ready analytics stores for resilient, batch and near-real-time reporting.</w:t>
-      </w:r>
-    </w:p>
-    <w:p>
-      <w:pPr>
-        <w:spacing w:after="20"/>
-      </w:pPr>
-      <w:r>
-        <w:rPr>
-          <w:rFonts w:ascii="Times New Roman" w:cs="Times New Roman" w:eastAsia="Times New Roman" w:hAnsi="Times New Roman"/>
-          <w:sz w:val="22"/>
-          <w:szCs w:val="22"/>
-        </w:rPr>
-        <w:t xml:space="preserve">• Implemented contract-first REST layers between operational systems and analytics consumers, partnering with visualization teams to stabilize JSON APIs powering JavaScript-based supply-chain and KPI dashboards.</w:t>
-      </w:r>
-    </w:p>
-    <w:p>
-      <w:pPr>
-        <w:spacing w:after="20"/>
-      </w:pPr>
-      <w:r>
-        <w:rPr>
-          <w:rFonts w:ascii="Times New Roman" w:cs="Times New Roman" w:eastAsia="Times New Roman" w:hAnsi="Times New Roman"/>
-          <w:sz w:val="22"/>
-          <w:szCs w:val="22"/>
-        </w:rPr>
-        <w:t xml:space="preserve">• Aligned validation logic across all three supply-chain domains—production, dealer, and logistics—tightening reconciliation and data quality for downstream distributed analytics pipelines.</w:t>
+        <w:t xml:space="preserve">• Developed Java and Spring Boot REST services on Oracle and PostgreSQL for automotive manufacturing and supply-chain analytics across plants, dealers, and logistics.</w:t>
+      </w:r>
+    </w:p>
+    <w:p>
+      <w:pPr>
+        <w:spacing w:after="20"/>
+      </w:pPr>
+      <w:r>
+        <w:rPr>
+          <w:rFonts w:ascii="Times New Roman" w:cs="Times New Roman" w:eastAsia="Times New Roman" w:hAnsi="Times New Roman"/>
+          <w:sz w:val="22"/>
+          <w:szCs w:val="22"/>
+        </w:rPr>
+        <w:t xml:space="preserve">• Improved query performance 30% through SQL tuning and indexing, reducing dashboard load times for 100+ users.</w:t>
+      </w:r>
+    </w:p>
+    <w:p>
+      <w:pPr>
+        <w:spacing w:after="20"/>
+      </w:pPr>
+      <w:r>
+        <w:rPr>
+          <w:rFonts w:ascii="Times New Roman" w:cs="Times New Roman" w:eastAsia="Times New Roman" w:hAnsi="Times New Roman"/>
+          <w:sz w:val="22"/>
+          <w:szCs w:val="22"/>
+        </w:rPr>
+        <w:t xml:space="preserve">• Built ETL from vehicle production, dealer, and logistics sources into analytics stores for batch and near-real-time reporting.</w:t>
+      </w:r>
+    </w:p>
+    <w:p>
+      <w:pPr>
+        <w:spacing w:after="20"/>
+      </w:pPr>
+      <w:r>
+        <w:rPr>
+          <w:rFonts w:ascii="Times New Roman" w:cs="Times New Roman" w:eastAsia="Times New Roman" w:hAnsi="Times New Roman"/>
+          <w:sz w:val="22"/>
+          <w:szCs w:val="22"/>
+        </w:rPr>
+        <w:t xml:space="preserve">• Defined contract-first REST APIs between operational systems and analytics; supported JavaScript KPI dashboards with stable JSON payloads and error handling.</w:t>
+      </w:r>
+    </w:p>
+    <w:p>
+      <w:pPr>
+        <w:spacing w:after="20"/>
+      </w:pPr>
+      <w:r>
+        <w:rPr>
+          <w:rFonts w:ascii="Times New Roman" w:cs="Times New Roman" w:eastAsia="Times New Roman" w:hAnsi="Times New Roman"/>
+          <w:sz w:val="22"/>
+          <w:szCs w:val="22"/>
+        </w:rPr>
+        <w:t xml:space="preserve">• Encoded validation and reconciliation rules in Java so manufacturing, dealer, and logistics feeds stayed consistent for downstream reporting.</w:t>
       </w:r>
     </w:p>
     <w:p>
@@ -561,7 +561,7 @@
           <w:sz w:val="22"/>
           <w:szCs w:val="22"/>
         </w:rPr>
-        <w:t xml:space="preserve">• Spearheaded Agile delivery with analysts and QA over a 12-month engagement—incremental releases, automated JUnit regression for integration services, and CI-style discipline for production analytics rollouts.</w:t>
+        <w:t xml:space="preserve">• Delivered incrementally over 12 months with analysts and QA, using automated JUnit regression before production analytics releases.</w:t>
       </w:r>
     </w:p>
     <w:p>
@@ -602,59 +602,59 @@
           <w:sz w:val="22"/>
           <w:szCs w:val="22"/>
         </w:rPr>
-        <w:t xml:space="preserve">• Architected Spring Boot and Node.js services with REST APIs for pharmaceutical production monitoring and ERP integration on Oracle and PostgreSQL—distributed, compliance-oriented backends for regulated healthcare operations.</w:t>
-      </w:r>
-    </w:p>
-    <w:p>
-      <w:pPr>
-        <w:spacing w:after="20"/>
-      </w:pPr>
-      <w:r>
-        <w:rPr>
-          <w:rFonts w:ascii="Times New Roman" w:cs="Times New Roman" w:eastAsia="Times New Roman" w:hAnsi="Times New Roman"/>
-          <w:sz w:val="22"/>
-          <w:szCs w:val="22"/>
-        </w:rPr>
-        <w:t xml:space="preserve">• Reduced manual laboratory, QC, and inventory data entry 70% by delivering AngularJS and React dashboards with HTML5, CSS3, and JavaScript backed by secure Spring Boot and Node APIs.</w:t>
-      </w:r>
-    </w:p>
-    <w:p>
-      <w:pPr>
-        <w:spacing w:after="20"/>
-      </w:pPr>
-      <w:r>
-        <w:rPr>
-          <w:rFonts w:ascii="Times New Roman" w:cs="Times New Roman" w:eastAsia="Times New Roman" w:hAnsi="Times New Roman"/>
-          <w:sz w:val="22"/>
-          <w:szCs w:val="22"/>
-        </w:rPr>
-        <w:t xml:space="preserve">• Engineered ETL consolidating laboratory, quality control, and inventory sources into validated reporting models, enabling scalable SQL-based compliance reports for GxP-style operational controls.</w:t>
-      </w:r>
-    </w:p>
-    <w:p>
-      <w:pPr>
-        <w:spacing w:after="20"/>
-      </w:pPr>
-      <w:r>
-        <w:rPr>
-          <w:rFonts w:ascii="Times New Roman" w:cs="Times New Roman" w:eastAsia="Times New Roman" w:hAnsi="Times New Roman"/>
-          <w:sz w:val="22"/>
-          <w:szCs w:val="22"/>
-        </w:rPr>
-        <w:t xml:space="preserve">• Implemented RBAC-aware data validation, audit trails, and SQL reporting pipelines so distributed quality and manufacturing teams could trace regulated data lineage across enterprise pharma systems.</w:t>
-      </w:r>
-    </w:p>
-    <w:p>
-      <w:pPr>
-        <w:spacing w:after="20"/>
-      </w:pPr>
-      <w:r>
-        <w:rPr>
-          <w:rFonts w:ascii="Times New Roman" w:cs="Times New Roman" w:eastAsia="Times New Roman" w:hAnsi="Times New Roman"/>
-          <w:sz w:val="22"/>
-          <w:szCs w:val="22"/>
-        </w:rPr>
-        <w:t xml:space="preserve">• Automated Jenkins and Maven CI/CD with JUnit gates for repeatable builds of compliance-critical services, embedding DevSecOps-style checks before promotion to controlled environments.</w:t>
+        <w:t xml:space="preserve">• Built Spring Boot and Node.js REST services for production monitoring and ERP integration on Oracle and PostgreSQL under pharmaceutical compliance constraints.</w:t>
+      </w:r>
+    </w:p>
+    <w:p>
+      <w:pPr>
+        <w:spacing w:after="20"/>
+      </w:pPr>
+      <w:r>
+        <w:rPr>
+          <w:rFonts w:ascii="Times New Roman" w:cs="Times New Roman" w:eastAsia="Times New Roman" w:hAnsi="Times New Roman"/>
+          <w:sz w:val="22"/>
+          <w:szCs w:val="22"/>
+        </w:rPr>
+        <w:t xml:space="preserve">• Lowered manual laboratory, QC, and inventory data entry 70% with AngularJS and React dashboards (HTML5, CSS3, JavaScript) on Spring Boot and Node APIs.</w:t>
+      </w:r>
+    </w:p>
+    <w:p>
+      <w:pPr>
+        <w:spacing w:after="20"/>
+      </w:pPr>
+      <w:r>
+        <w:rPr>
+          <w:rFonts w:ascii="Times New Roman" w:cs="Times New Roman" w:eastAsia="Times New Roman" w:hAnsi="Times New Roman"/>
+          <w:sz w:val="22"/>
+          <w:szCs w:val="22"/>
+        </w:rPr>
+        <w:t xml:space="preserve">• Consolidated lab, QC, and inventory data through ETL into reporting models; produced SQL-based compliance reports aligned to GxP-style controls.</w:t>
+      </w:r>
+    </w:p>
+    <w:p>
+      <w:pPr>
+        <w:spacing w:after="20"/>
+      </w:pPr>
+      <w:r>
+        <w:rPr>
+          <w:rFonts w:ascii="Times New Roman" w:cs="Times New Roman" w:eastAsia="Times New Roman" w:hAnsi="Times New Roman"/>
+          <w:sz w:val="22"/>
+          <w:szCs w:val="22"/>
+        </w:rPr>
+        <w:t xml:space="preserve">• Added RBAC-aware validation, audit trails, and reporting pipelines so quality and manufacturing could trace regulated data lineage.</w:t>
+      </w:r>
+    </w:p>
+    <w:p>
+      <w:pPr>
+        <w:spacing w:after="20"/>
+      </w:pPr>
+      <w:r>
+        <w:rPr>
+          <w:rFonts w:ascii="Times New Roman" w:cs="Times New Roman" w:eastAsia="Times New Roman" w:hAnsi="Times New Roman"/>
+          <w:sz w:val="22"/>
+          <w:szCs w:val="22"/>
+        </w:rPr>
+        <w:t xml:space="preserve">• Automated Jenkins and Maven builds with JUnit gates before promoting compliance-critical services to controlled environments.</w:t>
       </w:r>
     </w:p>
     <w:p>
@@ -667,7 +667,7 @@
           <w:sz w:val="22"/>
           <w:szCs w:val="22"/>
         </w:rPr>
-        <w:t xml:space="preserve">• Delivered 24 months of continuous enhancements—partnering with operations and quality stakeholders—while maintaining audit-friendly release patterns for scalable healthcare and manufacturing data platforms.</w:t>
+        <w:t xml:space="preserve">• Partnered with operations and quality for 24 months on incremental, audit-friendly releases of reporting and integration features.</w:t>
       </w:r>
     </w:p>
     <w:p>

</xml_diff>

<commit_message>
Resume: senior-level bullets, ATS keywords, DevOps ownership; align full-time and C2C.
Made-with: Cursor
</commit_message>
<xml_diff>
--- a/public/Java_FullStack_FullTime_Resume.docx
+++ b/public/Java_FullStack_FullTime_Resume.docx
@@ -43,7 +43,7 @@
           <w:sz w:val="24"/>
           <w:szCs w:val="24"/>
         </w:rPr>
-        <w:t xml:space="preserve">Java Full Stack Engineer | Spring Boot | React | Angular | AWS</w:t>
+        <w:t xml:space="preserve">Senior Java Full Stack Engineer | Spring Boot | React | Angular | AWS</w:t>
       </w:r>
     </w:p>
     <w:p>
@@ -88,7 +88,7 @@
           <w:sz w:val="22"/>
           <w:szCs w:val="22"/>
         </w:rPr>
-        <w:t xml:space="preserve">Java Full Stack Engineer with 5+ years owning the full SDLC across restaurant and retail technology, insurance and retirement, energy, automotive supply chain, and regulated pharma. Ships production Java/Spring Boot systems with modern web UIs, cloud deployments, and measurable reliability gains. AWS Certified DevOps Engineer – Professional, Solutions Architect – Associate; HashiCorp Terraform Associate.</w:t>
+        <w:t xml:space="preserve">Senior Java Full Stack Engineer with 5+ years architecting cloud-native, distributed systems across restaurant and retail platforms, insurance and retirement, energy, automotive supply chain, and regulated pharma. Owns end-to-end delivery: Spring Boot microservices, secure REST APIs, React and Angular, Docker and Kubernetes on AWS, CI/CD, and observability. AWS Certified DevOps Engineer – Professional, Solutions Architect – Associate; HashiCorp Terraform Associate.</w:t>
       </w:r>
     </w:p>
     <w:p>
@@ -119,7 +119,7 @@
           <w:sz w:val="22"/>
           <w:szCs w:val="22"/>
         </w:rPr>
-        <w:t xml:space="preserve">Backend: Java, Spring Boot, microservices, REST APIs, Spring Security (OAuth2, JWT, RBAC), Hibernate/JPA | Frontend: React, Angular, HTML5, CSS3, JavaScript | Cloud &amp; DevOps: AWS (EC2, S3, RDS, Lambda, ECS), Docker, Kubernetes, Jenkins, Bitbucket, CI/CD, DevSecOps, Terraform | Messaging &amp; caching: Kafka, RabbitMQ, Redis | Databases: Oracle, MySQL, PostgreSQL, MongoDB | Quality &amp; monitoring: JUnit, Mockito, Prometheus, Grafana</w:t>
+        <w:t xml:space="preserve">Backend: Java, Spring Boot, microservices, REST APIs, Spring Security (OAuth2, JWT, RBAC), Hibernate/JPA | Frontend: React, Angular, HTML5, CSS3, JavaScript | Cloud &amp; DevOps: AWS (EC2, S3, RDS, Lambda, ECS), Docker, Kubernetes, Jenkins, Bitbucket, CI/CD, DevSecOps, Terraform, infrastructure as code | Messaging &amp; caching: Kafka, RabbitMQ, Redis | Databases: Oracle, MySQL, PostgreSQL, MongoDB | Quality &amp; observability: JUnit, Mockito, Prometheus, Grafana</w:t>
       </w:r>
     </w:p>
     <w:p>
@@ -178,59 +178,59 @@
           <w:sz w:val="22"/>
           <w:szCs w:val="22"/>
         </w:rPr>
-        <w:t xml:space="preserve">• Led migration from legacy Spring MVC to Java 17 and Spring Boot microservices for retail and restaurant POS and digital ordering, cutting production incidents 40% and deployment lead time from 2 hours to 15 minutes.</w:t>
-      </w:r>
-    </w:p>
-    <w:p>
-      <w:pPr>
-        <w:spacing w:after="20"/>
-      </w:pPr>
-      <w:r>
-        <w:rPr>
-          <w:rFonts w:ascii="Times New Roman" w:cs="Times New Roman" w:eastAsia="Times New Roman" w:hAnsi="Times New Roman"/>
-          <w:sz w:val="22"/>
-          <w:szCs w:val="22"/>
-        </w:rPr>
-        <w:t xml:space="preserve">• Built an event-driven integration layer with Kafka, RabbitMQ, and Redis—10K+ daily transactions at 99.9% uptime—with retry and circuit breaker patterns for order, payment, and partner events.</w:t>
-      </w:r>
-    </w:p>
-    <w:p>
-      <w:pPr>
-        <w:spacing w:after="20"/>
-      </w:pPr>
-      <w:r>
-        <w:rPr>
-          <w:rFonts w:ascii="Times New Roman" w:cs="Times New Roman" w:eastAsia="Times New Roman" w:hAnsi="Times New Roman"/>
-          <w:sz w:val="22"/>
-          <w:szCs w:val="22"/>
-        </w:rPr>
-        <w:t xml:space="preserve">• Delivered sub-200ms REST APIs with Spring Security (OAuth2, JWT, RBAC) for 500+ concurrent users; Angular and React for staff and guest experiences.</w:t>
-      </w:r>
-    </w:p>
-    <w:p>
-      <w:pPr>
-        <w:spacing w:after="20"/>
-      </w:pPr>
-      <w:r>
-        <w:rPr>
-          <w:rFonts w:ascii="Times New Roman" w:cs="Times New Roman" w:eastAsia="Times New Roman" w:hAnsi="Times New Roman"/>
-          <w:sz w:val="22"/>
-          <w:szCs w:val="22"/>
-        </w:rPr>
-        <w:t xml:space="preserve">• Shipped menu, order, and location features end to end using Spring Data JPA with Oracle and MongoDB, HTML5/CSS3/JavaScript, and AWS (EC2, ECS) on Docker and Kubernetes.</w:t>
-      </w:r>
-    </w:p>
-    <w:p>
-      <w:pPr>
-        <w:spacing w:after="20"/>
-      </w:pPr>
-      <w:r>
-        <w:rPr>
-          <w:rFonts w:ascii="Times New Roman" w:cs="Times New Roman" w:eastAsia="Times New Roman" w:hAnsi="Times New Roman"/>
-          <w:sz w:val="22"/>
-          <w:szCs w:val="22"/>
-        </w:rPr>
-        <w:t xml:space="preserve">• Automated Jenkins and Bitbucket pipelines with build, scan, and deploy gates for repeatable production releases of microservices.</w:t>
+        <w:t xml:space="preserve">• Spearheaded a cloud-native architecture migration from Spring MVC to Java 17 and Spring Boot microservices for retail and restaurant POS—cut production incidents 40% and deployment cycle time from 2 hours to 15 minutes.</w:t>
+      </w:r>
+    </w:p>
+    <w:p>
+      <w:pPr>
+        <w:spacing w:after="20"/>
+      </w:pPr>
+      <w:r>
+        <w:rPr>
+          <w:rFonts w:ascii="Times New Roman" w:cs="Times New Roman" w:eastAsia="Times New Roman" w:hAnsi="Times New Roman"/>
+          <w:sz w:val="22"/>
+          <w:szCs w:val="22"/>
+        </w:rPr>
+        <w:t xml:space="preserve">• Architected a distributed, event-driven integration backbone (Kafka, RabbitMQ, Redis) processing 10K+ daily transactions at 99.9% availability with circuit breakers and retries for fault-tolerant order and payment flows.</w:t>
+      </w:r>
+    </w:p>
+    <w:p>
+      <w:pPr>
+        <w:spacing w:after="20"/>
+      </w:pPr>
+      <w:r>
+        <w:rPr>
+          <w:rFonts w:ascii="Times New Roman" w:cs="Times New Roman" w:eastAsia="Times New Roman" w:hAnsi="Times New Roman"/>
+          <w:sz w:val="22"/>
+          <w:szCs w:val="22"/>
+        </w:rPr>
+        <w:t xml:space="preserve">• Engineered sub-200ms REST APIs with OAuth2, JWT, and RBAC via Spring Security for 500+ concurrent users; shipped Angular and React experiences that improved staff and guest throughput at peak service intervals.</w:t>
+      </w:r>
+    </w:p>
+    <w:p>
+      <w:pPr>
+        <w:spacing w:after="20"/>
+      </w:pPr>
+      <w:r>
+        <w:rPr>
+          <w:rFonts w:ascii="Times New Roman" w:cs="Times New Roman" w:eastAsia="Times New Roman" w:hAnsi="Times New Roman"/>
+          <w:sz w:val="22"/>
+          <w:szCs w:val="22"/>
+        </w:rPr>
+        <w:t xml:space="preserve">• Owned full-stack delivery for menu, order, and location domains using Spring Data JPA (Oracle, MongoDB), HTML5/CSS3/JavaScript, Docker container images, and Kubernetes on AWS (EC2, ECS) for horizontally scalable systems.</w:t>
+      </w:r>
+    </w:p>
+    <w:p>
+      <w:pPr>
+        <w:spacing w:after="20"/>
+      </w:pPr>
+      <w:r>
+        <w:rPr>
+          <w:rFonts w:ascii="Times New Roman" w:cs="Times New Roman" w:eastAsia="Times New Roman" w:hAnsi="Times New Roman"/>
+          <w:sz w:val="22"/>
+          <w:szCs w:val="22"/>
+        </w:rPr>
+        <w:t xml:space="preserve">• Owned CI/CD on Jenkins and Bitbucket—build, security scan, and deploy stages—standardizing Docker-based promotions into production Kubernetes clusters with repeatable release discipline.</w:t>
       </w:r>
     </w:p>
     <w:p>
@@ -243,7 +243,7 @@
           <w:sz w:val="22"/>
           <w:szCs w:val="22"/>
         </w:rPr>
-        <w:t xml:space="preserve">• Tied JUnit and Mockito suites to release gates; used Prometheus and Grafana for latency, errors, and defect KPI visibility.</w:t>
+        <w:t xml:space="preserve">• Raised observability and resiliency with Prometheus and Grafana dashboards plus JUnit and Mockito gates tied to latency, error-rate, and defect KPIs before production cutover.</w:t>
       </w:r>
     </w:p>
     <w:p>
@@ -284,59 +284,59 @@
           <w:sz w:val="22"/>
           <w:szCs w:val="22"/>
         </w:rPr>
-        <w:t xml:space="preserve">• Built Spring Boot microservices with Hibernate/JPA for insurance, retirement, and asset management, powering customer and agent portals.</w:t>
-      </w:r>
-    </w:p>
-    <w:p>
-      <w:pPr>
-        <w:spacing w:after="20"/>
-      </w:pPr>
-      <w:r>
-        <w:rPr>
-          <w:rFonts w:ascii="Times New Roman" w:cs="Times New Roman" w:eastAsia="Times New Roman" w:hAnsi="Times New Roman"/>
-          <w:sz w:val="22"/>
-          <w:szCs w:val="22"/>
-        </w:rPr>
-        <w:t xml:space="preserve">• Deployed Docker and Kubernetes workloads on AWS (EC2, S3, RDS, Lambda) with OAuth2, JWT, Redis-backed sessions, and RBAC via Spring Security for regulatory-sensitive traffic.</w:t>
-      </w:r>
-    </w:p>
-    <w:p>
-      <w:pPr>
-        <w:spacing w:after="20"/>
-      </w:pPr>
-      <w:r>
-        <w:rPr>
-          <w:rFonts w:ascii="Times New Roman" w:cs="Times New Roman" w:eastAsia="Times New Roman" w:hAnsi="Times New Roman"/>
-          <w:sz w:val="22"/>
-          <w:szCs w:val="22"/>
-        </w:rPr>
-        <w:t xml:space="preserve">• Cut data defects 90% and improved API response time 25% with Angular and React (HTML5, CSS3, JavaScript) on validated Spring Boot services for policy and claims.</w:t>
-      </w:r>
-    </w:p>
-    <w:p>
-      <w:pPr>
-        <w:spacing w:after="20"/>
-      </w:pPr>
-      <w:r>
-        <w:rPr>
-          <w:rFonts w:ascii="Times New Roman" w:cs="Times New Roman" w:eastAsia="Times New Roman" w:hAnsi="Times New Roman"/>
-          <w:sz w:val="22"/>
-          <w:szCs w:val="22"/>
-        </w:rPr>
-        <w:t xml:space="preserve">• Authored API contracts and technical specifications; aligned integration design with architecture and compliance reviews.</w:t>
-      </w:r>
-    </w:p>
-    <w:p>
-      <w:pPr>
-        <w:spacing w:after="20"/>
-      </w:pPr>
-      <w:r>
-        <w:rPr>
-          <w:rFonts w:ascii="Times New Roman" w:cs="Times New Roman" w:eastAsia="Times New Roman" w:hAnsi="Times New Roman"/>
-          <w:sz w:val="22"/>
-          <w:szCs w:val="22"/>
-        </w:rPr>
-        <w:t xml:space="preserve">• Shipped 8+ on-schedule features—policy management, claims, reporting—through Agile work with Product and QA and Jenkins/Bitbucket CI/CD.</w:t>
+        <w:t xml:space="preserve">• Architected cloud-native Spring Boot microservices with Hibernate/JPA for insurance, retirement, and asset management—distributed, high-availability services behind customer and agent financial portals.</w:t>
+      </w:r>
+    </w:p>
+    <w:p>
+      <w:pPr>
+        <w:spacing w:after="20"/>
+      </w:pPr>
+      <w:r>
+        <w:rPr>
+          <w:rFonts w:ascii="Times New Roman" w:cs="Times New Roman" w:eastAsia="Times New Roman" w:hAnsi="Times New Roman"/>
+          <w:sz w:val="22"/>
+          <w:szCs w:val="22"/>
+        </w:rPr>
+        <w:t xml:space="preserve">• Owned Docker image pipelines and Kubernetes releases on AWS (EC2, S3, RDS, Lambda) with OAuth2, JWT, Redis-backed sessions, and RBAC for secure, compliant financial traffic at enterprise scale.</w:t>
+      </w:r>
+    </w:p>
+    <w:p>
+      <w:pPr>
+        <w:spacing w:after="20"/>
+      </w:pPr>
+      <w:r>
+        <w:rPr>
+          <w:rFonts w:ascii="Times New Roman" w:cs="Times New Roman" w:eastAsia="Times New Roman" w:hAnsi="Times New Roman"/>
+          <w:sz w:val="22"/>
+          <w:szCs w:val="22"/>
+        </w:rPr>
+        <w:t xml:space="preserve">• Optimized policy and claims experiences: cut data defects 90% and improved API response time 25% by pairing validated Spring Boot services with Angular and React (HTML5, CSS3, JavaScript) UIs.</w:t>
+      </w:r>
+    </w:p>
+    <w:p>
+      <w:pPr>
+        <w:spacing w:after="20"/>
+      </w:pPr>
+      <w:r>
+        <w:rPr>
+          <w:rFonts w:ascii="Times New Roman" w:cs="Times New Roman" w:eastAsia="Times New Roman" w:hAnsi="Times New Roman"/>
+          <w:sz w:val="22"/>
+          <w:szCs w:val="22"/>
+        </w:rPr>
+        <w:t xml:space="preserve">• Led API contracts, technical specifications, and integration design with architecture and compliance stakeholders—reducing ambiguity in scalable financial workflow integrations.</w:t>
+      </w:r>
+    </w:p>
+    <w:p>
+      <w:pPr>
+        <w:spacing w:after="20"/>
+      </w:pPr>
+      <w:r>
+        <w:rPr>
+          <w:rFonts w:ascii="Times New Roman" w:cs="Times New Roman" w:eastAsia="Times New Roman" w:hAnsi="Times New Roman"/>
+          <w:sz w:val="22"/>
+          <w:szCs w:val="22"/>
+        </w:rPr>
+        <w:t xml:space="preserve">• Delivered 8+ production features on schedule (policy, claims, reporting) through Agile partnership with Product and QA, accelerated by Jenkins and Bitbucket CI/CD and faster test-to-prod feedback.</w:t>
       </w:r>
     </w:p>
     <w:p>
@@ -349,7 +349,7 @@
           <w:sz w:val="22"/>
           <w:szCs w:val="22"/>
         </w:rPr>
-        <w:t xml:space="preserve">• Protected policy and claims changes with JUnit and Mockito; monitored production health with Prometheus and Grafana.</w:t>
+        <w:t xml:space="preserve">• Strengthened fault tolerance on money-movement paths with JUnit and Mockito; used Prometheus and Grafana for production observability of latency and error budgets on critical services.</w:t>
       </w:r>
     </w:p>
     <w:p>
@@ -390,59 +390,59 @@
           <w:sz w:val="22"/>
           <w:szCs w:val="22"/>
         </w:rPr>
-        <w:t xml:space="preserve">• Built Java 11, Spring Boot, and Spring Data JPA services for oil and gas portfolio and asset tracking—500+ users and 10K+ daily transactions.</w:t>
-      </w:r>
-    </w:p>
-    <w:p>
-      <w:pPr>
-        <w:spacing w:after="20"/>
-      </w:pPr>
-      <w:r>
-        <w:rPr>
-          <w:rFonts w:ascii="Times New Roman" w:cs="Times New Roman" w:eastAsia="Times New Roman" w:hAnsi="Times New Roman"/>
-          <w:sz w:val="22"/>
-          <w:szCs w:val="22"/>
-        </w:rPr>
-        <w:t xml:space="preserve">• Cut manual reporting time 50% with React dashboards (HTML5, CSS3, JavaScript) on Spring Boot APIs for field and office production and asset views.</w:t>
-      </w:r>
-    </w:p>
-    <w:p>
-      <w:pPr>
-        <w:spacing w:after="20"/>
-      </w:pPr>
-      <w:r>
-        <w:rPr>
-          <w:rFonts w:ascii="Times New Roman" w:cs="Times New Roman" w:eastAsia="Times New Roman" w:hAnsi="Times New Roman"/>
-          <w:sz w:val="22"/>
-          <w:szCs w:val="22"/>
-        </w:rPr>
-        <w:t xml:space="preserve">• Cut environment provisioning time 60% using Terraform and Jenkins with infrastructure as code and repeatable delivery pipelines.</w:t>
-      </w:r>
-    </w:p>
-    <w:p>
-      <w:pPr>
-        <w:spacing w:after="20"/>
-      </w:pPr>
-      <w:r>
-        <w:rPr>
-          <w:rFonts w:ascii="Times New Roman" w:cs="Times New Roman" w:eastAsia="Times New Roman" w:hAnsi="Times New Roman"/>
-          <w:sz w:val="22"/>
-          <w:szCs w:val="22"/>
-        </w:rPr>
-        <w:t xml:space="preserve">• Ran containerized services on Kubernetes (health checks, readiness probes, auto-scaling) with Oracle and MySQL on AWS.</w:t>
-      </w:r>
-    </w:p>
-    <w:p>
-      <w:pPr>
-        <w:spacing w:after="20"/>
-      </w:pPr>
-      <w:r>
-        <w:rPr>
-          <w:rFonts w:ascii="Times New Roman" w:cs="Times New Roman" w:eastAsia="Times New Roman" w:hAnsi="Times New Roman"/>
-          <w:sz w:val="22"/>
-          <w:szCs w:val="22"/>
-        </w:rPr>
-        <w:t xml:space="preserve">• Published stable REST contracts for upstream/downstream energy consumers; documented integration points to speed operations handoffs.</w:t>
+        <w:t xml:space="preserve">• Architected Java 11, Spring Boot, and Spring Data JPA services for oil and gas portfolio and asset tracking—scalable systems sustaining 500+ users and 10K+ daily transactions across distributed energy operations.</w:t>
+      </w:r>
+    </w:p>
+    <w:p>
+      <w:pPr>
+        <w:spacing w:after="20"/>
+      </w:pPr>
+      <w:r>
+        <w:rPr>
+          <w:rFonts w:ascii="Times New Roman" w:cs="Times New Roman" w:eastAsia="Times New Roman" w:hAnsi="Times New Roman"/>
+          <w:sz w:val="22"/>
+          <w:szCs w:val="22"/>
+        </w:rPr>
+        <w:t xml:space="preserve">• Delivered React dashboards (HTML5, CSS3, JavaScript) on Spring Boot REST APIs that cut manual reporting time 50%, improving field and office decision velocity on production and asset data.</w:t>
+      </w:r>
+    </w:p>
+    <w:p>
+      <w:pPr>
+        <w:spacing w:after="20"/>
+      </w:pPr>
+      <w:r>
+        <w:rPr>
+          <w:rFonts w:ascii="Times New Roman" w:cs="Times New Roman" w:eastAsia="Times New Roman" w:hAnsi="Times New Roman"/>
+          <w:sz w:val="22"/>
+          <w:szCs w:val="22"/>
+        </w:rPr>
+        <w:t xml:space="preserve">• Owned Terraform and Jenkins pipelines with infrastructure as code, reducing environment provisioning time 60% and increasing deployment repeatability for cloud-bound energy workloads.</w:t>
+      </w:r>
+    </w:p>
+    <w:p>
+      <w:pPr>
+        <w:spacing w:after="20"/>
+      </w:pPr>
+      <w:r>
+        <w:rPr>
+          <w:rFonts w:ascii="Times New Roman" w:cs="Times New Roman" w:eastAsia="Times New Roman" w:hAnsi="Times New Roman"/>
+          <w:sz w:val="22"/>
+          <w:szCs w:val="22"/>
+        </w:rPr>
+        <w:t xml:space="preserve">• Operated containerized services on Kubernetes—health checks, readiness probes, auto-scaling—with Oracle and MySQL on AWS for resilient, high-availability upstream and downstream data exchange.</w:t>
+      </w:r>
+    </w:p>
+    <w:p>
+      <w:pPr>
+        <w:spacing w:after="20"/>
+      </w:pPr>
+      <w:r>
+        <w:rPr>
+          <w:rFonts w:ascii="Times New Roman" w:cs="Times New Roman" w:eastAsia="Times New Roman" w:hAnsi="Times New Roman"/>
+          <w:sz w:val="22"/>
+          <w:szCs w:val="22"/>
+        </w:rPr>
+        <w:t xml:space="preserve">• Hardened REST contracts and integration documentation for distributed energy consumers, shortening operations handoffs and reducing integration defects on production interfaces.</w:t>
       </w:r>
     </w:p>
     <w:p>
@@ -455,7 +455,7 @@
           <w:sz w:val="22"/>
           <w:szCs w:val="22"/>
         </w:rPr>
-        <w:t xml:space="preserve">• Expanded JUnit and Mockito coverage on core services to reduce regression risk on production releases.</w:t>
+        <w:t xml:space="preserve">• Expanded JUnit and Mockito coverage on core services to improve regression detection and release confidence for production-grade energy analytics.</w:t>
       </w:r>
     </w:p>
     <w:p>
@@ -496,59 +496,59 @@
           <w:sz w:val="22"/>
           <w:szCs w:val="22"/>
         </w:rPr>
-        <w:t xml:space="preserve">• Developed Java and Spring Boot REST services on Oracle and PostgreSQL for automotive manufacturing and supply-chain analytics across plants, dealers, and logistics.</w:t>
-      </w:r>
-    </w:p>
-    <w:p>
-      <w:pPr>
-        <w:spacing w:after="20"/>
-      </w:pPr>
-      <w:r>
-        <w:rPr>
-          <w:rFonts w:ascii="Times New Roman" w:cs="Times New Roman" w:eastAsia="Times New Roman" w:hAnsi="Times New Roman"/>
-          <w:sz w:val="22"/>
-          <w:szCs w:val="22"/>
-        </w:rPr>
-        <w:t xml:space="preserve">• Improved query performance 30% through SQL tuning and indexing, reducing dashboard load times for 100+ users.</w:t>
-      </w:r>
-    </w:p>
-    <w:p>
-      <w:pPr>
-        <w:spacing w:after="20"/>
-      </w:pPr>
-      <w:r>
-        <w:rPr>
-          <w:rFonts w:ascii="Times New Roman" w:cs="Times New Roman" w:eastAsia="Times New Roman" w:hAnsi="Times New Roman"/>
-          <w:sz w:val="22"/>
-          <w:szCs w:val="22"/>
-        </w:rPr>
-        <w:t xml:space="preserve">• Built ETL from vehicle production, dealer, and logistics sources into analytics stores for batch and near-real-time reporting.</w:t>
-      </w:r>
-    </w:p>
-    <w:p>
-      <w:pPr>
-        <w:spacing w:after="20"/>
-      </w:pPr>
-      <w:r>
-        <w:rPr>
-          <w:rFonts w:ascii="Times New Roman" w:cs="Times New Roman" w:eastAsia="Times New Roman" w:hAnsi="Times New Roman"/>
-          <w:sz w:val="22"/>
-          <w:szCs w:val="22"/>
-        </w:rPr>
-        <w:t xml:space="preserve">• Defined contract-first REST APIs between operational systems and analytics; supported JavaScript KPI dashboards with stable JSON payloads and error handling.</w:t>
-      </w:r>
-    </w:p>
-    <w:p>
-      <w:pPr>
-        <w:spacing w:after="20"/>
-      </w:pPr>
-      <w:r>
-        <w:rPr>
-          <w:rFonts w:ascii="Times New Roman" w:cs="Times New Roman" w:eastAsia="Times New Roman" w:hAnsi="Times New Roman"/>
-          <w:sz w:val="22"/>
-          <w:szCs w:val="22"/>
-        </w:rPr>
-        <w:t xml:space="preserve">• Encoded validation and reconciliation rules in Java so manufacturing, dealer, and logistics feeds stayed consistent for downstream reporting.</w:t>
+        <w:t xml:space="preserve">• Engineered distributed Java and Spring Boot REST services on Oracle and PostgreSQL for automotive manufacturing and supply-chain analytics—scalable integrations across plants, dealers, and logistics networks.</w:t>
+      </w:r>
+    </w:p>
+    <w:p>
+      <w:pPr>
+        <w:spacing w:after="20"/>
+      </w:pPr>
+      <w:r>
+        <w:rPr>
+          <w:rFonts w:ascii="Times New Roman" w:cs="Times New Roman" w:eastAsia="Times New Roman" w:hAnsi="Times New Roman"/>
+          <w:sz w:val="22"/>
+          <w:szCs w:val="22"/>
+        </w:rPr>
+        <w:t xml:space="preserve">• Optimized SQL and indexing to improve query performance 30%, cutting dashboard latency for 100+ manufacturing, dealer, and logistics users on high-throughput analytics workloads.</w:t>
+      </w:r>
+    </w:p>
+    <w:p>
+      <w:pPr>
+        <w:spacing w:after="20"/>
+      </w:pPr>
+      <w:r>
+        <w:rPr>
+          <w:rFonts w:ascii="Times New Roman" w:cs="Times New Roman" w:eastAsia="Times New Roman" w:hAnsi="Times New Roman"/>
+          <w:sz w:val="22"/>
+          <w:szCs w:val="22"/>
+        </w:rPr>
+        <w:t xml:space="preserve">• Built resilient ETL from vehicle production, dealer, and logistics sources into analytics stores, enabling batch and near-real-time reporting for supply-chain observability and planning.</w:t>
+      </w:r>
+    </w:p>
+    <w:p>
+      <w:pPr>
+        <w:spacing w:after="20"/>
+      </w:pPr>
+      <w:r>
+        <w:rPr>
+          <w:rFonts w:ascii="Times New Roman" w:cs="Times New Roman" w:eastAsia="Times New Roman" w:hAnsi="Times New Roman"/>
+          <w:sz w:val="22"/>
+          <w:szCs w:val="22"/>
+        </w:rPr>
+        <w:t xml:space="preserve">• Defined contract-first REST layers between operational systems and analytics consumers, stabilizing JSON payloads and error semantics for JavaScript KPI dashboards under load.</w:t>
+      </w:r>
+    </w:p>
+    <w:p>
+      <w:pPr>
+        <w:spacing w:after="20"/>
+      </w:pPr>
+      <w:r>
+        <w:rPr>
+          <w:rFonts w:ascii="Times New Roman" w:cs="Times New Roman" w:eastAsia="Times New Roman" w:hAnsi="Times New Roman"/>
+          <w:sz w:val="22"/>
+          <w:szCs w:val="22"/>
+        </w:rPr>
+        <w:t xml:space="preserve">• Implemented validation and reconciliation logic in Java so cross-plant and cross-dealer feeds stayed consistent—improving downstream reporting reliability and fault tolerance for analytics pipelines.</w:t>
       </w:r>
     </w:p>
     <w:p>
@@ -561,7 +561,7 @@
           <w:sz w:val="22"/>
           <w:szCs w:val="22"/>
         </w:rPr>
-        <w:t xml:space="preserve">• Delivered incrementally over 12 months with analysts and QA, using automated JUnit regression before production analytics releases.</w:t>
+        <w:t xml:space="preserve">• Drove a 12-month Agile cadence with analysts and QA, shipping incremental capabilities with automated JUnit regression prior to each production analytics release.</w:t>
       </w:r>
     </w:p>
     <w:p>
@@ -602,59 +602,59 @@
           <w:sz w:val="22"/>
           <w:szCs w:val="22"/>
         </w:rPr>
-        <w:t xml:space="preserve">• Built Spring Boot and Node.js REST services for production monitoring and ERP integration on Oracle and PostgreSQL under pharmaceutical compliance constraints.</w:t>
-      </w:r>
-    </w:p>
-    <w:p>
-      <w:pPr>
-        <w:spacing w:after="20"/>
-      </w:pPr>
-      <w:r>
-        <w:rPr>
-          <w:rFonts w:ascii="Times New Roman" w:cs="Times New Roman" w:eastAsia="Times New Roman" w:hAnsi="Times New Roman"/>
-          <w:sz w:val="22"/>
-          <w:szCs w:val="22"/>
-        </w:rPr>
-        <w:t xml:space="preserve">• Lowered manual laboratory, QC, and inventory data entry 70% with AngularJS and React dashboards (HTML5, CSS3, JavaScript) on Spring Boot and Node APIs.</w:t>
-      </w:r>
-    </w:p>
-    <w:p>
-      <w:pPr>
-        <w:spacing w:after="20"/>
-      </w:pPr>
-      <w:r>
-        <w:rPr>
-          <w:rFonts w:ascii="Times New Roman" w:cs="Times New Roman" w:eastAsia="Times New Roman" w:hAnsi="Times New Roman"/>
-          <w:sz w:val="22"/>
-          <w:szCs w:val="22"/>
-        </w:rPr>
-        <w:t xml:space="preserve">• Consolidated lab, QC, and inventory data through ETL into reporting models; produced SQL-based compliance reports aligned to GxP-style controls.</w:t>
-      </w:r>
-    </w:p>
-    <w:p>
-      <w:pPr>
-        <w:spacing w:after="20"/>
-      </w:pPr>
-      <w:r>
-        <w:rPr>
-          <w:rFonts w:ascii="Times New Roman" w:cs="Times New Roman" w:eastAsia="Times New Roman" w:hAnsi="Times New Roman"/>
-          <w:sz w:val="22"/>
-          <w:szCs w:val="22"/>
-        </w:rPr>
-        <w:t xml:space="preserve">• Added RBAC-aware validation, audit trails, and reporting pipelines so quality and manufacturing could trace regulated data lineage.</w:t>
-      </w:r>
-    </w:p>
-    <w:p>
-      <w:pPr>
-        <w:spacing w:after="20"/>
-      </w:pPr>
-      <w:r>
-        <w:rPr>
-          <w:rFonts w:ascii="Times New Roman" w:cs="Times New Roman" w:eastAsia="Times New Roman" w:hAnsi="Times New Roman"/>
-          <w:sz w:val="22"/>
-          <w:szCs w:val="22"/>
-        </w:rPr>
-        <w:t xml:space="preserve">• Automated Jenkins and Maven builds with JUnit gates before promoting compliance-critical services to controlled environments.</w:t>
+        <w:t xml:space="preserve">• Architected Spring Boot and Node.js REST services for production monitoring and ERP integration on Oracle and PostgreSQL—compliance-bound, distributed backends for regulated pharmaceutical operations.</w:t>
+      </w:r>
+    </w:p>
+    <w:p>
+      <w:pPr>
+        <w:spacing w:after="20"/>
+      </w:pPr>
+      <w:r>
+        <w:rPr>
+          <w:rFonts w:ascii="Times New Roman" w:cs="Times New Roman" w:eastAsia="Times New Roman" w:hAnsi="Times New Roman"/>
+          <w:sz w:val="22"/>
+          <w:szCs w:val="22"/>
+        </w:rPr>
+        <w:t xml:space="preserve">• Spearheaded AngularJS and React dashboards (HTML5, CSS3, JavaScript) on secure APIs, cutting manual laboratory, QC, and inventory data entry 70% and accelerating quality review cycles.</w:t>
+      </w:r>
+    </w:p>
+    <w:p>
+      <w:pPr>
+        <w:spacing w:after="20"/>
+      </w:pPr>
+      <w:r>
+        <w:rPr>
+          <w:rFonts w:ascii="Times New Roman" w:cs="Times New Roman" w:eastAsia="Times New Roman" w:hAnsi="Times New Roman"/>
+          <w:sz w:val="22"/>
+          <w:szCs w:val="22"/>
+        </w:rPr>
+        <w:t xml:space="preserve">• Engineered ETL consolidating lab, QC, and inventory data into validated reporting models; delivered SQL-based compliance reports aligned to GxP-style controls and audit expectations.</w:t>
+      </w:r>
+    </w:p>
+    <w:p>
+      <w:pPr>
+        <w:spacing w:after="20"/>
+      </w:pPr>
+      <w:r>
+        <w:rPr>
+          <w:rFonts w:ascii="Times New Roman" w:cs="Times New Roman" w:eastAsia="Times New Roman" w:hAnsi="Times New Roman"/>
+          <w:sz w:val="22"/>
+          <w:szCs w:val="22"/>
+        </w:rPr>
+        <w:t xml:space="preserve">• Implemented RBAC-aware validation, audit trails, and reporting pipelines so manufacturing and quality teams could trace regulated data lineage with higher reliability across distributed sites.</w:t>
+      </w:r>
+    </w:p>
+    <w:p>
+      <w:pPr>
+        <w:spacing w:after="20"/>
+      </w:pPr>
+      <w:r>
+        <w:rPr>
+          <w:rFonts w:ascii="Times New Roman" w:cs="Times New Roman" w:eastAsia="Times New Roman" w:hAnsi="Times New Roman"/>
+          <w:sz w:val="22"/>
+          <w:szCs w:val="22"/>
+        </w:rPr>
+        <w:t xml:space="preserve">• Owned Jenkins and Maven CI/CD with JUnit quality gates for compliance-critical builds, tightening promotion discipline into controlled environments without slowing delivery cadence.</w:t>
       </w:r>
     </w:p>
     <w:p>
@@ -667,7 +667,7 @@
           <w:sz w:val="22"/>
           <w:szCs w:val="22"/>
         </w:rPr>
-        <w:t xml:space="preserve">• Partnered with operations and quality for 24 months on incremental, audit-friendly releases of reporting and integration features.</w:t>
+        <w:t xml:space="preserve">• Partnered with operations and quality for 24 months on incremental, audit-friendly releases—improving stability and predictability of pharma reporting and integration rollouts.</w:t>
       </w:r>
     </w:p>
     <w:p>
@@ -914,7 +914,7 @@
           <w:sz w:val="22"/>
           <w:szCs w:val="22"/>
         </w:rPr>
-        <w:t xml:space="preserve">• Shipped a full-stack retirement and portfolio app with Spring Boot, JWT with role-based access, and React on AWS and Docker.</w:t>
+        <w:t xml:space="preserve">• Shipped a cloud-native retirement and portfolio stack: Spring Boot, JWT with RBAC, React on AWS and Docker.</w:t>
       </w:r>
     </w:p>
     <w:p>
@@ -927,7 +927,7 @@
           <w:sz w:val="22"/>
           <w:szCs w:val="22"/>
         </w:rPr>
-        <w:t xml:space="preserve">• Exposed REST APIs for authentication and portfolio tracking backed by PostgreSQL and Redis.</w:t>
+        <w:t xml:space="preserve">• REST APIs for authentication and portfolio tracking; PostgreSQL and Redis for persistence and sessions.</w:t>
       </w:r>
     </w:p>
     <w:p>
@@ -955,7 +955,7 @@
           <w:sz w:val="22"/>
           <w:szCs w:val="22"/>
         </w:rPr>
-        <w:t xml:space="preserve">• Delivered Spring Boot, React, and MySQL flows for menus, orders, inventory, and sales analytics.</w:t>
+        <w:t xml:space="preserve">• Built Spring Boot, React, and MySQL flows for menus, orders, inventory, and sales analytics.</w:t>
       </w:r>
     </w:p>
     <w:p>
@@ -968,7 +968,7 @@
           <w:sz w:val="22"/>
           <w:szCs w:val="22"/>
         </w:rPr>
-        <w:t xml:space="preserve">• Built REST APIs for orders and inventory sync and a React admin dashboard that cut manual operations 60%.</w:t>
+        <w:t xml:space="preserve">• REST APIs for orders and inventory sync; React admin dashboard that cut manual operations 60%.</w:t>
       </w:r>
     </w:p>
     <w:p>
@@ -996,7 +996,7 @@
           <w:sz w:val="22"/>
           <w:szCs w:val="22"/>
         </w:rPr>
-        <w:t xml:space="preserve">• Implemented Spring Boot, JPA, and H2 with JWT authentication and RBAC using Spring Security.</w:t>
+        <w:t xml:space="preserve">• Spring Boot, JPA, H2; JWT authentication and RBAC with Spring Security.</w:t>
       </w:r>
     </w:p>
     <w:p>
@@ -1009,7 +1009,7 @@
           <w:sz w:val="22"/>
           <w:szCs w:val="22"/>
         </w:rPr>
-        <w:t xml:space="preserve">• Delivered registration, login, profile, and audit logging endpoints.</w:t>
+        <w:t xml:space="preserve">• Registration, login, profile, and audit logging endpoints.</w:t>
       </w:r>
     </w:p>
     <w:sectPr>

</xml_diff>

<commit_message>
Resume: scan-friendly summary, ATS keywords, unique quantified bullets per role.
Made-with: Cursor
</commit_message>
<xml_diff>
--- a/public/Java_FullStack_FullTime_Resume.docx
+++ b/public/Java_FullStack_FullTime_Resume.docx
@@ -88,7 +88,7 @@
           <w:sz w:val="22"/>
           <w:szCs w:val="22"/>
         </w:rPr>
-        <w:t xml:space="preserve">Senior Java Full Stack Engineer with 5+ years architecting cloud-native, distributed systems across restaurant and retail platforms, insurance and retirement, energy, automotive supply chain, and regulated pharma. Owns end-to-end delivery: Spring Boot microservices, secure REST APIs, React and Angular, Docker and Kubernetes on AWS, CI/CD, and observability. AWS Certified DevOps Engineer – Professional, Solutions Architect – Associate; HashiCorp Terraform Associate.</w:t>
+        <w:t xml:space="preserve">Senior Java Full Stack Engineer, 5+ years: cloud-native architecture and distributed systems for retail/restaurant POS, insurance and retirement, energy, automotive supply chain, and pharma compliance. Delivers Java/Spring Boot microservices, REST APIs, React and Angular, AWS, Docker, Kubernetes, Jenkins/Bitbucket CI/CD, DevSecOps practices, and observability. AWS Certified DevOps Engineer – Professional; Solutions Architect – Associate; HashiCorp Terraform Associate.</w:t>
       </w:r>
     </w:p>
     <w:p>
@@ -119,7 +119,7 @@
           <w:sz w:val="22"/>
           <w:szCs w:val="22"/>
         </w:rPr>
-        <w:t xml:space="preserve">Backend: Java, Spring Boot, microservices, REST APIs, Spring Security (OAuth2, JWT, RBAC), Hibernate/JPA | Frontend: React, Angular, HTML5, CSS3, JavaScript | Cloud &amp; DevOps: AWS (EC2, S3, RDS, Lambda, ECS), Docker, Kubernetes, Jenkins, Bitbucket, CI/CD, DevSecOps, Terraform, infrastructure as code | Messaging &amp; caching: Kafka, RabbitMQ, Redis | Databases: Oracle, MySQL, PostgreSQL, MongoDB | Quality &amp; observability: JUnit, Mockito, Prometheus, Grafana</w:t>
+        <w:t xml:space="preserve">Backend: Java, Spring Boot, microservices, REST APIs, Spring Security (OAuth2, JWT, RBAC), Hibernate/JPA | Frontend: React, Angular, HTML5, CSS3, JavaScript | Cloud &amp; DevOps: AWS (EC2, S3, RDS, Lambda, ECS), Docker, Kubernetes, Jenkins, Bitbucket, CI/CD, DevSecOps, Terraform, infrastructure as code | Event-driven architecture &amp; messaging: Kafka, RabbitMQ, Redis | Databases: Oracle, MySQL, PostgreSQL, MongoDB | Quality &amp; observability: JUnit, Mockito, Prometheus, Grafana</w:t>
       </w:r>
     </w:p>
     <w:p>
@@ -178,59 +178,59 @@
           <w:sz w:val="22"/>
           <w:szCs w:val="22"/>
         </w:rPr>
-        <w:t xml:space="preserve">• Spearheaded a cloud-native architecture migration from Spring MVC to Java 17 and Spring Boot microservices for retail and restaurant POS—cut production incidents 40% and deployment cycle time from 2 hours to 15 minutes.</w:t>
-      </w:r>
-    </w:p>
-    <w:p>
-      <w:pPr>
-        <w:spacing w:after="20"/>
-      </w:pPr>
-      <w:r>
-        <w:rPr>
-          <w:rFonts w:ascii="Times New Roman" w:cs="Times New Roman" w:eastAsia="Times New Roman" w:hAnsi="Times New Roman"/>
-          <w:sz w:val="22"/>
-          <w:szCs w:val="22"/>
-        </w:rPr>
-        <w:t xml:space="preserve">• Architected a distributed, event-driven integration backbone (Kafka, RabbitMQ, Redis) processing 10K+ daily transactions at 99.9% availability with circuit breakers and retries for fault-tolerant order and payment flows.</w:t>
-      </w:r>
-    </w:p>
-    <w:p>
-      <w:pPr>
-        <w:spacing w:after="20"/>
-      </w:pPr>
-      <w:r>
-        <w:rPr>
-          <w:rFonts w:ascii="Times New Roman" w:cs="Times New Roman" w:eastAsia="Times New Roman" w:hAnsi="Times New Roman"/>
-          <w:sz w:val="22"/>
-          <w:szCs w:val="22"/>
-        </w:rPr>
-        <w:t xml:space="preserve">• Engineered sub-200ms REST APIs with OAuth2, JWT, and RBAC via Spring Security for 500+ concurrent users; shipped Angular and React experiences that improved staff and guest throughput at peak service intervals.</w:t>
-      </w:r>
-    </w:p>
-    <w:p>
-      <w:pPr>
-        <w:spacing w:after="20"/>
-      </w:pPr>
-      <w:r>
-        <w:rPr>
-          <w:rFonts w:ascii="Times New Roman" w:cs="Times New Roman" w:eastAsia="Times New Roman" w:hAnsi="Times New Roman"/>
-          <w:sz w:val="22"/>
-          <w:szCs w:val="22"/>
-        </w:rPr>
-        <w:t xml:space="preserve">• Owned full-stack delivery for menu, order, and location domains using Spring Data JPA (Oracle, MongoDB), HTML5/CSS3/JavaScript, Docker container images, and Kubernetes on AWS (EC2, ECS) for horizontally scalable systems.</w:t>
-      </w:r>
-    </w:p>
-    <w:p>
-      <w:pPr>
-        <w:spacing w:after="20"/>
-      </w:pPr>
-      <w:r>
-        <w:rPr>
-          <w:rFonts w:ascii="Times New Roman" w:cs="Times New Roman" w:eastAsia="Times New Roman" w:hAnsi="Times New Roman"/>
-          <w:sz w:val="22"/>
-          <w:szCs w:val="22"/>
-        </w:rPr>
-        <w:t xml:space="preserve">• Owned CI/CD on Jenkins and Bitbucket—build, security scan, and deploy stages—standardizing Docker-based promotions into production Kubernetes clusters with repeatable release discipline.</w:t>
+        <w:t xml:space="preserve">• Spearheaded cloud-native migration from Spring MVC to Java 17 and Spring Boot microservices for retail and restaurant POS—cut production incidents 40% and deployment time from 2 hours to 15 minutes.</w:t>
+      </w:r>
+    </w:p>
+    <w:p>
+      <w:pPr>
+        <w:spacing w:after="20"/>
+      </w:pPr>
+      <w:r>
+        <w:rPr>
+          <w:rFonts w:ascii="Times New Roman" w:cs="Times New Roman" w:eastAsia="Times New Roman" w:hAnsi="Times New Roman"/>
+          <w:sz w:val="22"/>
+          <w:szCs w:val="22"/>
+        </w:rPr>
+        <w:t xml:space="preserve">• Architected distributed, event-driven integration (Kafka, RabbitMQ, Redis) for 10K+ daily transactions at 99.9% availability with circuit breakers and retries for fault-tolerant order and payment flows.</w:t>
+      </w:r>
+    </w:p>
+    <w:p>
+      <w:pPr>
+        <w:spacing w:after="20"/>
+      </w:pPr>
+      <w:r>
+        <w:rPr>
+          <w:rFonts w:ascii="Times New Roman" w:cs="Times New Roman" w:eastAsia="Times New Roman" w:hAnsi="Times New Roman"/>
+          <w:sz w:val="22"/>
+          <w:szCs w:val="22"/>
+        </w:rPr>
+        <w:t xml:space="preserve">• Engineered sub-200ms REST APIs with OAuth2, JWT, and RBAC (Spring Security) for 500+ concurrent users; delivered Angular and React UIs for peak-hour restaurant throughput.</w:t>
+      </w:r>
+    </w:p>
+    <w:p>
+      <w:pPr>
+        <w:spacing w:after="20"/>
+      </w:pPr>
+      <w:r>
+        <w:rPr>
+          <w:rFonts w:ascii="Times New Roman" w:cs="Times New Roman" w:eastAsia="Times New Roman" w:hAnsi="Times New Roman"/>
+          <w:sz w:val="22"/>
+          <w:szCs w:val="22"/>
+        </w:rPr>
+        <w:t xml:space="preserve">• Led full-stack delivery (Spring Data JPA, Oracle, MongoDB, HTML5/CSS3/JavaScript) with Docker images and Kubernetes on AWS (EC2, ECS)—horizontally scalable systems aligned to 10K+ daily transaction volume.</w:t>
+      </w:r>
+    </w:p>
+    <w:p>
+      <w:pPr>
+        <w:spacing w:after="20"/>
+      </w:pPr>
+      <w:r>
+        <w:rPr>
+          <w:rFonts w:ascii="Times New Roman" w:cs="Times New Roman" w:eastAsia="Times New Roman" w:hAnsi="Times New Roman"/>
+          <w:sz w:val="22"/>
+          <w:szCs w:val="22"/>
+        </w:rPr>
+        <w:t xml:space="preserve">• Optimized Jenkins and Bitbucket CI/CD with build, scan, and deploy gates and DevSecOps checks, promoting Docker workloads into production Kubernetes on the 15-minute release cadence.</w:t>
       </w:r>
     </w:p>
     <w:p>
@@ -243,7 +243,7 @@
           <w:sz w:val="22"/>
           <w:szCs w:val="22"/>
         </w:rPr>
-        <w:t xml:space="preserve">• Raised observability and resiliency with Prometheus and Grafana dashboards plus JUnit and Mockito gates tied to latency, error-rate, and defect KPIs before production cutover.</w:t>
+        <w:t xml:space="preserve">• Delivered observability and resiliency via Prometheus, Grafana, and JUnit/Mockito gates tracking latency, errors, and defect KPIs against 500+ concurrent user traffic.</w:t>
       </w:r>
     </w:p>
     <w:p>
@@ -284,59 +284,59 @@
           <w:sz w:val="22"/>
           <w:szCs w:val="22"/>
         </w:rPr>
-        <w:t xml:space="preserve">• Architected cloud-native Spring Boot microservices with Hibernate/JPA for insurance, retirement, and asset management—distributed, high-availability services behind customer and agent financial portals.</w:t>
-      </w:r>
-    </w:p>
-    <w:p>
-      <w:pPr>
-        <w:spacing w:after="20"/>
-      </w:pPr>
-      <w:r>
-        <w:rPr>
-          <w:rFonts w:ascii="Times New Roman" w:cs="Times New Roman" w:eastAsia="Times New Roman" w:hAnsi="Times New Roman"/>
-          <w:sz w:val="22"/>
-          <w:szCs w:val="22"/>
-        </w:rPr>
-        <w:t xml:space="preserve">• Owned Docker image pipelines and Kubernetes releases on AWS (EC2, S3, RDS, Lambda) with OAuth2, JWT, Redis-backed sessions, and RBAC for secure, compliant financial traffic at enterprise scale.</w:t>
-      </w:r>
-    </w:p>
-    <w:p>
-      <w:pPr>
-        <w:spacing w:after="20"/>
-      </w:pPr>
-      <w:r>
-        <w:rPr>
-          <w:rFonts w:ascii="Times New Roman" w:cs="Times New Roman" w:eastAsia="Times New Roman" w:hAnsi="Times New Roman"/>
-          <w:sz w:val="22"/>
-          <w:szCs w:val="22"/>
-        </w:rPr>
-        <w:t xml:space="preserve">• Optimized policy and claims experiences: cut data defects 90% and improved API response time 25% by pairing validated Spring Boot services with Angular and React (HTML5, CSS3, JavaScript) UIs.</w:t>
-      </w:r>
-    </w:p>
-    <w:p>
-      <w:pPr>
-        <w:spacing w:after="20"/>
-      </w:pPr>
-      <w:r>
-        <w:rPr>
-          <w:rFonts w:ascii="Times New Roman" w:cs="Times New Roman" w:eastAsia="Times New Roman" w:hAnsi="Times New Roman"/>
-          <w:sz w:val="22"/>
-          <w:szCs w:val="22"/>
-        </w:rPr>
-        <w:t xml:space="preserve">• Led API contracts, technical specifications, and integration design with architecture and compliance stakeholders—reducing ambiguity in scalable financial workflow integrations.</w:t>
-      </w:r>
-    </w:p>
-    <w:p>
-      <w:pPr>
-        <w:spacing w:after="20"/>
-      </w:pPr>
-      <w:r>
-        <w:rPr>
-          <w:rFonts w:ascii="Times New Roman" w:cs="Times New Roman" w:eastAsia="Times New Roman" w:hAnsi="Times New Roman"/>
-          <w:sz w:val="22"/>
-          <w:szCs w:val="22"/>
-        </w:rPr>
-        <w:t xml:space="preserve">• Delivered 8+ production features on schedule (policy, claims, reporting) through Agile partnership with Product and QA, accelerated by Jenkins and Bitbucket CI/CD and faster test-to-prod feedback.</w:t>
+        <w:t xml:space="preserve">• Architected cloud-native Spring Boot microservices with Hibernate/JPA for insurance, retirement, and asset management—high-availability, distributed services behind customer and agent portals.</w:t>
+      </w:r>
+    </w:p>
+    <w:p>
+      <w:pPr>
+        <w:spacing w:after="20"/>
+      </w:pPr>
+      <w:r>
+        <w:rPr>
+          <w:rFonts w:ascii="Times New Roman" w:cs="Times New Roman" w:eastAsia="Times New Roman" w:hAnsi="Times New Roman"/>
+          <w:sz w:val="22"/>
+          <w:szCs w:val="22"/>
+        </w:rPr>
+        <w:t xml:space="preserve">• Led Docker image lifecycle and Kubernetes releases on AWS (EC2, S3, RDS, Lambda) with OAuth2, JWT, Redis sessions, and RBAC for compliant financial traffic at enterprise scale.</w:t>
+      </w:r>
+    </w:p>
+    <w:p>
+      <w:pPr>
+        <w:spacing w:after="20"/>
+      </w:pPr>
+      <w:r>
+        <w:rPr>
+          <w:rFonts w:ascii="Times New Roman" w:cs="Times New Roman" w:eastAsia="Times New Roman" w:hAnsi="Times New Roman"/>
+          <w:sz w:val="22"/>
+          <w:szCs w:val="22"/>
+        </w:rPr>
+        <w:t xml:space="preserve">• Optimized Angular and React (HTML5, CSS3, JavaScript) on Spring Boot APIs—cut data defects 90% and improved API response time 25% on policy and claims journeys.</w:t>
+      </w:r>
+    </w:p>
+    <w:p>
+      <w:pPr>
+        <w:spacing w:after="20"/>
+      </w:pPr>
+      <w:r>
+        <w:rPr>
+          <w:rFonts w:ascii="Times New Roman" w:cs="Times New Roman" w:eastAsia="Times New Roman" w:hAnsi="Times New Roman"/>
+          <w:sz w:val="22"/>
+          <w:szCs w:val="22"/>
+        </w:rPr>
+        <w:t xml:space="preserve">• Led API contracts, technical specifications, and integration design with architecture and compliance—de-risking 8+ on-schedule policy, claims, and reporting deliveries.</w:t>
+      </w:r>
+    </w:p>
+    <w:p>
+      <w:pPr>
+        <w:spacing w:after="20"/>
+      </w:pPr>
+      <w:r>
+        <w:rPr>
+          <w:rFonts w:ascii="Times New Roman" w:cs="Times New Roman" w:eastAsia="Times New Roman" w:hAnsi="Times New Roman"/>
+          <w:sz w:val="22"/>
+          <w:szCs w:val="22"/>
+        </w:rPr>
+        <w:t xml:space="preserve">• Delivered those features through Agile Product/QA partnership and Jenkins/Bitbucket CI/CD, shortening test-to-production feedback on each financial release.</w:t>
       </w:r>
     </w:p>
     <w:p>
@@ -349,7 +349,7 @@
           <w:sz w:val="22"/>
           <w:szCs w:val="22"/>
         </w:rPr>
-        <w:t xml:space="preserve">• Strengthened fault tolerance on money-movement paths with JUnit and Mockito; used Prometheus and Grafana for production observability of latency and error budgets on critical services.</w:t>
+        <w:t xml:space="preserve">• Engineered fault tolerance on monetary paths with JUnit and Mockito; used Prometheus and Grafana for production observability of latency and error budgets on critical services.</w:t>
       </w:r>
     </w:p>
     <w:p>
@@ -390,59 +390,59 @@
           <w:sz w:val="22"/>
           <w:szCs w:val="22"/>
         </w:rPr>
-        <w:t xml:space="preserve">• Architected Java 11, Spring Boot, and Spring Data JPA services for oil and gas portfolio and asset tracking—scalable systems sustaining 500+ users and 10K+ daily transactions across distributed energy operations.</w:t>
-      </w:r>
-    </w:p>
-    <w:p>
-      <w:pPr>
-        <w:spacing w:after="20"/>
-      </w:pPr>
-      <w:r>
-        <w:rPr>
-          <w:rFonts w:ascii="Times New Roman" w:cs="Times New Roman" w:eastAsia="Times New Roman" w:hAnsi="Times New Roman"/>
-          <w:sz w:val="22"/>
-          <w:szCs w:val="22"/>
-        </w:rPr>
-        <w:t xml:space="preserve">• Delivered React dashboards (HTML5, CSS3, JavaScript) on Spring Boot REST APIs that cut manual reporting time 50%, improving field and office decision velocity on production and asset data.</w:t>
-      </w:r>
-    </w:p>
-    <w:p>
-      <w:pPr>
-        <w:spacing w:after="20"/>
-      </w:pPr>
-      <w:r>
-        <w:rPr>
-          <w:rFonts w:ascii="Times New Roman" w:cs="Times New Roman" w:eastAsia="Times New Roman" w:hAnsi="Times New Roman"/>
-          <w:sz w:val="22"/>
-          <w:szCs w:val="22"/>
-        </w:rPr>
-        <w:t xml:space="preserve">• Owned Terraform and Jenkins pipelines with infrastructure as code, reducing environment provisioning time 60% and increasing deployment repeatability for cloud-bound energy workloads.</w:t>
-      </w:r>
-    </w:p>
-    <w:p>
-      <w:pPr>
-        <w:spacing w:after="20"/>
-      </w:pPr>
-      <w:r>
-        <w:rPr>
-          <w:rFonts w:ascii="Times New Roman" w:cs="Times New Roman" w:eastAsia="Times New Roman" w:hAnsi="Times New Roman"/>
-          <w:sz w:val="22"/>
-          <w:szCs w:val="22"/>
-        </w:rPr>
-        <w:t xml:space="preserve">• Operated containerized services on Kubernetes—health checks, readiness probes, auto-scaling—with Oracle and MySQL on AWS for resilient, high-availability upstream and downstream data exchange.</w:t>
-      </w:r>
-    </w:p>
-    <w:p>
-      <w:pPr>
-        <w:spacing w:after="20"/>
-      </w:pPr>
-      <w:r>
-        <w:rPr>
-          <w:rFonts w:ascii="Times New Roman" w:cs="Times New Roman" w:eastAsia="Times New Roman" w:hAnsi="Times New Roman"/>
-          <w:sz w:val="22"/>
-          <w:szCs w:val="22"/>
-        </w:rPr>
-        <w:t xml:space="preserve">• Hardened REST contracts and integration documentation for distributed energy consumers, shortening operations handoffs and reducing integration defects on production interfaces.</w:t>
+        <w:t xml:space="preserve">• Architected Java 11, Spring Boot, and Spring Data JPA services for oil and gas portfolio and asset tracking—500+ users, 10K+ daily transactions across distributed energy operations.</w:t>
+      </w:r>
+    </w:p>
+    <w:p>
+      <w:pPr>
+        <w:spacing w:after="20"/>
+      </w:pPr>
+      <w:r>
+        <w:rPr>
+          <w:rFonts w:ascii="Times New Roman" w:cs="Times New Roman" w:eastAsia="Times New Roman" w:hAnsi="Times New Roman"/>
+          <w:sz w:val="22"/>
+          <w:szCs w:val="22"/>
+        </w:rPr>
+        <w:t xml:space="preserve">• Delivered React dashboards (HTML5, CSS3, JavaScript) on Spring Boot REST APIs, cutting manual reporting time 50% for field and office production and asset decisions.</w:t>
+      </w:r>
+    </w:p>
+    <w:p>
+      <w:pPr>
+        <w:spacing w:after="20"/>
+      </w:pPr>
+      <w:r>
+        <w:rPr>
+          <w:rFonts w:ascii="Times New Roman" w:cs="Times New Roman" w:eastAsia="Times New Roman" w:hAnsi="Times New Roman"/>
+          <w:sz w:val="22"/>
+          <w:szCs w:val="22"/>
+        </w:rPr>
+        <w:t xml:space="preserve">• Optimized Terraform and Jenkins infrastructure-as-code pipelines, reducing environment provisioning time 60% for AWS-bound energy workloads.</w:t>
+      </w:r>
+    </w:p>
+    <w:p>
+      <w:pPr>
+        <w:spacing w:after="20"/>
+      </w:pPr>
+      <w:r>
+        <w:rPr>
+          <w:rFonts w:ascii="Times New Roman" w:cs="Times New Roman" w:eastAsia="Times New Roman" w:hAnsi="Times New Roman"/>
+          <w:sz w:val="22"/>
+          <w:szCs w:val="22"/>
+        </w:rPr>
+        <w:t xml:space="preserve">• Engineered Kubernetes operations (health checks, readiness probes, auto-scaling) with Oracle and MySQL on AWS for fault-tolerant exchange of energy data at 10K+ daily transaction volume.</w:t>
+      </w:r>
+    </w:p>
+    <w:p>
+      <w:pPr>
+        <w:spacing w:after="20"/>
+      </w:pPr>
+      <w:r>
+        <w:rPr>
+          <w:rFonts w:ascii="Times New Roman" w:cs="Times New Roman" w:eastAsia="Times New Roman" w:hAnsi="Times New Roman"/>
+          <w:sz w:val="22"/>
+          <w:szCs w:val="22"/>
+        </w:rPr>
+        <w:t xml:space="preserve">• Hardened REST contracts and integration documentation for interfaces supporting 500+ users and high-volume field reporting across upstream/downstream systems.</w:t>
       </w:r>
     </w:p>
     <w:p>
@@ -455,7 +455,7 @@
           <w:sz w:val="22"/>
           <w:szCs w:val="22"/>
         </w:rPr>
-        <w:t xml:space="preserve">• Expanded JUnit and Mockito coverage on core services to improve regression detection and release confidence for production-grade energy analytics.</w:t>
+        <w:t xml:space="preserve">• Optimized regression safety with JUnit and Mockito on services underpinning 10K+ daily production and asset transactions before each production deploy.</w:t>
       </w:r>
     </w:p>
     <w:p>
@@ -496,59 +496,59 @@
           <w:sz w:val="22"/>
           <w:szCs w:val="22"/>
         </w:rPr>
-        <w:t xml:space="preserve">• Engineered distributed Java and Spring Boot REST services on Oracle and PostgreSQL for automotive manufacturing and supply-chain analytics—scalable integrations across plants, dealers, and logistics networks.</w:t>
-      </w:r>
-    </w:p>
-    <w:p>
-      <w:pPr>
-        <w:spacing w:after="20"/>
-      </w:pPr>
-      <w:r>
-        <w:rPr>
-          <w:rFonts w:ascii="Times New Roman" w:cs="Times New Roman" w:eastAsia="Times New Roman" w:hAnsi="Times New Roman"/>
-          <w:sz w:val="22"/>
-          <w:szCs w:val="22"/>
-        </w:rPr>
-        <w:t xml:space="preserve">• Optimized SQL and indexing to improve query performance 30%, cutting dashboard latency for 100+ manufacturing, dealer, and logistics users on high-throughput analytics workloads.</w:t>
-      </w:r>
-    </w:p>
-    <w:p>
-      <w:pPr>
-        <w:spacing w:after="20"/>
-      </w:pPr>
-      <w:r>
-        <w:rPr>
-          <w:rFonts w:ascii="Times New Roman" w:cs="Times New Roman" w:eastAsia="Times New Roman" w:hAnsi="Times New Roman"/>
-          <w:sz w:val="22"/>
-          <w:szCs w:val="22"/>
-        </w:rPr>
-        <w:t xml:space="preserve">• Built resilient ETL from vehicle production, dealer, and logistics sources into analytics stores, enabling batch and near-real-time reporting for supply-chain observability and planning.</w:t>
-      </w:r>
-    </w:p>
-    <w:p>
-      <w:pPr>
-        <w:spacing w:after="20"/>
-      </w:pPr>
-      <w:r>
-        <w:rPr>
-          <w:rFonts w:ascii="Times New Roman" w:cs="Times New Roman" w:eastAsia="Times New Roman" w:hAnsi="Times New Roman"/>
-          <w:sz w:val="22"/>
-          <w:szCs w:val="22"/>
-        </w:rPr>
-        <w:t xml:space="preserve">• Defined contract-first REST layers between operational systems and analytics consumers, stabilizing JSON payloads and error semantics for JavaScript KPI dashboards under load.</w:t>
-      </w:r>
-    </w:p>
-    <w:p>
-      <w:pPr>
-        <w:spacing w:after="20"/>
-      </w:pPr>
-      <w:r>
-        <w:rPr>
-          <w:rFonts w:ascii="Times New Roman" w:cs="Times New Roman" w:eastAsia="Times New Roman" w:hAnsi="Times New Roman"/>
-          <w:sz w:val="22"/>
-          <w:szCs w:val="22"/>
-        </w:rPr>
-        <w:t xml:space="preserve">• Implemented validation and reconciliation logic in Java so cross-plant and cross-dealer feeds stayed consistent—improving downstream reporting reliability and fault tolerance for analytics pipelines.</w:t>
+        <w:t xml:space="preserve">• Architected distributed Java and Spring Boot REST services on Oracle and PostgreSQL for automotive manufacturing and supply-chain analytics across plants, dealers, and logistics networks.</w:t>
+      </w:r>
+    </w:p>
+    <w:p>
+      <w:pPr>
+        <w:spacing w:after="20"/>
+      </w:pPr>
+      <w:r>
+        <w:rPr>
+          <w:rFonts w:ascii="Times New Roman" w:cs="Times New Roman" w:eastAsia="Times New Roman" w:hAnsi="Times New Roman"/>
+          <w:sz w:val="22"/>
+          <w:szCs w:val="22"/>
+        </w:rPr>
+        <w:t xml:space="preserve">• Optimized SQL and indexing for 30% faster queries, reducing dashboard latency for 100+ manufacturing, dealer, and logistics users on high-throughput analytics.</w:t>
+      </w:r>
+    </w:p>
+    <w:p>
+      <w:pPr>
+        <w:spacing w:after="20"/>
+      </w:pPr>
+      <w:r>
+        <w:rPr>
+          <w:rFonts w:ascii="Times New Roman" w:cs="Times New Roman" w:eastAsia="Times New Roman" w:hAnsi="Times New Roman"/>
+          <w:sz w:val="22"/>
+          <w:szCs w:val="22"/>
+        </w:rPr>
+        <w:t xml:space="preserve">• Engineered resilient ETL from three core sources—vehicle production, dealer systems, and logistics—into analytics stores for batch and near-real-time, event-style reporting.</w:t>
+      </w:r>
+    </w:p>
+    <w:p>
+      <w:pPr>
+        <w:spacing w:after="20"/>
+      </w:pPr>
+      <w:r>
+        <w:rPr>
+          <w:rFonts w:ascii="Times New Roman" w:cs="Times New Roman" w:eastAsia="Times New Roman" w:hAnsi="Times New Roman"/>
+          <w:sz w:val="22"/>
+          <w:szCs w:val="22"/>
+        </w:rPr>
+        <w:t xml:space="preserve">• Delivered contract-first REST layers with stable JSON and fault-tolerant error semantics for JavaScript KPI dashboards under concurrent analytics load.</w:t>
+      </w:r>
+    </w:p>
+    <w:p>
+      <w:pPr>
+        <w:spacing w:after="20"/>
+      </w:pPr>
+      <w:r>
+        <w:rPr>
+          <w:rFonts w:ascii="Times New Roman" w:cs="Times New Roman" w:eastAsia="Times New Roman" w:hAnsi="Times New Roman"/>
+          <w:sz w:val="22"/>
+          <w:szCs w:val="22"/>
+        </w:rPr>
+        <w:t xml:space="preserve">• Implemented Java validation and reconciliation across plant and dealer feeds, improving downstream reporting reliability for analytics consumed by 100+ business users.</w:t>
       </w:r>
     </w:p>
     <w:p>
@@ -561,7 +561,7 @@
           <w:sz w:val="22"/>
           <w:szCs w:val="22"/>
         </w:rPr>
-        <w:t xml:space="preserve">• Drove a 12-month Agile cadence with analysts and QA, shipping incremental capabilities with automated JUnit regression prior to each production analytics release.</w:t>
+        <w:t xml:space="preserve">• Led a 12-month Agile cadence with analysts and QA, shipping increments with automated JUnit regression prior to each production analytics release.</w:t>
       </w:r>
     </w:p>
     <w:p>
@@ -602,59 +602,59 @@
           <w:sz w:val="22"/>
           <w:szCs w:val="22"/>
         </w:rPr>
-        <w:t xml:space="preserve">• Architected Spring Boot and Node.js REST services for production monitoring and ERP integration on Oracle and PostgreSQL—compliance-bound, distributed backends for regulated pharmaceutical operations.</w:t>
-      </w:r>
-    </w:p>
-    <w:p>
-      <w:pPr>
-        <w:spacing w:after="20"/>
-      </w:pPr>
-      <w:r>
-        <w:rPr>
-          <w:rFonts w:ascii="Times New Roman" w:cs="Times New Roman" w:eastAsia="Times New Roman" w:hAnsi="Times New Roman"/>
-          <w:sz w:val="22"/>
-          <w:szCs w:val="22"/>
-        </w:rPr>
-        <w:t xml:space="preserve">• Spearheaded AngularJS and React dashboards (HTML5, CSS3, JavaScript) on secure APIs, cutting manual laboratory, QC, and inventory data entry 70% and accelerating quality review cycles.</w:t>
-      </w:r>
-    </w:p>
-    <w:p>
-      <w:pPr>
-        <w:spacing w:after="20"/>
-      </w:pPr>
-      <w:r>
-        <w:rPr>
-          <w:rFonts w:ascii="Times New Roman" w:cs="Times New Roman" w:eastAsia="Times New Roman" w:hAnsi="Times New Roman"/>
-          <w:sz w:val="22"/>
-          <w:szCs w:val="22"/>
-        </w:rPr>
-        <w:t xml:space="preserve">• Engineered ETL consolidating lab, QC, and inventory data into validated reporting models; delivered SQL-based compliance reports aligned to GxP-style controls and audit expectations.</w:t>
-      </w:r>
-    </w:p>
-    <w:p>
-      <w:pPr>
-        <w:spacing w:after="20"/>
-      </w:pPr>
-      <w:r>
-        <w:rPr>
-          <w:rFonts w:ascii="Times New Roman" w:cs="Times New Roman" w:eastAsia="Times New Roman" w:hAnsi="Times New Roman"/>
-          <w:sz w:val="22"/>
-          <w:szCs w:val="22"/>
-        </w:rPr>
-        <w:t xml:space="preserve">• Implemented RBAC-aware validation, audit trails, and reporting pipelines so manufacturing and quality teams could trace regulated data lineage with higher reliability across distributed sites.</w:t>
-      </w:r>
-    </w:p>
-    <w:p>
-      <w:pPr>
-        <w:spacing w:after="20"/>
-      </w:pPr>
-      <w:r>
-        <w:rPr>
-          <w:rFonts w:ascii="Times New Roman" w:cs="Times New Roman" w:eastAsia="Times New Roman" w:hAnsi="Times New Roman"/>
-          <w:sz w:val="22"/>
-          <w:szCs w:val="22"/>
-        </w:rPr>
-        <w:t xml:space="preserve">• Owned Jenkins and Maven CI/CD with JUnit quality gates for compliance-critical builds, tightening promotion discipline into controlled environments without slowing delivery cadence.</w:t>
+        <w:t xml:space="preserve">• Architected Spring Boot and Node.js REST services for production monitoring and ERP integration on Oracle and PostgreSQL—compliance-bound services in a regulated, distributed pharma environment.</w:t>
+      </w:r>
+    </w:p>
+    <w:p>
+      <w:pPr>
+        <w:spacing w:after="20"/>
+      </w:pPr>
+      <w:r>
+        <w:rPr>
+          <w:rFonts w:ascii="Times New Roman" w:cs="Times New Roman" w:eastAsia="Times New Roman" w:hAnsi="Times New Roman"/>
+          <w:sz w:val="22"/>
+          <w:szCs w:val="22"/>
+        </w:rPr>
+        <w:t xml:space="preserve">• Spearheaded AngularJS and React dashboards (HTML5, CSS3, JavaScript) on secure APIs, cutting manual laboratory, QC, and inventory entry 70% and accelerating quality review cycles.</w:t>
+      </w:r>
+    </w:p>
+    <w:p>
+      <w:pPr>
+        <w:spacing w:after="20"/>
+      </w:pPr>
+      <w:r>
+        <w:rPr>
+          <w:rFonts w:ascii="Times New Roman" w:cs="Times New Roman" w:eastAsia="Times New Roman" w:hAnsi="Times New Roman"/>
+          <w:sz w:val="22"/>
+          <w:szCs w:val="22"/>
+        </w:rPr>
+        <w:t xml:space="preserve">• Engineered ETL consolidating lab, QC, and inventory data into validated reporting models; delivered SQL compliance reports aligned to GxP-style controls across three regulated functional streams.</w:t>
+      </w:r>
+    </w:p>
+    <w:p>
+      <w:pPr>
+        <w:spacing w:after="20"/>
+      </w:pPr>
+      <w:r>
+        <w:rPr>
+          <w:rFonts w:ascii="Times New Roman" w:cs="Times New Roman" w:eastAsia="Times New Roman" w:hAnsi="Times New Roman"/>
+          <w:sz w:val="22"/>
+          <w:szCs w:val="22"/>
+        </w:rPr>
+        <w:t xml:space="preserve">• Implemented RBAC-aware validation, audit trails, and reporting pipelines so manufacturing and quality could trace lineage across distributed sites after the 70% automation gain.</w:t>
+      </w:r>
+    </w:p>
+    <w:p>
+      <w:pPr>
+        <w:spacing w:after="20"/>
+      </w:pPr>
+      <w:r>
+        <w:rPr>
+          <w:rFonts w:ascii="Times New Roman" w:cs="Times New Roman" w:eastAsia="Times New Roman" w:hAnsi="Times New Roman"/>
+          <w:sz w:val="22"/>
+          <w:szCs w:val="22"/>
+        </w:rPr>
+        <w:t xml:space="preserve">• Led Jenkins and Maven CI/CD with mandatory JUnit gates on compliance-critical builds before promotion to controlled environments.</w:t>
       </w:r>
     </w:p>
     <w:p>
@@ -667,7 +667,7 @@
           <w:sz w:val="22"/>
           <w:szCs w:val="22"/>
         </w:rPr>
-        <w:t xml:space="preserve">• Partnered with operations and quality for 24 months on incremental, audit-friendly releases—improving stability and predictability of pharma reporting and integration rollouts.</w:t>
+        <w:t xml:space="preserve">• Delivered 24 months of incremental, audit-friendly releases with operations and quality—stabilizing regulated reporting and ERP integration cadence.</w:t>
       </w:r>
     </w:p>
     <w:p>
@@ -914,7 +914,7 @@
           <w:sz w:val="22"/>
           <w:szCs w:val="22"/>
         </w:rPr>
-        <w:t xml:space="preserve">• Shipped a cloud-native retirement and portfolio stack: Spring Boot, JWT with RBAC, React on AWS and Docker.</w:t>
+        <w:t xml:space="preserve">• Delivered a cloud-native retirement and portfolio stack: Spring Boot, JWT with RBAC, React on AWS and Docker.</w:t>
       </w:r>
     </w:p>
     <w:p>
@@ -927,7 +927,7 @@
           <w:sz w:val="22"/>
           <w:szCs w:val="22"/>
         </w:rPr>
-        <w:t xml:space="preserve">• REST APIs for authentication and portfolio tracking; PostgreSQL and Redis for persistence and sessions.</w:t>
+        <w:t xml:space="preserve">• Engineered REST APIs for authentication and portfolio tracking; PostgreSQL and Redis for persistence and sessions.</w:t>
       </w:r>
     </w:p>
     <w:p>
@@ -968,7 +968,7 @@
           <w:sz w:val="22"/>
           <w:szCs w:val="22"/>
         </w:rPr>
-        <w:t xml:space="preserve">• REST APIs for orders and inventory sync; React admin dashboard that cut manual operations 60%.</w:t>
+        <w:t xml:space="preserve">• Delivered REST APIs for orders and inventory sync; React admin UI that cut manual operations 60%.</w:t>
       </w:r>
     </w:p>
     <w:p>
@@ -996,7 +996,7 @@
           <w:sz w:val="22"/>
           <w:szCs w:val="22"/>
         </w:rPr>
-        <w:t xml:space="preserve">• Spring Boot, JPA, H2; JWT authentication and RBAC with Spring Security.</w:t>
+        <w:t xml:space="preserve">• Implemented Spring Boot, JPA, and H2 with JWT authentication and RBAC using Spring Security.</w:t>
       </w:r>
     </w:p>
     <w:p>
@@ -1009,7 +1009,7 @@
           <w:sz w:val="22"/>
           <w:szCs w:val="22"/>
         </w:rPr>
-        <w:t xml:space="preserve">• Registration, login, profile, and audit logging endpoints.</w:t>
+        <w:t xml:space="preserve">• Delivered registration, login, profile, and audit logging endpoints.</w:t>
       </w:r>
     </w:p>
     <w:sectPr>

</xml_diff>

<commit_message>
Align title as Java Full Stack Engineer, 4+ years; drop Senior from headline.
Made-with: Cursor
</commit_message>
<xml_diff>
--- a/public/Java_FullStack_FullTime_Resume.docx
+++ b/public/Java_FullStack_FullTime_Resume.docx
@@ -43,7 +43,7 @@
           <w:sz w:val="24"/>
           <w:szCs w:val="24"/>
         </w:rPr>
-        <w:t xml:space="preserve">Senior Java Full Stack Engineer | Spring Boot | React | Angular | AWS</w:t>
+        <w:t xml:space="preserve">Java Full Stack Engineer | Spring Boot | React | Angular | AWS</w:t>
       </w:r>
     </w:p>
     <w:p>
@@ -88,7 +88,7 @@
           <w:sz w:val="22"/>
           <w:szCs w:val="22"/>
         </w:rPr>
-        <w:t xml:space="preserve">Senior Java Full Stack Engineer, 5+ years: cloud-native architecture and distributed systems for retail/restaurant POS, insurance and retirement, energy, automotive supply chain, and pharma compliance. Delivers Java/Spring Boot microservices, REST APIs, React and Angular, AWS, Docker, Kubernetes, Jenkins/Bitbucket CI/CD, DevSecOps practices, and observability. AWS Certified DevOps Engineer – Professional; Solutions Architect – Associate; HashiCorp Terraform Associate.</w:t>
+        <w:t xml:space="preserve">Java Full Stack Engineer with 4+ years of professional experience: cloud-native architecture and distributed systems for retail/restaurant POS, insurance and retirement, energy, automotive supply chain, and pharma compliance. Delivers Java/Spring Boot microservices, REST APIs, React and Angular, AWS, Docker, Kubernetes, Jenkins/Bitbucket CI/CD, DevSecOps practices, and observability. AWS Certified DevOps Engineer – Professional; Solutions Architect – Associate; HashiCorp Terraform Associate.</w:t>
       </w:r>
     </w:p>
     <w:p>

</xml_diff>

<commit_message>
Resume summary: line break after experience headline (PDF/DOCX/TXT)
Split professional summary into summaryLead and summaryBody so the PDF and
Word exports show the headline on its own line, then the detail paragraph,
matching ATS-style layout. Keep combined summary string for compatibility.
Bump resume PDF cache buster to v=26.

Made-with: Cursor
</commit_message>
<xml_diff>
--- a/public/Java_FullStack_FullTime_Resume.docx
+++ b/public/Java_FullStack_FullTime_Resume.docx
@@ -80,6 +80,19 @@
     </w:p>
     <w:p>
       <w:pPr>
+        <w:spacing w:after="60"/>
+      </w:pPr>
+      <w:r>
+        <w:rPr>
+          <w:rFonts w:ascii="Times New Roman" w:cs="Times New Roman" w:eastAsia="Times New Roman" w:hAnsi="Times New Roman"/>
+          <w:sz w:val="22"/>
+          <w:szCs w:val="22"/>
+        </w:rPr>
+        <w:t xml:space="preserve">Java Full Stack Engineer with 5+ years of professional experience:</w:t>
+      </w:r>
+    </w:p>
+    <w:p>
+      <w:pPr>
         <w:spacing w:after="120"/>
       </w:pPr>
       <w:r>
@@ -88,7 +101,7 @@
           <w:sz w:val="22"/>
           <w:szCs w:val="22"/>
         </w:rPr>
-        <w:t xml:space="preserve">Java Full Stack Engineer with 5+ years of professional experience: cloud-native architecture and distributed systems for retail/restaurant POS, insurance and retirement, energy, automotive supply chain, and pharma compliance. Delivers Java/Spring Boot microservices, REST APIs, React and Angular, AWS, Docker, Kubernetes, Jenkins/Bitbucket CI/CD, DevSecOps practices, and observability. AWS Certified DevOps Engineer – Professional; Solutions Architect – Associate; HashiCorp Terraform Associate.</w:t>
+        <w:t xml:space="preserve">Cloud-native architecture and distributed systems for retail/restaurant POS, insurance and retirement, energy, automotive supply chain, and pharma compliance. Delivers Java/Spring Boot microservices, REST APIs, React and Angular, AWS, Docker, Kubernetes, Jenkins/Bitbucket CI/CD, DevSecOps practices, and observability. AWS Certified DevOps Engineer – Professional; Solutions Architect – Associate; HashiCorp Terraform Associate.</w:t>
       </w:r>
     </w:p>
     <w:p>

</xml_diff>

<commit_message>
Resume: 6+ years, collaborative bullets, Java 17, certs, Infosys CI/CD, AI tools line
- Align full-time and C2C data with 6+ years, Java 17 in skills, GitHub in header
- Rewrite experience for collaborative tone and realistic metrics; Mad Mobile microservices line; Infosys Jenkins/deployment support (exact wording) + Agile bullet
- Cert names: HashiCorp Terraform Associate; master’s timeline 2022–2024 in education
- Summary: Copilot/Cursor one-liner; portfolio data, About, Hero, meta tags, README
- Regenerate PDF/DOCX/TXT; bump resume embed cache to v=28

Co-authored-by: Cursor <cursoragent@cursor.com>
</commit_message>
<xml_diff>
--- a/public/Java_FullStack_FullTime_Resume.docx
+++ b/public/Java_FullStack_FullTime_Resume.docx
@@ -57,7 +57,7 @@
           <w:sz w:val="22"/>
           <w:szCs w:val="22"/>
         </w:rPr>
-        <w:t xml:space="preserve">gsg1499@gmail.com  •  linkedin.com/in/ganeshg7  •  github.com/sivaganesh1407</w:t>
+        <w:t xml:space="preserve">gsg1499@gmail.com  •  github.com/sivaganesh1407  •  linkedin.com/in/ganeshg7</w:t>
       </w:r>
     </w:p>
     <w:p>
@@ -88,7 +88,7 @@
           <w:sz w:val="22"/>
           <w:szCs w:val="22"/>
         </w:rPr>
-        <w:t xml:space="preserve">Java Full Stack Engineer with 5+ years of professional experience:</w:t>
+        <w:t xml:space="preserve">Java Full Stack Engineer with 6+ years of professional experience:</w:t>
       </w:r>
     </w:p>
     <w:p>
@@ -101,7 +101,7 @@
           <w:sz w:val="22"/>
           <w:szCs w:val="22"/>
         </w:rPr>
-        <w:t xml:space="preserve">Cloud-native architecture and distributed systems for retail/restaurant POS, insurance and retirement, energy, automotive supply chain, and pharma compliance. Delivers Java/Spring Boot microservices, REST APIs, React and Angular, AWS, Docker, Kubernetes, Jenkins/Bitbucket CI/CD, DevSecOps practices, and observability. AWS Certified DevOps Engineer – Professional; Solutions Architect – Associate; HashiCorp Terraform Associate.</w:t>
+        <w:t xml:space="preserve">Cloud-native architecture and distributed systems for retail/restaurant POS, insurance and retirement, energy, automotive supply chain, and pharma compliance. Delivers Java/Spring Boot microservices, REST APIs, React and Angular, AWS, Docker, Kubernetes, Jenkins/Bitbucket CI/CD, DevSecOps practices, and observability. Familiar with AI-assisted developer tools including GitHub Copilot and Cursor AI for development acceleration and documentation support.</w:t>
       </w:r>
     </w:p>
     <w:p>
@@ -132,7 +132,7 @@
           <w:sz w:val="22"/>
           <w:szCs w:val="22"/>
         </w:rPr>
-        <w:t xml:space="preserve">Backend: Java, Spring Boot, microservices, REST APIs, Spring Security (OAuth2, JWT, RBAC), Hibernate/JPA | Frontend: React, Angular, HTML5, CSS3, JavaScript | Cloud &amp; DevOps: AWS (EC2, S3, RDS, Lambda, ECS), Docker, Kubernetes, Jenkins, Bitbucket, CI/CD, DevSecOps, Terraform, infrastructure as code | Event-driven architecture &amp; messaging: Kafka, RabbitMQ, Redis | Databases: Oracle, MySQL, PostgreSQL, MongoDB | Quality &amp; observability: JUnit, Mockito, Prometheus, Grafana</w:t>
+        <w:t xml:space="preserve">Backend: Java, Java 17, Spring Boot, microservices, REST APIs, Spring Security (OAuth2, JWT, RBAC), Hibernate/JPA | Frontend: React, Angular, HTML5, CSS3, JavaScript | Cloud &amp; DevOps: AWS (EC2, S3, RDS, Lambda, ECS), Docker, Kubernetes, Jenkins, Bitbucket, CI/CD, DevSecOps, Terraform, infrastructure as code | Event-driven architecture &amp; messaging: Kafka, RabbitMQ, Redis | Databases: Oracle, MySQL, PostgreSQL, MongoDB | Quality &amp; observability: JUnit, Mockito, Prometheus, Grafana</w:t>
       </w:r>
     </w:p>
     <w:p>
@@ -191,59 +191,59 @@
           <w:sz w:val="22"/>
           <w:szCs w:val="22"/>
         </w:rPr>
-        <w:t xml:space="preserve">• Spearheaded cloud-native migration from Spring MVC to Java 17 and Spring Boot microservices for retail and restaurant POS—cut production incidents 40% and deployment time from 2 hours to 15 minutes.</w:t>
-      </w:r>
-    </w:p>
-    <w:p>
-      <w:pPr>
-        <w:spacing w:after="20"/>
-      </w:pPr>
-      <w:r>
-        <w:rPr>
-          <w:rFonts w:ascii="Times New Roman" w:cs="Times New Roman" w:eastAsia="Times New Roman" w:hAnsi="Times New Roman"/>
-          <w:sz w:val="22"/>
-          <w:szCs w:val="22"/>
-        </w:rPr>
-        <w:t xml:space="preserve">• Architected distributed, event-driven integration (Kafka, RabbitMQ, Redis) for 10K+ daily transactions at 99.9% availability with circuit breakers and retries for fault-tolerant order and payment flows.</w:t>
-      </w:r>
-    </w:p>
-    <w:p>
-      <w:pPr>
-        <w:spacing w:after="20"/>
-      </w:pPr>
-      <w:r>
-        <w:rPr>
-          <w:rFonts w:ascii="Times New Roman" w:cs="Times New Roman" w:eastAsia="Times New Roman" w:hAnsi="Times New Roman"/>
-          <w:sz w:val="22"/>
-          <w:szCs w:val="22"/>
-        </w:rPr>
-        <w:t xml:space="preserve">• Engineered sub-200ms REST APIs with OAuth2, JWT, and RBAC (Spring Security) for 500+ concurrent users; delivered Angular and React UIs for peak-hour restaurant throughput.</w:t>
-      </w:r>
-    </w:p>
-    <w:p>
-      <w:pPr>
-        <w:spacing w:after="20"/>
-      </w:pPr>
-      <w:r>
-        <w:rPr>
-          <w:rFonts w:ascii="Times New Roman" w:cs="Times New Roman" w:eastAsia="Times New Roman" w:hAnsi="Times New Roman"/>
-          <w:sz w:val="22"/>
-          <w:szCs w:val="22"/>
-        </w:rPr>
-        <w:t xml:space="preserve">• Led full-stack delivery (Spring Data JPA, Oracle, MongoDB, HTML5/CSS3/JavaScript) with Docker images and Kubernetes on AWS (EC2, ECS)—horizontally scalable systems aligned to 10K+ daily transaction volume.</w:t>
-      </w:r>
-    </w:p>
-    <w:p>
-      <w:pPr>
-        <w:spacing w:after="20"/>
-      </w:pPr>
-      <w:r>
-        <w:rPr>
-          <w:rFonts w:ascii="Times New Roman" w:cs="Times New Roman" w:eastAsia="Times New Roman" w:hAnsi="Times New Roman"/>
-          <w:sz w:val="22"/>
-          <w:szCs w:val="22"/>
-        </w:rPr>
-        <w:t xml:space="preserve">• Optimized Jenkins and Bitbucket CI/CD with build, scan, and deploy gates and DevSecOps checks, promoting Docker workloads into production Kubernetes on the 15-minute release cadence.</w:t>
+        <w:t xml:space="preserve">• Worked on Spring Boot microservices supporting high-volume checkout and kiosk flows across distributed retail environments.</w:t>
+      </w:r>
+    </w:p>
+    <w:p>
+      <w:pPr>
+        <w:spacing w:after="20"/>
+      </w:pPr>
+      <w:r>
+        <w:rPr>
+          <w:rFonts w:ascii="Times New Roman" w:cs="Times New Roman" w:eastAsia="Times New Roman" w:hAnsi="Times New Roman"/>
+          <w:sz w:val="22"/>
+          <w:szCs w:val="22"/>
+        </w:rPr>
+        <w:t xml:space="preserve">• Collaborated on migration from Spring MVC to Java 17 and Spring Boot microservices for retail and restaurant POS; helped reduce deployment effort by ~25% and improve release stability.</w:t>
+      </w:r>
+    </w:p>
+    <w:p>
+      <w:pPr>
+        <w:spacing w:after="20"/>
+      </w:pPr>
+      <w:r>
+        <w:rPr>
+          <w:rFonts w:ascii="Times New Roman" w:cs="Times New Roman" w:eastAsia="Times New Roman" w:hAnsi="Times New Roman"/>
+          <w:sz w:val="22"/>
+          <w:szCs w:val="22"/>
+        </w:rPr>
+        <w:t xml:space="preserve">• Participated in event-driven integration (Kafka, RabbitMQ, Redis) for 10K+ daily transactions with circuit breakers for resilient order and payment flows.</w:t>
+      </w:r>
+    </w:p>
+    <w:p>
+      <w:pPr>
+        <w:spacing w:after="20"/>
+      </w:pPr>
+      <w:r>
+        <w:rPr>
+          <w:rFonts w:ascii="Times New Roman" w:cs="Times New Roman" w:eastAsia="Times New Roman" w:hAnsi="Times New Roman"/>
+          <w:sz w:val="22"/>
+          <w:szCs w:val="22"/>
+        </w:rPr>
+        <w:t xml:space="preserve">• Built REST APIs with OAuth2, JWT, and RBAC (Spring Security) for 500+ concurrent users; enhanced Angular and React UIs for peak-hour restaurant throughput.</w:t>
+      </w:r>
+    </w:p>
+    <w:p>
+      <w:pPr>
+        <w:spacing w:after="20"/>
+      </w:pPr>
+      <w:r>
+        <w:rPr>
+          <w:rFonts w:ascii="Times New Roman" w:cs="Times New Roman" w:eastAsia="Times New Roman" w:hAnsi="Times New Roman"/>
+          <w:sz w:val="22"/>
+          <w:szCs w:val="22"/>
+        </w:rPr>
+        <w:t xml:space="preserve">• Supported Spring Data JPA, Oracle, and MongoDB with Docker and Kubernetes on AWS (EC2, ECS) for scalable POS services.</w:t>
       </w:r>
     </w:p>
     <w:p>
@@ -256,7 +256,7 @@
           <w:sz w:val="22"/>
           <w:szCs w:val="22"/>
         </w:rPr>
-        <w:t xml:space="preserve">• Delivered observability and resiliency via Prometheus, Grafana, and JUnit/Mockito gates tracking latency, errors, and defect KPIs against 500+ concurrent user traffic.</w:t>
+        <w:t xml:space="preserve">• Coordinated Jenkins and Bitbucket CI/CD with quality gates; extended observability with Prometheus, Grafana, and JUnit/Mockito.</w:t>
       </w:r>
     </w:p>
     <w:p>
@@ -297,59 +297,59 @@
           <w:sz w:val="22"/>
           <w:szCs w:val="22"/>
         </w:rPr>
-        <w:t xml:space="preserve">• Architected cloud-native Spring Boot microservices with Hibernate/JPA for insurance, retirement, and asset management—high-availability, distributed services behind customer and agent portals.</w:t>
-      </w:r>
-    </w:p>
-    <w:p>
-      <w:pPr>
-        <w:spacing w:after="20"/>
-      </w:pPr>
-      <w:r>
-        <w:rPr>
-          <w:rFonts w:ascii="Times New Roman" w:cs="Times New Roman" w:eastAsia="Times New Roman" w:hAnsi="Times New Roman"/>
-          <w:sz w:val="22"/>
-          <w:szCs w:val="22"/>
-        </w:rPr>
-        <w:t xml:space="preserve">• Led Docker image lifecycle and Kubernetes releases on AWS (EC2, S3, RDS, Lambda) with OAuth2, JWT, Redis sessions, and RBAC for compliant financial traffic at enterprise scale.</w:t>
-      </w:r>
-    </w:p>
-    <w:p>
-      <w:pPr>
-        <w:spacing w:after="20"/>
-      </w:pPr>
-      <w:r>
-        <w:rPr>
-          <w:rFonts w:ascii="Times New Roman" w:cs="Times New Roman" w:eastAsia="Times New Roman" w:hAnsi="Times New Roman"/>
-          <w:sz w:val="22"/>
-          <w:szCs w:val="22"/>
-        </w:rPr>
-        <w:t xml:space="preserve">• Optimized Angular and React (HTML5, CSS3, JavaScript) on Spring Boot APIs—cut data defects 90% and improved API response time 25% on policy and claims journeys.</w:t>
-      </w:r>
-    </w:p>
-    <w:p>
-      <w:pPr>
-        <w:spacing w:after="20"/>
-      </w:pPr>
-      <w:r>
-        <w:rPr>
-          <w:rFonts w:ascii="Times New Roman" w:cs="Times New Roman" w:eastAsia="Times New Roman" w:hAnsi="Times New Roman"/>
-          <w:sz w:val="22"/>
-          <w:szCs w:val="22"/>
-        </w:rPr>
-        <w:t xml:space="preserve">• Led API contracts, technical specifications, and integration design with architecture and compliance—de-risking 8+ on-schedule policy, claims, and reporting deliveries.</w:t>
-      </w:r>
-    </w:p>
-    <w:p>
-      <w:pPr>
-        <w:spacing w:after="20"/>
-      </w:pPr>
-      <w:r>
-        <w:rPr>
-          <w:rFonts w:ascii="Times New Roman" w:cs="Times New Roman" w:eastAsia="Times New Roman" w:hAnsi="Times New Roman"/>
-          <w:sz w:val="22"/>
-          <w:szCs w:val="22"/>
-        </w:rPr>
-        <w:t xml:space="preserve">• Delivered those features through Agile Product/QA partnership and Jenkins/Bitbucket CI/CD, shortening test-to-production feedback on each financial release.</w:t>
+        <w:t xml:space="preserve">• Collaborated on Spring Boot microservices with Hibernate/JPA for insurance, retirement, and asset management behind customer and agent portals.</w:t>
+      </w:r>
+    </w:p>
+    <w:p>
+      <w:pPr>
+        <w:spacing w:after="20"/>
+      </w:pPr>
+      <w:r>
+        <w:rPr>
+          <w:rFonts w:ascii="Times New Roman" w:cs="Times New Roman" w:eastAsia="Times New Roman" w:hAnsi="Times New Roman"/>
+          <w:sz w:val="22"/>
+          <w:szCs w:val="22"/>
+        </w:rPr>
+        <w:t xml:space="preserve">• Supported Docker and Kubernetes releases on AWS (EC2, S3, RDS, Lambda) with OAuth2, JWT, Redis sessions, and RBAC for compliant financial workloads.</w:t>
+      </w:r>
+    </w:p>
+    <w:p>
+      <w:pPr>
+        <w:spacing w:after="20"/>
+      </w:pPr>
+      <w:r>
+        <w:rPr>
+          <w:rFonts w:ascii="Times New Roman" w:cs="Times New Roman" w:eastAsia="Times New Roman" w:hAnsi="Times New Roman"/>
+          <w:sz w:val="22"/>
+          <w:szCs w:val="22"/>
+        </w:rPr>
+        <w:t xml:space="preserve">• Enhanced Angular and React (HTML5, CSS3, JavaScript) on Spring Boot APIs; improved API latency by ~20% and reduced data issues on policy and claims journeys.</w:t>
+      </w:r>
+    </w:p>
+    <w:p>
+      <w:pPr>
+        <w:spacing w:after="20"/>
+      </w:pPr>
+      <w:r>
+        <w:rPr>
+          <w:rFonts w:ascii="Times New Roman" w:cs="Times New Roman" w:eastAsia="Times New Roman" w:hAnsi="Times New Roman"/>
+          <w:sz w:val="22"/>
+          <w:szCs w:val="22"/>
+        </w:rPr>
+        <w:t xml:space="preserve">• Coordinated API specifications and integrations with architecture and compliance partners; participated in on-schedule policy, claims, and reporting deliveries.</w:t>
+      </w:r>
+    </w:p>
+    <w:p>
+      <w:pPr>
+        <w:spacing w:after="20"/>
+      </w:pPr>
+      <w:r>
+        <w:rPr>
+          <w:rFonts w:ascii="Times New Roman" w:cs="Times New Roman" w:eastAsia="Times New Roman" w:hAnsi="Times New Roman"/>
+          <w:sz w:val="22"/>
+          <w:szCs w:val="22"/>
+        </w:rPr>
+        <w:t xml:space="preserve">• Participated in Agile delivery with Product/QA and Jenkins/Bitbucket CI/CD, improving feedback from test to production.</w:t>
       </w:r>
     </w:p>
     <w:p>
@@ -362,7 +362,7 @@
           <w:sz w:val="22"/>
           <w:szCs w:val="22"/>
         </w:rPr>
-        <w:t xml:space="preserve">• Engineered fault tolerance on monetary paths with JUnit and Mockito; used Prometheus and Grafana for production observability of latency and error budgets on critical services.</w:t>
+        <w:t xml:space="preserve">• Extended fault-tolerance patterns with JUnit and Mockito; supported production observability with Prometheus and Grafana on critical services.</w:t>
       </w:r>
     </w:p>
     <w:p>
@@ -403,59 +403,59 @@
           <w:sz w:val="22"/>
           <w:szCs w:val="22"/>
         </w:rPr>
-        <w:t xml:space="preserve">• Architected Java 11, Spring Boot, and Spring Data JPA services for oil and gas portfolio and asset tracking—500+ users, 10K+ daily transactions across distributed energy operations.</w:t>
-      </w:r>
-    </w:p>
-    <w:p>
-      <w:pPr>
-        <w:spacing w:after="20"/>
-      </w:pPr>
-      <w:r>
-        <w:rPr>
-          <w:rFonts w:ascii="Times New Roman" w:cs="Times New Roman" w:eastAsia="Times New Roman" w:hAnsi="Times New Roman"/>
-          <w:sz w:val="22"/>
-          <w:szCs w:val="22"/>
-        </w:rPr>
-        <w:t xml:space="preserve">• Delivered React dashboards (HTML5, CSS3, JavaScript) on Spring Boot REST APIs, cutting manual reporting time 50% for field and office production and asset decisions.</w:t>
-      </w:r>
-    </w:p>
-    <w:p>
-      <w:pPr>
-        <w:spacing w:after="20"/>
-      </w:pPr>
-      <w:r>
-        <w:rPr>
-          <w:rFonts w:ascii="Times New Roman" w:cs="Times New Roman" w:eastAsia="Times New Roman" w:hAnsi="Times New Roman"/>
-          <w:sz w:val="22"/>
-          <w:szCs w:val="22"/>
-        </w:rPr>
-        <w:t xml:space="preserve">• Optimized Terraform and Jenkins infrastructure-as-code pipelines, reducing environment provisioning time 60% for AWS-bound energy workloads.</w:t>
-      </w:r>
-    </w:p>
-    <w:p>
-      <w:pPr>
-        <w:spacing w:after="20"/>
-      </w:pPr>
-      <w:r>
-        <w:rPr>
-          <w:rFonts w:ascii="Times New Roman" w:cs="Times New Roman" w:eastAsia="Times New Roman" w:hAnsi="Times New Roman"/>
-          <w:sz w:val="22"/>
-          <w:szCs w:val="22"/>
-        </w:rPr>
-        <w:t xml:space="preserve">• Engineered Kubernetes operations (health checks, readiness probes, auto-scaling) with Oracle and MySQL on AWS for fault-tolerant exchange of energy data at 10K+ daily transaction volume.</w:t>
-      </w:r>
-    </w:p>
-    <w:p>
-      <w:pPr>
-        <w:spacing w:after="20"/>
-      </w:pPr>
-      <w:r>
-        <w:rPr>
-          <w:rFonts w:ascii="Times New Roman" w:cs="Times New Roman" w:eastAsia="Times New Roman" w:hAnsi="Times New Roman"/>
-          <w:sz w:val="22"/>
-          <w:szCs w:val="22"/>
-        </w:rPr>
-        <w:t xml:space="preserve">• Hardened REST contracts and integration documentation for interfaces supporting 500+ users and high-volume field reporting across upstream/downstream systems.</w:t>
+        <w:t xml:space="preserve">• Collaborated on Java 11, Spring Boot, and Spring Data JPA services for oil and gas portfolio and asset tracking for 500+ users and high daily transaction volume.</w:t>
+      </w:r>
+    </w:p>
+    <w:p>
+      <w:pPr>
+        <w:spacing w:after="20"/>
+      </w:pPr>
+      <w:r>
+        <w:rPr>
+          <w:rFonts w:ascii="Times New Roman" w:cs="Times New Roman" w:eastAsia="Times New Roman" w:hAnsi="Times New Roman"/>
+          <w:sz w:val="22"/>
+          <w:szCs w:val="22"/>
+        </w:rPr>
+        <w:t xml:space="preserve">• Built React dashboards (HTML5, CSS3, JavaScript) on Spring Boot REST APIs; reduced reporting runtime by ~40% for field and office production decisions.</w:t>
+      </w:r>
+    </w:p>
+    <w:p>
+      <w:pPr>
+        <w:spacing w:after="20"/>
+      </w:pPr>
+      <w:r>
+        <w:rPr>
+          <w:rFonts w:ascii="Times New Roman" w:cs="Times New Roman" w:eastAsia="Times New Roman" w:hAnsi="Times New Roman"/>
+          <w:sz w:val="22"/>
+          <w:szCs w:val="22"/>
+        </w:rPr>
+        <w:t xml:space="preserve">• Supported Terraform and Jenkins infrastructure-as-code pipelines; reduced environment provisioning effort by ~25% for AWS-bound workloads.</w:t>
+      </w:r>
+    </w:p>
+    <w:p>
+      <w:pPr>
+        <w:spacing w:after="20"/>
+      </w:pPr>
+      <w:r>
+        <w:rPr>
+          <w:rFonts w:ascii="Times New Roman" w:cs="Times New Roman" w:eastAsia="Times New Roman" w:hAnsi="Times New Roman"/>
+          <w:sz w:val="22"/>
+          <w:szCs w:val="22"/>
+        </w:rPr>
+        <w:t xml:space="preserve">• Participated in Kubernetes operations (health checks, readiness probes, auto-scaling) with Oracle and MySQL on AWS for resilient energy data exchange.</w:t>
+      </w:r>
+    </w:p>
+    <w:p>
+      <w:pPr>
+        <w:spacing w:after="20"/>
+      </w:pPr>
+      <w:r>
+        <w:rPr>
+          <w:rFonts w:ascii="Times New Roman" w:cs="Times New Roman" w:eastAsia="Times New Roman" w:hAnsi="Times New Roman"/>
+          <w:sz w:val="22"/>
+          <w:szCs w:val="22"/>
+        </w:rPr>
+        <w:t xml:space="preserve">• Enhanced REST contracts and integration documentation for interfaces supporting high-volume field reporting across upstream/downstream systems.</w:t>
       </w:r>
     </w:p>
     <w:p>
@@ -468,7 +468,7 @@
           <w:sz w:val="22"/>
           <w:szCs w:val="22"/>
         </w:rPr>
-        <w:t xml:space="preserve">• Optimized regression safety with JUnit and Mockito on services underpinning 10K+ daily production and asset transactions before each production deploy.</w:t>
+        <w:t xml:space="preserve">• Extended regression safety with JUnit and Mockito before production deployments on production-critical services.</w:t>
       </w:r>
     </w:p>
     <w:p>
@@ -509,59 +509,72 @@
           <w:sz w:val="22"/>
           <w:szCs w:val="22"/>
         </w:rPr>
-        <w:t xml:space="preserve">• Architected distributed Java and Spring Boot REST services on Oracle and PostgreSQL for automotive manufacturing and supply-chain analytics across plants, dealers, and logistics networks.</w:t>
-      </w:r>
-    </w:p>
-    <w:p>
-      <w:pPr>
-        <w:spacing w:after="20"/>
-      </w:pPr>
-      <w:r>
-        <w:rPr>
-          <w:rFonts w:ascii="Times New Roman" w:cs="Times New Roman" w:eastAsia="Times New Roman" w:hAnsi="Times New Roman"/>
-          <w:sz w:val="22"/>
-          <w:szCs w:val="22"/>
-        </w:rPr>
-        <w:t xml:space="preserve">• Optimized SQL and indexing for 30% faster queries, reducing dashboard latency for 100+ manufacturing, dealer, and logistics users on high-throughput analytics.</w:t>
-      </w:r>
-    </w:p>
-    <w:p>
-      <w:pPr>
-        <w:spacing w:after="20"/>
-      </w:pPr>
-      <w:r>
-        <w:rPr>
-          <w:rFonts w:ascii="Times New Roman" w:cs="Times New Roman" w:eastAsia="Times New Roman" w:hAnsi="Times New Roman"/>
-          <w:sz w:val="22"/>
-          <w:szCs w:val="22"/>
-        </w:rPr>
-        <w:t xml:space="preserve">• Engineered resilient ETL from three core sources—vehicle production, dealer systems, and logistics—into analytics stores for batch and near-real-time, event-style reporting.</w:t>
-      </w:r>
-    </w:p>
-    <w:p>
-      <w:pPr>
-        <w:spacing w:after="20"/>
-      </w:pPr>
-      <w:r>
-        <w:rPr>
-          <w:rFonts w:ascii="Times New Roman" w:cs="Times New Roman" w:eastAsia="Times New Roman" w:hAnsi="Times New Roman"/>
-          <w:sz w:val="22"/>
-          <w:szCs w:val="22"/>
-        </w:rPr>
-        <w:t xml:space="preserve">• Delivered contract-first REST layers with stable JSON and fault-tolerant error semantics for JavaScript KPI dashboards under concurrent analytics load.</w:t>
-      </w:r>
-    </w:p>
-    <w:p>
-      <w:pPr>
-        <w:spacing w:after="20"/>
-      </w:pPr>
-      <w:r>
-        <w:rPr>
-          <w:rFonts w:ascii="Times New Roman" w:cs="Times New Roman" w:eastAsia="Times New Roman" w:hAnsi="Times New Roman"/>
-          <w:sz w:val="22"/>
-          <w:szCs w:val="22"/>
-        </w:rPr>
-        <w:t xml:space="preserve">• Implemented Java validation and reconciliation across plant and dealer feeds, improving downstream reporting reliability for analytics consumed by 100+ business users.</w:t>
+        <w:t xml:space="preserve">• Collaborated on Java and Spring Boot REST services on Oracle and PostgreSQL for automotive manufacturing and supply-chain analytics across plants, dealers, and logistics.</w:t>
+      </w:r>
+    </w:p>
+    <w:p>
+      <w:pPr>
+        <w:spacing w:after="20"/>
+      </w:pPr>
+      <w:r>
+        <w:rPr>
+          <w:rFonts w:ascii="Times New Roman" w:cs="Times New Roman" w:eastAsia="Times New Roman" w:hAnsi="Times New Roman"/>
+          <w:sz w:val="22"/>
+          <w:szCs w:val="22"/>
+        </w:rPr>
+        <w:t xml:space="preserve">• Improved SQL and indexing for ~20% faster queries, reducing dashboard latency for 100+ manufacturing, dealer, and logistics users.</w:t>
+      </w:r>
+    </w:p>
+    <w:p>
+      <w:pPr>
+        <w:spacing w:after="20"/>
+      </w:pPr>
+      <w:r>
+        <w:rPr>
+          <w:rFonts w:ascii="Times New Roman" w:cs="Times New Roman" w:eastAsia="Times New Roman" w:hAnsi="Times New Roman"/>
+          <w:sz w:val="22"/>
+          <w:szCs w:val="22"/>
+        </w:rPr>
+        <w:t xml:space="preserve">• Supported ETL from vehicle production, dealer systems, and logistics into analytics stores for batch and near-real-time reporting.</w:t>
+      </w:r>
+    </w:p>
+    <w:p>
+      <w:pPr>
+        <w:spacing w:after="20"/>
+      </w:pPr>
+      <w:r>
+        <w:rPr>
+          <w:rFonts w:ascii="Times New Roman" w:cs="Times New Roman" w:eastAsia="Times New Roman" w:hAnsi="Times New Roman"/>
+          <w:sz w:val="22"/>
+          <w:szCs w:val="22"/>
+        </w:rPr>
+        <w:t xml:space="preserve">• Delivered contract-first REST layers with stable JSON for JavaScript KPI dashboards under concurrent load.</w:t>
+      </w:r>
+    </w:p>
+    <w:p>
+      <w:pPr>
+        <w:spacing w:after="20"/>
+      </w:pPr>
+      <w:r>
+        <w:rPr>
+          <w:rFonts w:ascii="Times New Roman" w:cs="Times New Roman" w:eastAsia="Times New Roman" w:hAnsi="Times New Roman"/>
+          <w:sz w:val="22"/>
+          <w:szCs w:val="22"/>
+        </w:rPr>
+        <w:t xml:space="preserve">• Implemented validation and reconciliation across plant and dealer feeds, improving downstream reporting reliability for 100+ business users.</w:t>
+      </w:r>
+    </w:p>
+    <w:p>
+      <w:pPr>
+        <w:spacing w:after="20"/>
+      </w:pPr>
+      <w:r>
+        <w:rPr>
+          <w:rFonts w:ascii="Times New Roman" w:cs="Times New Roman" w:eastAsia="Times New Roman" w:hAnsi="Times New Roman"/>
+          <w:sz w:val="22"/>
+          <w:szCs w:val="22"/>
+        </w:rPr>
+        <w:t xml:space="preserve">• Supported Jenkins CI/CD pipelines and coordinated deployments across lower environments while enforcing automated testing and release validation.</w:t>
       </w:r>
     </w:p>
     <w:p>
@@ -574,7 +587,7 @@
           <w:sz w:val="22"/>
           <w:szCs w:val="22"/>
         </w:rPr>
-        <w:t xml:space="preserve">• Led a 12-month Agile cadence with analysts and QA, shipping increments with automated JUnit regression prior to each production analytics release.</w:t>
+        <w:t xml:space="preserve">• Participated in Agile delivery with analysts and QA, using JUnit regression prior to production releases.</w:t>
       </w:r>
     </w:p>
     <w:p>
@@ -615,59 +628,59 @@
           <w:sz w:val="22"/>
           <w:szCs w:val="22"/>
         </w:rPr>
-        <w:t xml:space="preserve">• Architected Spring Boot and Node.js REST services for production monitoring and ERP integration on Oracle and PostgreSQL—compliance-bound services in a regulated, distributed pharma environment.</w:t>
-      </w:r>
-    </w:p>
-    <w:p>
-      <w:pPr>
-        <w:spacing w:after="20"/>
-      </w:pPr>
-      <w:r>
-        <w:rPr>
-          <w:rFonts w:ascii="Times New Roman" w:cs="Times New Roman" w:eastAsia="Times New Roman" w:hAnsi="Times New Roman"/>
-          <w:sz w:val="22"/>
-          <w:szCs w:val="22"/>
-        </w:rPr>
-        <w:t xml:space="preserve">• Spearheaded AngularJS and React dashboards (HTML5, CSS3, JavaScript) on secure APIs, cutting manual laboratory, QC, and inventory entry 70% and accelerating quality review cycles.</w:t>
-      </w:r>
-    </w:p>
-    <w:p>
-      <w:pPr>
-        <w:spacing w:after="20"/>
-      </w:pPr>
-      <w:r>
-        <w:rPr>
-          <w:rFonts w:ascii="Times New Roman" w:cs="Times New Roman" w:eastAsia="Times New Roman" w:hAnsi="Times New Roman"/>
-          <w:sz w:val="22"/>
-          <w:szCs w:val="22"/>
-        </w:rPr>
-        <w:t xml:space="preserve">• Engineered ETL consolidating lab, QC, and inventory data into validated reporting models; delivered SQL compliance reports aligned to GxP-style controls across three regulated functional streams.</w:t>
-      </w:r>
-    </w:p>
-    <w:p>
-      <w:pPr>
-        <w:spacing w:after="20"/>
-      </w:pPr>
-      <w:r>
-        <w:rPr>
-          <w:rFonts w:ascii="Times New Roman" w:cs="Times New Roman" w:eastAsia="Times New Roman" w:hAnsi="Times New Roman"/>
-          <w:sz w:val="22"/>
-          <w:szCs w:val="22"/>
-        </w:rPr>
-        <w:t xml:space="preserve">• Implemented RBAC-aware validation, audit trails, and reporting pipelines so manufacturing and quality could trace lineage across distributed sites after the 70% automation gain.</w:t>
-      </w:r>
-    </w:p>
-    <w:p>
-      <w:pPr>
-        <w:spacing w:after="20"/>
-      </w:pPr>
-      <w:r>
-        <w:rPr>
-          <w:rFonts w:ascii="Times New Roman" w:cs="Times New Roman" w:eastAsia="Times New Roman" w:hAnsi="Times New Roman"/>
-          <w:sz w:val="22"/>
-          <w:szCs w:val="22"/>
-        </w:rPr>
-        <w:t xml:space="preserve">• Led Jenkins and Maven CI/CD with mandatory JUnit gates on compliance-critical builds before promotion to controlled environments.</w:t>
+        <w:t xml:space="preserve">• Collaborated on Spring Boot and Node.js REST services for production monitoring and ERP integration on Oracle and PostgreSQL in a regulated pharma environment.</w:t>
+      </w:r>
+    </w:p>
+    <w:p>
+      <w:pPr>
+        <w:spacing w:after="20"/>
+      </w:pPr>
+      <w:r>
+        <w:rPr>
+          <w:rFonts w:ascii="Times New Roman" w:cs="Times New Roman" w:eastAsia="Times New Roman" w:hAnsi="Times New Roman"/>
+          <w:sz w:val="22"/>
+          <w:szCs w:val="22"/>
+        </w:rPr>
+        <w:t xml:space="preserve">• Supported AngularJS and React dashboards (HTML5, CSS3, JavaScript) on secure APIs; reduced manual laboratory, QC, and inventory entry effort by ~40% and accelerated quality reviews.</w:t>
+      </w:r>
+    </w:p>
+    <w:p>
+      <w:pPr>
+        <w:spacing w:after="20"/>
+      </w:pPr>
+      <w:r>
+        <w:rPr>
+          <w:rFonts w:ascii="Times New Roman" w:cs="Times New Roman" w:eastAsia="Times New Roman" w:hAnsi="Times New Roman"/>
+          <w:sz w:val="22"/>
+          <w:szCs w:val="22"/>
+        </w:rPr>
+        <w:t xml:space="preserve">• Extended ETL consolidating lab, QC, and inventory data into validated reporting models; delivered SQL compliance reports aligned to GxP-style controls.</w:t>
+      </w:r>
+    </w:p>
+    <w:p>
+      <w:pPr>
+        <w:spacing w:after="20"/>
+      </w:pPr>
+      <w:r>
+        <w:rPr>
+          <w:rFonts w:ascii="Times New Roman" w:cs="Times New Roman" w:eastAsia="Times New Roman" w:hAnsi="Times New Roman"/>
+          <w:sz w:val="22"/>
+          <w:szCs w:val="22"/>
+        </w:rPr>
+        <w:t xml:space="preserve">• Implemented RBAC-aware validation, audit trails, and reporting pipelines for traceability across distributed manufacturing and quality sites.</w:t>
+      </w:r>
+    </w:p>
+    <w:p>
+      <w:pPr>
+        <w:spacing w:after="20"/>
+      </w:pPr>
+      <w:r>
+        <w:rPr>
+          <w:rFonts w:ascii="Times New Roman" w:cs="Times New Roman" w:eastAsia="Times New Roman" w:hAnsi="Times New Roman"/>
+          <w:sz w:val="22"/>
+          <w:szCs w:val="22"/>
+        </w:rPr>
+        <w:t xml:space="preserve">• Coordinated Jenkins and Maven CI/CD with mandatory JUnit gates on compliance-critical builds before promotion to controlled environments.</w:t>
       </w:r>
     </w:p>
     <w:p>
@@ -680,7 +693,7 @@
           <w:sz w:val="22"/>
           <w:szCs w:val="22"/>
         </w:rPr>
-        <w:t xml:space="preserve">• Delivered 24 months of incremental, audit-friendly releases with operations and quality—stabilizing regulated reporting and ERP integration cadence.</w:t>
+        <w:t xml:space="preserve">• Participated in incremental, audit-friendly releases with operations and quality over 24 months, stabilizing regulated reporting and ERP integration.</w:t>
       </w:r>
     </w:p>
     <w:p>
@@ -783,7 +796,7 @@
           <w:sz w:val="22"/>
           <w:szCs w:val="22"/>
         </w:rPr>
-        <w:t xml:space="preserve">HashiCorp Certified: Terraform Associate</w:t>
+        <w:t xml:space="preserve">HashiCorp Terraform Associate</w:t>
       </w:r>
       <w:r>
         <w:rPr>
@@ -845,7 +858,7 @@
           <w:sz w:val="22"/>
           <w:szCs w:val="22"/>
         </w:rPr>
-        <w:t xml:space="preserve">Grade: 3.45/5. Coursework: Information Systems Management, Database Systems, Cloud Computing.</w:t>
+        <w:t xml:space="preserve">2022 – 2024. Grade: 3.45/5. Coursework: Information Systems Management, Database Systems, Cloud Computing.</w:t>
       </w:r>
     </w:p>
     <w:p>
@@ -981,7 +994,7 @@
           <w:sz w:val="22"/>
           <w:szCs w:val="22"/>
         </w:rPr>
-        <w:t xml:space="preserve">• Delivered REST APIs for orders and inventory sync; React admin UI that cut manual operations 60%.</w:t>
+        <w:t xml:space="preserve">• Delivered REST APIs for orders and inventory sync; React admin UI that reduced manual operations by ~40%.</w:t>
       </w:r>
     </w:p>
     <w:p>

</xml_diff>

<commit_message>
Resume: enterprise summary, Languages line, Oracle cert, drop Key Projects
- Lead with 6+ years delivering enterprise web platforms; summary includes Java 17, certifications, AI tools closing line
- Technical skills: Languages Java/Java 17/TypeScript/JavaScript/SQL; frontend trims duplicate JavaScript
- Certifications: add Oracle Java SE Professional (In Progress)
- Remove KEY PROJECTS from full-time/C2C data, PDF, DOCX, and plaintext resume
- Portfolio data + About; PDF cache v=29

Co-authored-by: Cursor <cursoragent@cursor.com>
</commit_message>
<xml_diff>
--- a/public/Java_FullStack_FullTime_Resume.docx
+++ b/public/Java_FullStack_FullTime_Resume.docx
@@ -88,7 +88,7 @@
           <w:sz w:val="22"/>
           <w:szCs w:val="22"/>
         </w:rPr>
-        <w:t xml:space="preserve">Java Full Stack Engineer with 6+ years of professional experience:</w:t>
+        <w:t xml:space="preserve">Java Full Stack Engineer with 6+ years delivering enterprise web platforms:</w:t>
       </w:r>
     </w:p>
     <w:p>
@@ -101,7 +101,7 @@
           <w:sz w:val="22"/>
           <w:szCs w:val="22"/>
         </w:rPr>
-        <w:t xml:space="preserve">Cloud-native architecture and distributed systems for retail/restaurant POS, insurance and retirement, energy, automotive supply chain, and pharma compliance. Delivers Java/Spring Boot microservices, REST APIs, React and Angular, AWS, Docker, Kubernetes, Jenkins/Bitbucket CI/CD, DevSecOps practices, and observability. Familiar with AI-assisted developer tools including GitHub Copilot and Cursor AI for development acceleration and documentation support.</w:t>
+        <w:t xml:space="preserve">Hands-on with Java 17, Spring Boot microservices, REST APIs, React, Angular, AWS, Docker, Kubernetes, Jenkins/Bitbucket CI/CD, DevSecOps, and observability. Certifications: AWS Certified DevOps Engineer – Professional, AWS Certified Solutions Architect – Associate, HashiCorp Terraform Associate; Oracle Certified Professional Java SE Developer (In Progress). Delivers cloud-native solutions for retail/restaurant POS, insurance and retirement, energy, automotive supply chain, and pharma compliance. Familiar with AI-assisted developer tools including GitHub Copilot and Cursor AI for development acceleration and documentation support.</w:t>
       </w:r>
     </w:p>
     <w:p>
@@ -132,7 +132,7 @@
           <w:sz w:val="22"/>
           <w:szCs w:val="22"/>
         </w:rPr>
-        <w:t xml:space="preserve">Backend: Java, Java 17, Spring Boot, microservices, REST APIs, Spring Security (OAuth2, JWT, RBAC), Hibernate/JPA | Frontend: React, Angular, HTML5, CSS3, JavaScript | Cloud &amp; DevOps: AWS (EC2, S3, RDS, Lambda, ECS), Docker, Kubernetes, Jenkins, Bitbucket, CI/CD, DevSecOps, Terraform, infrastructure as code | Event-driven architecture &amp; messaging: Kafka, RabbitMQ, Redis | Databases: Oracle, MySQL, PostgreSQL, MongoDB | Quality &amp; observability: JUnit, Mockito, Prometheus, Grafana</w:t>
+        <w:t xml:space="preserve">Languages: Java, Java 17, TypeScript, JavaScript, SQL | Backend: Spring Boot, microservices, REST APIs, Spring Security (OAuth2, JWT, RBAC), Hibernate/JPA | Frontend: React, Angular, HTML5, CSS3 | Cloud &amp; DevOps: AWS (EC2, S3, RDS, Lambda, ECS), Docker, Kubernetes, Jenkins, Bitbucket, CI/CD, DevSecOps, Terraform, infrastructure as code | Event-driven architecture &amp; messaging: Kafka, RabbitMQ, Redis | Databases: Oracle, MySQL, PostgreSQL, MongoDB | Quality &amp; observability: JUnit, Mockito, Prometheus, Grafana</w:t>
       </w:r>
     </w:p>
     <w:p>
@@ -778,6 +778,37 @@
     </w:p>
     <w:p>
       <w:pPr>
+        <w:spacing w:after="60"/>
+      </w:pPr>
+      <w:r>
+        <w:rPr>
+          <w:rFonts w:ascii="Times New Roman" w:cs="Times New Roman" w:eastAsia="Times New Roman" w:hAnsi="Times New Roman"/>
+          <w:sz w:val="22"/>
+          <w:szCs w:val="22"/>
+        </w:rPr>
+        <w:t xml:space="preserve">• </w:t>
+      </w:r>
+      <w:r>
+        <w:rPr>
+          <w:rFonts w:ascii="Times New Roman" w:cs="Times New Roman" w:eastAsia="Times New Roman" w:hAnsi="Times New Roman"/>
+          <w:b/>
+          <w:bCs/>
+          <w:sz w:val="22"/>
+          <w:szCs w:val="22"/>
+        </w:rPr>
+        <w:t xml:space="preserve">HashiCorp Terraform Associate</w:t>
+      </w:r>
+      <w:r>
+        <w:rPr>
+          <w:rFonts w:ascii="Times New Roman" w:cs="Times New Roman" w:eastAsia="Times New Roman" w:hAnsi="Times New Roman"/>
+          <w:sz w:val="22"/>
+          <w:szCs w:val="22"/>
+        </w:rPr>
+        <w:t xml:space="preserve"> (March 2025 – March 2027)</w:t>
+      </w:r>
+    </w:p>
+    <w:p>
+      <w:pPr>
         <w:spacing w:after="120"/>
       </w:pPr>
       <w:r>
@@ -796,15 +827,15 @@
           <w:sz w:val="22"/>
           <w:szCs w:val="22"/>
         </w:rPr>
-        <w:t xml:space="preserve">HashiCorp Terraform Associate</w:t>
-      </w:r>
-      <w:r>
-        <w:rPr>
-          <w:rFonts w:ascii="Times New Roman" w:cs="Times New Roman" w:eastAsia="Times New Roman" w:hAnsi="Times New Roman"/>
-          <w:sz w:val="22"/>
-          <w:szCs w:val="22"/>
-        </w:rPr>
-        <w:t xml:space="preserve"> (March 2025 – March 2027)</w:t>
+        <w:t xml:space="preserve">Oracle Certified Professional Java SE Developer</w:t>
+      </w:r>
+      <w:r>
+        <w:rPr>
+          <w:rFonts w:ascii="Times New Roman" w:cs="Times New Roman" w:eastAsia="Times New Roman" w:hAnsi="Times New Roman"/>
+          <w:sz w:val="22"/>
+          <w:szCs w:val="22"/>
+        </w:rPr>
+        <w:t xml:space="preserve"> (In Progress)</w:t>
       </w:r>
     </w:p>
     <w:p>
@@ -895,147 +926,6 @@
           <w:szCs w:val="22"/>
         </w:rPr>
         <w:t xml:space="preserve">Grade: 7.2/10. Coursework: Communication Systems, Embedded Systems, Computer Engineering.</w:t>
-      </w:r>
-    </w:p>
-    <w:p>
-      <w:pPr>
-        <w:pBdr>
-          <w:bottom w:val="single" w:color="000000" w:sz="6" w:space="1"/>
-        </w:pBdr>
-        <w:spacing w:after="80" w:before="120"/>
-      </w:pPr>
-      <w:r>
-        <w:rPr>
-          <w:rFonts w:ascii="Times New Roman" w:cs="Times New Roman" w:eastAsia="Times New Roman" w:hAnsi="Times New Roman"/>
-          <w:b/>
-          <w:bCs/>
-          <w:sz w:val="24"/>
-          <w:szCs w:val="24"/>
-        </w:rPr>
-        <w:t xml:space="preserve">KEY PROJECTS</w:t>
-      </w:r>
-    </w:p>
-    <w:p>
-      <w:pPr>
-        <w:spacing w:after="20"/>
-      </w:pPr>
-      <w:r>
-        <w:rPr>
-          <w:rFonts w:ascii="Times New Roman" w:cs="Times New Roman" w:eastAsia="Times New Roman" w:hAnsi="Times New Roman"/>
-          <w:b/>
-          <w:bCs/>
-          <w:sz w:val="22"/>
-          <w:szCs w:val="22"/>
-        </w:rPr>
-        <w:t xml:space="preserve">Retirement Investment Management Platform</w:t>
-      </w:r>
-    </w:p>
-    <w:p>
-      <w:pPr>
-        <w:spacing w:after="20"/>
-      </w:pPr>
-      <w:r>
-        <w:rPr>
-          <w:rFonts w:ascii="Times New Roman" w:cs="Times New Roman" w:eastAsia="Times New Roman" w:hAnsi="Times New Roman"/>
-          <w:sz w:val="22"/>
-          <w:szCs w:val="22"/>
-        </w:rPr>
-        <w:t xml:space="preserve">• Delivered a cloud-native retirement and portfolio stack: Spring Boot, JWT with RBAC, React on AWS and Docker.</w:t>
-      </w:r>
-    </w:p>
-    <w:p>
-      <w:pPr>
-        <w:spacing w:after="60"/>
-      </w:pPr>
-      <w:r>
-        <w:rPr>
-          <w:rFonts w:ascii="Times New Roman" w:cs="Times New Roman" w:eastAsia="Times New Roman" w:hAnsi="Times New Roman"/>
-          <w:sz w:val="22"/>
-          <w:szCs w:val="22"/>
-        </w:rPr>
-        <w:t xml:space="preserve">• Engineered REST APIs for authentication and portfolio tracking; PostgreSQL and Redis for persistence and sessions.</w:t>
-      </w:r>
-    </w:p>
-    <w:p>
-      <w:pPr>
-        <w:spacing w:after="20"/>
-      </w:pPr>
-      <w:r>
-        <w:rPr>
-          <w:rFonts w:ascii="Times New Roman" w:cs="Times New Roman" w:eastAsia="Times New Roman" w:hAnsi="Times New Roman"/>
-          <w:b/>
-          <w:bCs/>
-          <w:sz w:val="22"/>
-          <w:szCs w:val="22"/>
-        </w:rPr>
-        <w:t xml:space="preserve">Smart Restaurant Platform</w:t>
-      </w:r>
-    </w:p>
-    <w:p>
-      <w:pPr>
-        <w:spacing w:after="20"/>
-      </w:pPr>
-      <w:r>
-        <w:rPr>
-          <w:rFonts w:ascii="Times New Roman" w:cs="Times New Roman" w:eastAsia="Times New Roman" w:hAnsi="Times New Roman"/>
-          <w:sz w:val="22"/>
-          <w:szCs w:val="22"/>
-        </w:rPr>
-        <w:t xml:space="preserve">• Built Spring Boot, React, and MySQL flows for menus, orders, inventory, and sales analytics.</w:t>
-      </w:r>
-    </w:p>
-    <w:p>
-      <w:pPr>
-        <w:spacing w:after="60"/>
-      </w:pPr>
-      <w:r>
-        <w:rPr>
-          <w:rFonts w:ascii="Times New Roman" w:cs="Times New Roman" w:eastAsia="Times New Roman" w:hAnsi="Times New Roman"/>
-          <w:sz w:val="22"/>
-          <w:szCs w:val="22"/>
-        </w:rPr>
-        <w:t xml:space="preserve">• Delivered REST APIs for orders and inventory sync; React admin UI that reduced manual operations by ~40%.</w:t>
-      </w:r>
-    </w:p>
-    <w:p>
-      <w:pPr>
-        <w:spacing w:after="20"/>
-      </w:pPr>
-      <w:r>
-        <w:rPr>
-          <w:rFonts w:ascii="Times New Roman" w:cs="Times New Roman" w:eastAsia="Times New Roman" w:hAnsi="Times New Roman"/>
-          <w:b/>
-          <w:bCs/>
-          <w:sz w:val="22"/>
-          <w:szCs w:val="22"/>
-        </w:rPr>
-        <w:t xml:space="preserve">User Management Service</w:t>
-      </w:r>
-    </w:p>
-    <w:p>
-      <w:pPr>
-        <w:spacing w:after="20"/>
-      </w:pPr>
-      <w:r>
-        <w:rPr>
-          <w:rFonts w:ascii="Times New Roman" w:cs="Times New Roman" w:eastAsia="Times New Roman" w:hAnsi="Times New Roman"/>
-          <w:sz w:val="22"/>
-          <w:szCs w:val="22"/>
-        </w:rPr>
-        <w:t xml:space="preserve">• Implemented Spring Boot, JPA, and H2 with JWT authentication and RBAC using Spring Security.</w:t>
-      </w:r>
-    </w:p>
-    <w:p>
-      <w:pPr>
-        <w:spacing w:after="60"/>
-      </w:pPr>
-      <w:r>
-        <w:rPr>
-          <w:rFonts w:ascii="Times New Roman" w:cs="Times New Roman" w:eastAsia="Times New Roman" w:hAnsi="Times New Roman"/>
-          <w:sz w:val="22"/>
-          <w:szCs w:val="22"/>
-        </w:rPr>
-        <w:t xml:space="preserve">• Delivered registration, login, profile, and audit logging endpoints.</w:t>
       </w:r>
     </w:p>
     <w:sectPr>

</xml_diff>

<commit_message>
Resume output: enterprise ATS styling (navy #1F3A5F, Helvetica PDF, Calibri DOCX)
- PDF: white/black body, navy name/section headers/divider rules; Helvetica
- DOCX: Calibri, navy section titles and rules, navy name
- Profile lead: 6+ years of experience delivering enterprise web platforms
- Regenerate artifacts; PDF cache buster v=30

Co-authored-by: Cursor <cursoragent@cursor.com>
</commit_message>
<xml_diff>
--- a/public/Java_FullStack_FullTime_Resume.docx
+++ b/public/Java_FullStack_FullTime_Resume.docx
@@ -9,7 +9,8 @@
       </w:pPr>
       <w:r>
         <w:rPr>
-          <w:rFonts w:ascii="Times New Roman" w:cs="Times New Roman" w:eastAsia="Times New Roman" w:hAnsi="Times New Roman"/>
+          <w:rFonts w:ascii="Calibri" w:cs="Calibri" w:eastAsia="Calibri" w:hAnsi="Calibri"/>
+          <w:color w:val="000000"/>
           <w:sz w:val="22"/>
           <w:szCs w:val="22"/>
         </w:rPr>
@@ -23,9 +24,10 @@
       </w:pPr>
       <w:r>
         <w:rPr>
-          <w:rFonts w:ascii="Times New Roman" w:cs="Times New Roman" w:eastAsia="Times New Roman" w:hAnsi="Times New Roman"/>
-          <w:b/>
-          <w:bCs/>
+          <w:rFonts w:ascii="Calibri" w:cs="Calibri" w:eastAsia="Calibri" w:hAnsi="Calibri"/>
+          <w:b/>
+          <w:bCs/>
+          <w:color w:val="1F3A5F"/>
           <w:sz w:val="44"/>
           <w:szCs w:val="44"/>
         </w:rPr>
@@ -39,7 +41,8 @@
       </w:pPr>
       <w:r>
         <w:rPr>
-          <w:rFonts w:ascii="Times New Roman" w:cs="Times New Roman" w:eastAsia="Times New Roman" w:hAnsi="Times New Roman"/>
+          <w:rFonts w:ascii="Calibri" w:cs="Calibri" w:eastAsia="Calibri" w:hAnsi="Calibri"/>
+          <w:color w:val="000000"/>
           <w:sz w:val="24"/>
           <w:szCs w:val="24"/>
         </w:rPr>
@@ -53,7 +56,8 @@
       </w:pPr>
       <w:r>
         <w:rPr>
-          <w:rFonts w:ascii="Times New Roman" w:cs="Times New Roman" w:eastAsia="Times New Roman" w:hAnsi="Times New Roman"/>
+          <w:rFonts w:ascii="Calibri" w:cs="Calibri" w:eastAsia="Calibri" w:hAnsi="Calibri"/>
+          <w:color w:val="000000"/>
           <w:sz w:val="22"/>
           <w:szCs w:val="22"/>
         </w:rPr>
@@ -63,15 +67,16 @@
     <w:p>
       <w:pPr>
         <w:pBdr>
-          <w:bottom w:val="single" w:color="000000" w:sz="6" w:space="1"/>
+          <w:bottom w:val="single" w:color="1F3A5F" w:sz="6" w:space="1"/>
         </w:pBdr>
         <w:spacing w:after="80" w:before="120"/>
       </w:pPr>
       <w:r>
         <w:rPr>
-          <w:rFonts w:ascii="Times New Roman" w:cs="Times New Roman" w:eastAsia="Times New Roman" w:hAnsi="Times New Roman"/>
-          <w:b/>
-          <w:bCs/>
+          <w:rFonts w:ascii="Calibri" w:cs="Calibri" w:eastAsia="Calibri" w:hAnsi="Calibri"/>
+          <w:b/>
+          <w:bCs/>
+          <w:color w:val="1F3A5F"/>
           <w:sz w:val="24"/>
           <w:szCs w:val="24"/>
         </w:rPr>
@@ -84,11 +89,12 @@
       </w:pPr>
       <w:r>
         <w:rPr>
-          <w:rFonts w:ascii="Times New Roman" w:cs="Times New Roman" w:eastAsia="Times New Roman" w:hAnsi="Times New Roman"/>
-          <w:sz w:val="22"/>
-          <w:szCs w:val="22"/>
-        </w:rPr>
-        <w:t xml:space="preserve">Java Full Stack Engineer with 6+ years delivering enterprise web platforms:</w:t>
+          <w:rFonts w:ascii="Calibri" w:cs="Calibri" w:eastAsia="Calibri" w:hAnsi="Calibri"/>
+          <w:color w:val="000000"/>
+          <w:sz w:val="22"/>
+          <w:szCs w:val="22"/>
+        </w:rPr>
+        <w:t xml:space="preserve">Java Full Stack Engineer with 6+ years of experience delivering enterprise web platforms:</w:t>
       </w:r>
     </w:p>
     <w:p>
@@ -97,7 +103,8 @@
       </w:pPr>
       <w:r>
         <w:rPr>
-          <w:rFonts w:ascii="Times New Roman" w:cs="Times New Roman" w:eastAsia="Times New Roman" w:hAnsi="Times New Roman"/>
+          <w:rFonts w:ascii="Calibri" w:cs="Calibri" w:eastAsia="Calibri" w:hAnsi="Calibri"/>
+          <w:color w:val="000000"/>
           <w:sz w:val="22"/>
           <w:szCs w:val="22"/>
         </w:rPr>
@@ -107,15 +114,16 @@
     <w:p>
       <w:pPr>
         <w:pBdr>
-          <w:bottom w:val="single" w:color="000000" w:sz="6" w:space="1"/>
+          <w:bottom w:val="single" w:color="1F3A5F" w:sz="6" w:space="1"/>
         </w:pBdr>
         <w:spacing w:after="80" w:before="120"/>
       </w:pPr>
       <w:r>
         <w:rPr>
-          <w:rFonts w:ascii="Times New Roman" w:cs="Times New Roman" w:eastAsia="Times New Roman" w:hAnsi="Times New Roman"/>
-          <w:b/>
-          <w:bCs/>
+          <w:rFonts w:ascii="Calibri" w:cs="Calibri" w:eastAsia="Calibri" w:hAnsi="Calibri"/>
+          <w:b/>
+          <w:bCs/>
+          <w:color w:val="1F3A5F"/>
           <w:sz w:val="24"/>
           <w:szCs w:val="24"/>
         </w:rPr>
@@ -128,7 +136,8 @@
       </w:pPr>
       <w:r>
         <w:rPr>
-          <w:rFonts w:ascii="Times New Roman" w:cs="Times New Roman" w:eastAsia="Times New Roman" w:hAnsi="Times New Roman"/>
+          <w:rFonts w:ascii="Calibri" w:cs="Calibri" w:eastAsia="Calibri" w:hAnsi="Calibri"/>
+          <w:color w:val="000000"/>
           <w:sz w:val="22"/>
           <w:szCs w:val="22"/>
         </w:rPr>
@@ -138,15 +147,16 @@
     <w:p>
       <w:pPr>
         <w:pBdr>
-          <w:bottom w:val="single" w:color="000000" w:sz="6" w:space="1"/>
+          <w:bottom w:val="single" w:color="1F3A5F" w:sz="6" w:space="1"/>
         </w:pBdr>
         <w:spacing w:after="80" w:before="120"/>
       </w:pPr>
       <w:r>
         <w:rPr>
-          <w:rFonts w:ascii="Times New Roman" w:cs="Times New Roman" w:eastAsia="Times New Roman" w:hAnsi="Times New Roman"/>
-          <w:b/>
-          <w:bCs/>
+          <w:rFonts w:ascii="Calibri" w:cs="Calibri" w:eastAsia="Calibri" w:hAnsi="Calibri"/>
+          <w:b/>
+          <w:bCs/>
+          <w:color w:val="1F3A5F"/>
           <w:sz w:val="24"/>
           <w:szCs w:val="24"/>
         </w:rPr>
@@ -159,9 +169,10 @@
       </w:pPr>
       <w:r>
         <w:rPr>
-          <w:rFonts w:ascii="Times New Roman" w:cs="Times New Roman" w:eastAsia="Times New Roman" w:hAnsi="Times New Roman"/>
-          <w:b/>
-          <w:bCs/>
+          <w:rFonts w:ascii="Calibri" w:cs="Calibri" w:eastAsia="Calibri" w:hAnsi="Calibri"/>
+          <w:b/>
+          <w:bCs/>
+          <w:color w:val="000000"/>
           <w:sz w:val="22"/>
           <w:szCs w:val="22"/>
         </w:rPr>
@@ -174,7 +185,8 @@
       </w:pPr>
       <w:r>
         <w:rPr>
-          <w:rFonts w:ascii="Times New Roman" w:cs="Times New Roman" w:eastAsia="Times New Roman" w:hAnsi="Times New Roman"/>
+          <w:rFonts w:ascii="Calibri" w:cs="Calibri" w:eastAsia="Calibri" w:hAnsi="Calibri"/>
+          <w:color w:val="000000"/>
           <w:sz w:val="22"/>
           <w:szCs w:val="22"/>
         </w:rPr>
@@ -187,7 +199,8 @@
       </w:pPr>
       <w:r>
         <w:rPr>
-          <w:rFonts w:ascii="Times New Roman" w:cs="Times New Roman" w:eastAsia="Times New Roman" w:hAnsi="Times New Roman"/>
+          <w:rFonts w:ascii="Calibri" w:cs="Calibri" w:eastAsia="Calibri" w:hAnsi="Calibri"/>
+          <w:color w:val="000000"/>
           <w:sz w:val="22"/>
           <w:szCs w:val="22"/>
         </w:rPr>
@@ -200,7 +213,8 @@
       </w:pPr>
       <w:r>
         <w:rPr>
-          <w:rFonts w:ascii="Times New Roman" w:cs="Times New Roman" w:eastAsia="Times New Roman" w:hAnsi="Times New Roman"/>
+          <w:rFonts w:ascii="Calibri" w:cs="Calibri" w:eastAsia="Calibri" w:hAnsi="Calibri"/>
+          <w:color w:val="000000"/>
           <w:sz w:val="22"/>
           <w:szCs w:val="22"/>
         </w:rPr>
@@ -213,7 +227,8 @@
       </w:pPr>
       <w:r>
         <w:rPr>
-          <w:rFonts w:ascii="Times New Roman" w:cs="Times New Roman" w:eastAsia="Times New Roman" w:hAnsi="Times New Roman"/>
+          <w:rFonts w:ascii="Calibri" w:cs="Calibri" w:eastAsia="Calibri" w:hAnsi="Calibri"/>
+          <w:color w:val="000000"/>
           <w:sz w:val="22"/>
           <w:szCs w:val="22"/>
         </w:rPr>
@@ -226,7 +241,8 @@
       </w:pPr>
       <w:r>
         <w:rPr>
-          <w:rFonts w:ascii="Times New Roman" w:cs="Times New Roman" w:eastAsia="Times New Roman" w:hAnsi="Times New Roman"/>
+          <w:rFonts w:ascii="Calibri" w:cs="Calibri" w:eastAsia="Calibri" w:hAnsi="Calibri"/>
+          <w:color w:val="000000"/>
           <w:sz w:val="22"/>
           <w:szCs w:val="22"/>
         </w:rPr>
@@ -239,7 +255,8 @@
       </w:pPr>
       <w:r>
         <w:rPr>
-          <w:rFonts w:ascii="Times New Roman" w:cs="Times New Roman" w:eastAsia="Times New Roman" w:hAnsi="Times New Roman"/>
+          <w:rFonts w:ascii="Calibri" w:cs="Calibri" w:eastAsia="Calibri" w:hAnsi="Calibri"/>
+          <w:color w:val="000000"/>
           <w:sz w:val="22"/>
           <w:szCs w:val="22"/>
         </w:rPr>
@@ -252,7 +269,8 @@
       </w:pPr>
       <w:r>
         <w:rPr>
-          <w:rFonts w:ascii="Times New Roman" w:cs="Times New Roman" w:eastAsia="Times New Roman" w:hAnsi="Times New Roman"/>
+          <w:rFonts w:ascii="Calibri" w:cs="Calibri" w:eastAsia="Calibri" w:hAnsi="Calibri"/>
+          <w:color w:val="000000"/>
           <w:sz w:val="22"/>
           <w:szCs w:val="22"/>
         </w:rPr>
@@ -265,9 +283,10 @@
       </w:pPr>
       <w:r>
         <w:rPr>
-          <w:rFonts w:ascii="Times New Roman" w:cs="Times New Roman" w:eastAsia="Times New Roman" w:hAnsi="Times New Roman"/>
-          <w:b/>
-          <w:bCs/>
+          <w:rFonts w:ascii="Calibri" w:cs="Calibri" w:eastAsia="Calibri" w:hAnsi="Calibri"/>
+          <w:b/>
+          <w:bCs/>
+          <w:color w:val="000000"/>
           <w:sz w:val="22"/>
           <w:szCs w:val="22"/>
         </w:rPr>
@@ -280,7 +299,8 @@
       </w:pPr>
       <w:r>
         <w:rPr>
-          <w:rFonts w:ascii="Times New Roman" w:cs="Times New Roman" w:eastAsia="Times New Roman" w:hAnsi="Times New Roman"/>
+          <w:rFonts w:ascii="Calibri" w:cs="Calibri" w:eastAsia="Calibri" w:hAnsi="Calibri"/>
+          <w:color w:val="000000"/>
           <w:sz w:val="22"/>
           <w:szCs w:val="22"/>
         </w:rPr>
@@ -293,7 +313,8 @@
       </w:pPr>
       <w:r>
         <w:rPr>
-          <w:rFonts w:ascii="Times New Roman" w:cs="Times New Roman" w:eastAsia="Times New Roman" w:hAnsi="Times New Roman"/>
+          <w:rFonts w:ascii="Calibri" w:cs="Calibri" w:eastAsia="Calibri" w:hAnsi="Calibri"/>
+          <w:color w:val="000000"/>
           <w:sz w:val="22"/>
           <w:szCs w:val="22"/>
         </w:rPr>
@@ -306,7 +327,8 @@
       </w:pPr>
       <w:r>
         <w:rPr>
-          <w:rFonts w:ascii="Times New Roman" w:cs="Times New Roman" w:eastAsia="Times New Roman" w:hAnsi="Times New Roman"/>
+          <w:rFonts w:ascii="Calibri" w:cs="Calibri" w:eastAsia="Calibri" w:hAnsi="Calibri"/>
+          <w:color w:val="000000"/>
           <w:sz w:val="22"/>
           <w:szCs w:val="22"/>
         </w:rPr>
@@ -319,7 +341,8 @@
       </w:pPr>
       <w:r>
         <w:rPr>
-          <w:rFonts w:ascii="Times New Roman" w:cs="Times New Roman" w:eastAsia="Times New Roman" w:hAnsi="Times New Roman"/>
+          <w:rFonts w:ascii="Calibri" w:cs="Calibri" w:eastAsia="Calibri" w:hAnsi="Calibri"/>
+          <w:color w:val="000000"/>
           <w:sz w:val="22"/>
           <w:szCs w:val="22"/>
         </w:rPr>
@@ -332,7 +355,8 @@
       </w:pPr>
       <w:r>
         <w:rPr>
-          <w:rFonts w:ascii="Times New Roman" w:cs="Times New Roman" w:eastAsia="Times New Roman" w:hAnsi="Times New Roman"/>
+          <w:rFonts w:ascii="Calibri" w:cs="Calibri" w:eastAsia="Calibri" w:hAnsi="Calibri"/>
+          <w:color w:val="000000"/>
           <w:sz w:val="22"/>
           <w:szCs w:val="22"/>
         </w:rPr>
@@ -345,7 +369,8 @@
       </w:pPr>
       <w:r>
         <w:rPr>
-          <w:rFonts w:ascii="Times New Roman" w:cs="Times New Roman" w:eastAsia="Times New Roman" w:hAnsi="Times New Roman"/>
+          <w:rFonts w:ascii="Calibri" w:cs="Calibri" w:eastAsia="Calibri" w:hAnsi="Calibri"/>
+          <w:color w:val="000000"/>
           <w:sz w:val="22"/>
           <w:szCs w:val="22"/>
         </w:rPr>
@@ -358,7 +383,8 @@
       </w:pPr>
       <w:r>
         <w:rPr>
-          <w:rFonts w:ascii="Times New Roman" w:cs="Times New Roman" w:eastAsia="Times New Roman" w:hAnsi="Times New Roman"/>
+          <w:rFonts w:ascii="Calibri" w:cs="Calibri" w:eastAsia="Calibri" w:hAnsi="Calibri"/>
+          <w:color w:val="000000"/>
           <w:sz w:val="22"/>
           <w:szCs w:val="22"/>
         </w:rPr>
@@ -371,9 +397,10 @@
       </w:pPr>
       <w:r>
         <w:rPr>
-          <w:rFonts w:ascii="Times New Roman" w:cs="Times New Roman" w:eastAsia="Times New Roman" w:hAnsi="Times New Roman"/>
-          <w:b/>
-          <w:bCs/>
+          <w:rFonts w:ascii="Calibri" w:cs="Calibri" w:eastAsia="Calibri" w:hAnsi="Calibri"/>
+          <w:b/>
+          <w:bCs/>
+          <w:color w:val="000000"/>
           <w:sz w:val="22"/>
           <w:szCs w:val="22"/>
         </w:rPr>
@@ -386,7 +413,8 @@
       </w:pPr>
       <w:r>
         <w:rPr>
-          <w:rFonts w:ascii="Times New Roman" w:cs="Times New Roman" w:eastAsia="Times New Roman" w:hAnsi="Times New Roman"/>
+          <w:rFonts w:ascii="Calibri" w:cs="Calibri" w:eastAsia="Calibri" w:hAnsi="Calibri"/>
+          <w:color w:val="000000"/>
           <w:sz w:val="22"/>
           <w:szCs w:val="22"/>
         </w:rPr>
@@ -399,7 +427,8 @@
       </w:pPr>
       <w:r>
         <w:rPr>
-          <w:rFonts w:ascii="Times New Roman" w:cs="Times New Roman" w:eastAsia="Times New Roman" w:hAnsi="Times New Roman"/>
+          <w:rFonts w:ascii="Calibri" w:cs="Calibri" w:eastAsia="Calibri" w:hAnsi="Calibri"/>
+          <w:color w:val="000000"/>
           <w:sz w:val="22"/>
           <w:szCs w:val="22"/>
         </w:rPr>
@@ -412,7 +441,8 @@
       </w:pPr>
       <w:r>
         <w:rPr>
-          <w:rFonts w:ascii="Times New Roman" w:cs="Times New Roman" w:eastAsia="Times New Roman" w:hAnsi="Times New Roman"/>
+          <w:rFonts w:ascii="Calibri" w:cs="Calibri" w:eastAsia="Calibri" w:hAnsi="Calibri"/>
+          <w:color w:val="000000"/>
           <w:sz w:val="22"/>
           <w:szCs w:val="22"/>
         </w:rPr>
@@ -425,7 +455,8 @@
       </w:pPr>
       <w:r>
         <w:rPr>
-          <w:rFonts w:ascii="Times New Roman" w:cs="Times New Roman" w:eastAsia="Times New Roman" w:hAnsi="Times New Roman"/>
+          <w:rFonts w:ascii="Calibri" w:cs="Calibri" w:eastAsia="Calibri" w:hAnsi="Calibri"/>
+          <w:color w:val="000000"/>
           <w:sz w:val="22"/>
           <w:szCs w:val="22"/>
         </w:rPr>
@@ -438,7 +469,8 @@
       </w:pPr>
       <w:r>
         <w:rPr>
-          <w:rFonts w:ascii="Times New Roman" w:cs="Times New Roman" w:eastAsia="Times New Roman" w:hAnsi="Times New Roman"/>
+          <w:rFonts w:ascii="Calibri" w:cs="Calibri" w:eastAsia="Calibri" w:hAnsi="Calibri"/>
+          <w:color w:val="000000"/>
           <w:sz w:val="22"/>
           <w:szCs w:val="22"/>
         </w:rPr>
@@ -451,7 +483,8 @@
       </w:pPr>
       <w:r>
         <w:rPr>
-          <w:rFonts w:ascii="Times New Roman" w:cs="Times New Roman" w:eastAsia="Times New Roman" w:hAnsi="Times New Roman"/>
+          <w:rFonts w:ascii="Calibri" w:cs="Calibri" w:eastAsia="Calibri" w:hAnsi="Calibri"/>
+          <w:color w:val="000000"/>
           <w:sz w:val="22"/>
           <w:szCs w:val="22"/>
         </w:rPr>
@@ -464,7 +497,8 @@
       </w:pPr>
       <w:r>
         <w:rPr>
-          <w:rFonts w:ascii="Times New Roman" w:cs="Times New Roman" w:eastAsia="Times New Roman" w:hAnsi="Times New Roman"/>
+          <w:rFonts w:ascii="Calibri" w:cs="Calibri" w:eastAsia="Calibri" w:hAnsi="Calibri"/>
+          <w:color w:val="000000"/>
           <w:sz w:val="22"/>
           <w:szCs w:val="22"/>
         </w:rPr>
@@ -477,9 +511,10 @@
       </w:pPr>
       <w:r>
         <w:rPr>
-          <w:rFonts w:ascii="Times New Roman" w:cs="Times New Roman" w:eastAsia="Times New Roman" w:hAnsi="Times New Roman"/>
-          <w:b/>
-          <w:bCs/>
+          <w:rFonts w:ascii="Calibri" w:cs="Calibri" w:eastAsia="Calibri" w:hAnsi="Calibri"/>
+          <w:b/>
+          <w:bCs/>
+          <w:color w:val="000000"/>
           <w:sz w:val="22"/>
           <w:szCs w:val="22"/>
         </w:rPr>
@@ -492,7 +527,8 @@
       </w:pPr>
       <w:r>
         <w:rPr>
-          <w:rFonts w:ascii="Times New Roman" w:cs="Times New Roman" w:eastAsia="Times New Roman" w:hAnsi="Times New Roman"/>
+          <w:rFonts w:ascii="Calibri" w:cs="Calibri" w:eastAsia="Calibri" w:hAnsi="Calibri"/>
+          <w:color w:val="000000"/>
           <w:sz w:val="22"/>
           <w:szCs w:val="22"/>
         </w:rPr>
@@ -505,7 +541,8 @@
       </w:pPr>
       <w:r>
         <w:rPr>
-          <w:rFonts w:ascii="Times New Roman" w:cs="Times New Roman" w:eastAsia="Times New Roman" w:hAnsi="Times New Roman"/>
+          <w:rFonts w:ascii="Calibri" w:cs="Calibri" w:eastAsia="Calibri" w:hAnsi="Calibri"/>
+          <w:color w:val="000000"/>
           <w:sz w:val="22"/>
           <w:szCs w:val="22"/>
         </w:rPr>
@@ -518,7 +555,8 @@
       </w:pPr>
       <w:r>
         <w:rPr>
-          <w:rFonts w:ascii="Times New Roman" w:cs="Times New Roman" w:eastAsia="Times New Roman" w:hAnsi="Times New Roman"/>
+          <w:rFonts w:ascii="Calibri" w:cs="Calibri" w:eastAsia="Calibri" w:hAnsi="Calibri"/>
+          <w:color w:val="000000"/>
           <w:sz w:val="22"/>
           <w:szCs w:val="22"/>
         </w:rPr>
@@ -531,7 +569,8 @@
       </w:pPr>
       <w:r>
         <w:rPr>
-          <w:rFonts w:ascii="Times New Roman" w:cs="Times New Roman" w:eastAsia="Times New Roman" w:hAnsi="Times New Roman"/>
+          <w:rFonts w:ascii="Calibri" w:cs="Calibri" w:eastAsia="Calibri" w:hAnsi="Calibri"/>
+          <w:color w:val="000000"/>
           <w:sz w:val="22"/>
           <w:szCs w:val="22"/>
         </w:rPr>
@@ -544,7 +583,8 @@
       </w:pPr>
       <w:r>
         <w:rPr>
-          <w:rFonts w:ascii="Times New Roman" w:cs="Times New Roman" w:eastAsia="Times New Roman" w:hAnsi="Times New Roman"/>
+          <w:rFonts w:ascii="Calibri" w:cs="Calibri" w:eastAsia="Calibri" w:hAnsi="Calibri"/>
+          <w:color w:val="000000"/>
           <w:sz w:val="22"/>
           <w:szCs w:val="22"/>
         </w:rPr>
@@ -557,7 +597,8 @@
       </w:pPr>
       <w:r>
         <w:rPr>
-          <w:rFonts w:ascii="Times New Roman" w:cs="Times New Roman" w:eastAsia="Times New Roman" w:hAnsi="Times New Roman"/>
+          <w:rFonts w:ascii="Calibri" w:cs="Calibri" w:eastAsia="Calibri" w:hAnsi="Calibri"/>
+          <w:color w:val="000000"/>
           <w:sz w:val="22"/>
           <w:szCs w:val="22"/>
         </w:rPr>
@@ -570,7 +611,8 @@
       </w:pPr>
       <w:r>
         <w:rPr>
-          <w:rFonts w:ascii="Times New Roman" w:cs="Times New Roman" w:eastAsia="Times New Roman" w:hAnsi="Times New Roman"/>
+          <w:rFonts w:ascii="Calibri" w:cs="Calibri" w:eastAsia="Calibri" w:hAnsi="Calibri"/>
+          <w:color w:val="000000"/>
           <w:sz w:val="22"/>
           <w:szCs w:val="22"/>
         </w:rPr>
@@ -583,7 +625,8 @@
       </w:pPr>
       <w:r>
         <w:rPr>
-          <w:rFonts w:ascii="Times New Roman" w:cs="Times New Roman" w:eastAsia="Times New Roman" w:hAnsi="Times New Roman"/>
+          <w:rFonts w:ascii="Calibri" w:cs="Calibri" w:eastAsia="Calibri" w:hAnsi="Calibri"/>
+          <w:color w:val="000000"/>
           <w:sz w:val="22"/>
           <w:szCs w:val="22"/>
         </w:rPr>
@@ -596,9 +639,10 @@
       </w:pPr>
       <w:r>
         <w:rPr>
-          <w:rFonts w:ascii="Times New Roman" w:cs="Times New Roman" w:eastAsia="Times New Roman" w:hAnsi="Times New Roman"/>
-          <w:b/>
-          <w:bCs/>
+          <w:rFonts w:ascii="Calibri" w:cs="Calibri" w:eastAsia="Calibri" w:hAnsi="Calibri"/>
+          <w:b/>
+          <w:bCs/>
+          <w:color w:val="000000"/>
           <w:sz w:val="22"/>
           <w:szCs w:val="22"/>
         </w:rPr>
@@ -611,7 +655,8 @@
       </w:pPr>
       <w:r>
         <w:rPr>
-          <w:rFonts w:ascii="Times New Roman" w:cs="Times New Roman" w:eastAsia="Times New Roman" w:hAnsi="Times New Roman"/>
+          <w:rFonts w:ascii="Calibri" w:cs="Calibri" w:eastAsia="Calibri" w:hAnsi="Calibri"/>
+          <w:color w:val="000000"/>
           <w:sz w:val="22"/>
           <w:szCs w:val="22"/>
         </w:rPr>
@@ -624,7 +669,8 @@
       </w:pPr>
       <w:r>
         <w:rPr>
-          <w:rFonts w:ascii="Times New Roman" w:cs="Times New Roman" w:eastAsia="Times New Roman" w:hAnsi="Times New Roman"/>
+          <w:rFonts w:ascii="Calibri" w:cs="Calibri" w:eastAsia="Calibri" w:hAnsi="Calibri"/>
+          <w:color w:val="000000"/>
           <w:sz w:val="22"/>
           <w:szCs w:val="22"/>
         </w:rPr>
@@ -637,7 +683,8 @@
       </w:pPr>
       <w:r>
         <w:rPr>
-          <w:rFonts w:ascii="Times New Roman" w:cs="Times New Roman" w:eastAsia="Times New Roman" w:hAnsi="Times New Roman"/>
+          <w:rFonts w:ascii="Calibri" w:cs="Calibri" w:eastAsia="Calibri" w:hAnsi="Calibri"/>
+          <w:color w:val="000000"/>
           <w:sz w:val="22"/>
           <w:szCs w:val="22"/>
         </w:rPr>
@@ -650,7 +697,8 @@
       </w:pPr>
       <w:r>
         <w:rPr>
-          <w:rFonts w:ascii="Times New Roman" w:cs="Times New Roman" w:eastAsia="Times New Roman" w:hAnsi="Times New Roman"/>
+          <w:rFonts w:ascii="Calibri" w:cs="Calibri" w:eastAsia="Calibri" w:hAnsi="Calibri"/>
+          <w:color w:val="000000"/>
           <w:sz w:val="22"/>
           <w:szCs w:val="22"/>
         </w:rPr>
@@ -663,7 +711,8 @@
       </w:pPr>
       <w:r>
         <w:rPr>
-          <w:rFonts w:ascii="Times New Roman" w:cs="Times New Roman" w:eastAsia="Times New Roman" w:hAnsi="Times New Roman"/>
+          <w:rFonts w:ascii="Calibri" w:cs="Calibri" w:eastAsia="Calibri" w:hAnsi="Calibri"/>
+          <w:color w:val="000000"/>
           <w:sz w:val="22"/>
           <w:szCs w:val="22"/>
         </w:rPr>
@@ -676,7 +725,8 @@
       </w:pPr>
       <w:r>
         <w:rPr>
-          <w:rFonts w:ascii="Times New Roman" w:cs="Times New Roman" w:eastAsia="Times New Roman" w:hAnsi="Times New Roman"/>
+          <w:rFonts w:ascii="Calibri" w:cs="Calibri" w:eastAsia="Calibri" w:hAnsi="Calibri"/>
+          <w:color w:val="000000"/>
           <w:sz w:val="22"/>
           <w:szCs w:val="22"/>
         </w:rPr>
@@ -689,7 +739,8 @@
       </w:pPr>
       <w:r>
         <w:rPr>
-          <w:rFonts w:ascii="Times New Roman" w:cs="Times New Roman" w:eastAsia="Times New Roman" w:hAnsi="Times New Roman"/>
+          <w:rFonts w:ascii="Calibri" w:cs="Calibri" w:eastAsia="Calibri" w:hAnsi="Calibri"/>
+          <w:color w:val="000000"/>
           <w:sz w:val="22"/>
           <w:szCs w:val="22"/>
         </w:rPr>
@@ -699,15 +750,16 @@
     <w:p>
       <w:pPr>
         <w:pBdr>
-          <w:bottom w:val="single" w:color="000000" w:sz="6" w:space="1"/>
+          <w:bottom w:val="single" w:color="1F3A5F" w:sz="6" w:space="1"/>
         </w:pBdr>
         <w:spacing w:after="80" w:before="120"/>
       </w:pPr>
       <w:r>
         <w:rPr>
-          <w:rFonts w:ascii="Times New Roman" w:cs="Times New Roman" w:eastAsia="Times New Roman" w:hAnsi="Times New Roman"/>
-          <w:b/>
-          <w:bCs/>
+          <w:rFonts w:ascii="Calibri" w:cs="Calibri" w:eastAsia="Calibri" w:hAnsi="Calibri"/>
+          <w:b/>
+          <w:bCs/>
+          <w:color w:val="1F3A5F"/>
           <w:sz w:val="24"/>
           <w:szCs w:val="24"/>
         </w:rPr>
@@ -720,7 +772,8 @@
       </w:pPr>
       <w:r>
         <w:rPr>
-          <w:rFonts w:ascii="Times New Roman" w:cs="Times New Roman" w:eastAsia="Times New Roman" w:hAnsi="Times New Roman"/>
+          <w:rFonts w:ascii="Calibri" w:cs="Calibri" w:eastAsia="Calibri" w:hAnsi="Calibri"/>
+          <w:color w:val="000000"/>
           <w:sz w:val="22"/>
           <w:szCs w:val="22"/>
         </w:rPr>
@@ -728,9 +781,10 @@
       </w:r>
       <w:r>
         <w:rPr>
-          <w:rFonts w:ascii="Times New Roman" w:cs="Times New Roman" w:eastAsia="Times New Roman" w:hAnsi="Times New Roman"/>
-          <w:b/>
-          <w:bCs/>
+          <w:rFonts w:ascii="Calibri" w:cs="Calibri" w:eastAsia="Calibri" w:hAnsi="Calibri"/>
+          <w:b/>
+          <w:bCs/>
+          <w:color w:val="000000"/>
           <w:sz w:val="22"/>
           <w:szCs w:val="22"/>
         </w:rPr>
@@ -738,7 +792,8 @@
       </w:r>
       <w:r>
         <w:rPr>
-          <w:rFonts w:ascii="Times New Roman" w:cs="Times New Roman" w:eastAsia="Times New Roman" w:hAnsi="Times New Roman"/>
+          <w:rFonts w:ascii="Calibri" w:cs="Calibri" w:eastAsia="Calibri" w:hAnsi="Calibri"/>
+          <w:color w:val="000000"/>
           <w:sz w:val="22"/>
           <w:szCs w:val="22"/>
         </w:rPr>
@@ -751,7 +806,8 @@
       </w:pPr>
       <w:r>
         <w:rPr>
-          <w:rFonts w:ascii="Times New Roman" w:cs="Times New Roman" w:eastAsia="Times New Roman" w:hAnsi="Times New Roman"/>
+          <w:rFonts w:ascii="Calibri" w:cs="Calibri" w:eastAsia="Calibri" w:hAnsi="Calibri"/>
+          <w:color w:val="000000"/>
           <w:sz w:val="22"/>
           <w:szCs w:val="22"/>
         </w:rPr>
@@ -759,9 +815,10 @@
       </w:r>
       <w:r>
         <w:rPr>
-          <w:rFonts w:ascii="Times New Roman" w:cs="Times New Roman" w:eastAsia="Times New Roman" w:hAnsi="Times New Roman"/>
-          <w:b/>
-          <w:bCs/>
+          <w:rFonts w:ascii="Calibri" w:cs="Calibri" w:eastAsia="Calibri" w:hAnsi="Calibri"/>
+          <w:b/>
+          <w:bCs/>
+          <w:color w:val="000000"/>
           <w:sz w:val="22"/>
           <w:szCs w:val="22"/>
         </w:rPr>
@@ -769,7 +826,8 @@
       </w:r>
       <w:r>
         <w:rPr>
-          <w:rFonts w:ascii="Times New Roman" w:cs="Times New Roman" w:eastAsia="Times New Roman" w:hAnsi="Times New Roman"/>
+          <w:rFonts w:ascii="Calibri" w:cs="Calibri" w:eastAsia="Calibri" w:hAnsi="Calibri"/>
+          <w:color w:val="000000"/>
           <w:sz w:val="22"/>
           <w:szCs w:val="22"/>
         </w:rPr>
@@ -782,7 +840,8 @@
       </w:pPr>
       <w:r>
         <w:rPr>
-          <w:rFonts w:ascii="Times New Roman" w:cs="Times New Roman" w:eastAsia="Times New Roman" w:hAnsi="Times New Roman"/>
+          <w:rFonts w:ascii="Calibri" w:cs="Calibri" w:eastAsia="Calibri" w:hAnsi="Calibri"/>
+          <w:color w:val="000000"/>
           <w:sz w:val="22"/>
           <w:szCs w:val="22"/>
         </w:rPr>
@@ -790,9 +849,10 @@
       </w:r>
       <w:r>
         <w:rPr>
-          <w:rFonts w:ascii="Times New Roman" w:cs="Times New Roman" w:eastAsia="Times New Roman" w:hAnsi="Times New Roman"/>
-          <w:b/>
-          <w:bCs/>
+          <w:rFonts w:ascii="Calibri" w:cs="Calibri" w:eastAsia="Calibri" w:hAnsi="Calibri"/>
+          <w:b/>
+          <w:bCs/>
+          <w:color w:val="000000"/>
           <w:sz w:val="22"/>
           <w:szCs w:val="22"/>
         </w:rPr>
@@ -800,7 +860,8 @@
       </w:r>
       <w:r>
         <w:rPr>
-          <w:rFonts w:ascii="Times New Roman" w:cs="Times New Roman" w:eastAsia="Times New Roman" w:hAnsi="Times New Roman"/>
+          <w:rFonts w:ascii="Calibri" w:cs="Calibri" w:eastAsia="Calibri" w:hAnsi="Calibri"/>
+          <w:color w:val="000000"/>
           <w:sz w:val="22"/>
           <w:szCs w:val="22"/>
         </w:rPr>
@@ -813,7 +874,8 @@
       </w:pPr>
       <w:r>
         <w:rPr>
-          <w:rFonts w:ascii="Times New Roman" w:cs="Times New Roman" w:eastAsia="Times New Roman" w:hAnsi="Times New Roman"/>
+          <w:rFonts w:ascii="Calibri" w:cs="Calibri" w:eastAsia="Calibri" w:hAnsi="Calibri"/>
+          <w:color w:val="000000"/>
           <w:sz w:val="22"/>
           <w:szCs w:val="22"/>
         </w:rPr>
@@ -821,9 +883,10 @@
       </w:r>
       <w:r>
         <w:rPr>
-          <w:rFonts w:ascii="Times New Roman" w:cs="Times New Roman" w:eastAsia="Times New Roman" w:hAnsi="Times New Roman"/>
-          <w:b/>
-          <w:bCs/>
+          <w:rFonts w:ascii="Calibri" w:cs="Calibri" w:eastAsia="Calibri" w:hAnsi="Calibri"/>
+          <w:b/>
+          <w:bCs/>
+          <w:color w:val="000000"/>
           <w:sz w:val="22"/>
           <w:szCs w:val="22"/>
         </w:rPr>
@@ -831,7 +894,8 @@
       </w:r>
       <w:r>
         <w:rPr>
-          <w:rFonts w:ascii="Times New Roman" w:cs="Times New Roman" w:eastAsia="Times New Roman" w:hAnsi="Times New Roman"/>
+          <w:rFonts w:ascii="Calibri" w:cs="Calibri" w:eastAsia="Calibri" w:hAnsi="Calibri"/>
+          <w:color w:val="000000"/>
           <w:sz w:val="22"/>
           <w:szCs w:val="22"/>
         </w:rPr>
@@ -841,15 +905,16 @@
     <w:p>
       <w:pPr>
         <w:pBdr>
-          <w:bottom w:val="single" w:color="000000" w:sz="6" w:space="1"/>
+          <w:bottom w:val="single" w:color="1F3A5F" w:sz="6" w:space="1"/>
         </w:pBdr>
         <w:spacing w:after="80" w:before="120"/>
       </w:pPr>
       <w:r>
         <w:rPr>
-          <w:rFonts w:ascii="Times New Roman" w:cs="Times New Roman" w:eastAsia="Times New Roman" w:hAnsi="Times New Roman"/>
-          <w:b/>
-          <w:bCs/>
+          <w:rFonts w:ascii="Calibri" w:cs="Calibri" w:eastAsia="Calibri" w:hAnsi="Calibri"/>
+          <w:b/>
+          <w:bCs/>
+          <w:color w:val="1F3A5F"/>
           <w:sz w:val="24"/>
           <w:szCs w:val="24"/>
         </w:rPr>
@@ -862,9 +927,10 @@
       </w:pPr>
       <w:r>
         <w:rPr>
-          <w:rFonts w:ascii="Times New Roman" w:cs="Times New Roman" w:eastAsia="Times New Roman" w:hAnsi="Times New Roman"/>
-          <w:b/>
-          <w:bCs/>
+          <w:rFonts w:ascii="Calibri" w:cs="Calibri" w:eastAsia="Calibri" w:hAnsi="Calibri"/>
+          <w:b/>
+          <w:bCs/>
+          <w:color w:val="000000"/>
           <w:sz w:val="22"/>
           <w:szCs w:val="22"/>
         </w:rPr>
@@ -872,7 +938,8 @@
       </w:r>
       <w:r>
         <w:rPr>
-          <w:rFonts w:ascii="Times New Roman" w:cs="Times New Roman" w:eastAsia="Times New Roman" w:hAnsi="Times New Roman"/>
+          <w:rFonts w:ascii="Calibri" w:cs="Calibri" w:eastAsia="Calibri" w:hAnsi="Calibri"/>
+          <w:color w:val="000000"/>
           <w:sz w:val="22"/>
           <w:szCs w:val="22"/>
         </w:rPr>
@@ -885,7 +952,8 @@
       </w:pPr>
       <w:r>
         <w:rPr>
-          <w:rFonts w:ascii="Times New Roman" w:cs="Times New Roman" w:eastAsia="Times New Roman" w:hAnsi="Times New Roman"/>
+          <w:rFonts w:ascii="Calibri" w:cs="Calibri" w:eastAsia="Calibri" w:hAnsi="Calibri"/>
+          <w:color w:val="000000"/>
           <w:sz w:val="22"/>
           <w:szCs w:val="22"/>
         </w:rPr>
@@ -898,9 +966,10 @@
       </w:pPr>
       <w:r>
         <w:rPr>
-          <w:rFonts w:ascii="Times New Roman" w:cs="Times New Roman" w:eastAsia="Times New Roman" w:hAnsi="Times New Roman"/>
-          <w:b/>
-          <w:bCs/>
+          <w:rFonts w:ascii="Calibri" w:cs="Calibri" w:eastAsia="Calibri" w:hAnsi="Calibri"/>
+          <w:b/>
+          <w:bCs/>
+          <w:color w:val="000000"/>
           <w:sz w:val="22"/>
           <w:szCs w:val="22"/>
         </w:rPr>
@@ -908,7 +977,8 @@
       </w:r>
       <w:r>
         <w:rPr>
-          <w:rFonts w:ascii="Times New Roman" w:cs="Times New Roman" w:eastAsia="Times New Roman" w:hAnsi="Times New Roman"/>
+          <w:rFonts w:ascii="Calibri" w:cs="Calibri" w:eastAsia="Calibri" w:hAnsi="Calibri"/>
+          <w:color w:val="000000"/>
           <w:sz w:val="22"/>
           <w:szCs w:val="22"/>
         </w:rPr>
@@ -921,7 +991,8 @@
       </w:pPr>
       <w:r>
         <w:rPr>
-          <w:rFonts w:ascii="Times New Roman" w:cs="Times New Roman" w:eastAsia="Times New Roman" w:hAnsi="Times New Roman"/>
+          <w:rFonts w:ascii="Calibri" w:cs="Calibri" w:eastAsia="Calibri" w:hAnsi="Calibri"/>
+          <w:color w:val="000000"/>
           <w:sz w:val="22"/>
           <w:szCs w:val="22"/>
         </w:rPr>

</xml_diff>

<commit_message>
Resume: Senior Java Full Stack Developer, enriched summary & skills, full contact line
- Header title and summary lead; keyword-rich profile (Java 17, Kafka, PostgreSQL, MongoDB, GitHub Actions, monitoring)
- Technical skills: Languages Java 17/TS/JS/SQL; explicit stack list per prompt; OAuth2/JWT
- Contact: phone, email, Tampa, FL, LinkedIn, GitHub on one line; optional phone line in PDF/DOCX when empty
- Experience: GitHub Actions mentions with Jenkins/Bitbucket; keep collaborative tone
- Portfolio: Hero, About, meta, contact links (phone tel), skillGroups, README
- Plain-text resume sync; PDF cache v=32

Co-authored-by: Cursor <cursoragent@cursor.com>
</commit_message>
<xml_diff>
--- a/public/Java_FullStack_FullTime_Resume.docx
+++ b/public/Java_FullStack_FullTime_Resume.docx
@@ -4,21 +4,6 @@
   <w:body>
     <w:p>
       <w:pPr>
-        <w:spacing w:after="40"/>
-        <w:jc w:val="center"/>
-      </w:pPr>
-      <w:r>
-        <w:rPr>
-          <w:rFonts w:ascii="Calibri" w:cs="Calibri" w:eastAsia="Calibri" w:hAnsi="Calibri"/>
-          <w:color w:val="000000"/>
-          <w:sz w:val="22"/>
-          <w:szCs w:val="22"/>
-        </w:rPr>
-        <w:t xml:space="preserve">456-961-7695</w:t>
-      </w:r>
-    </w:p>
-    <w:p>
-      <w:pPr>
         <w:spacing w:after="80"/>
         <w:jc w:val="center"/>
       </w:pPr>
@@ -46,7 +31,7 @@
           <w:sz w:val="24"/>
           <w:szCs w:val="24"/>
         </w:rPr>
-        <w:t xml:space="preserve">Java Full Stack Engineer | Spring Boot | React | Angular | AWS</w:t>
+        <w:t xml:space="preserve">Senior Java Full Stack Developer | Spring Boot | React | Angular | AWS</w:t>
       </w:r>
     </w:p>
     <w:p>
@@ -61,7 +46,7 @@
           <w:sz w:val="22"/>
           <w:szCs w:val="22"/>
         </w:rPr>
-        <w:t xml:space="preserve">gsg1499@gmail.com  •  github.com/sivaganesh1407  •  linkedin.com/in/ganeshg7</w:t>
+        <w:t xml:space="preserve">456-961-7695  •  gsg1499@gmail.com  •  Tampa, FL  •  linkedin.com/in/ganeshg7  •  github.com/sivaganesh1407</w:t>
       </w:r>
     </w:p>
     <w:p>
@@ -94,7 +79,7 @@
           <w:sz w:val="22"/>
           <w:szCs w:val="22"/>
         </w:rPr>
-        <w:t xml:space="preserve">Java Full Stack Engineer with 6+ years of experience delivering enterprise web platforms:</w:t>
+        <w:t xml:space="preserve">Senior Java Full Stack Developer with 6+ years of experience delivering enterprise web platforms:</w:t>
       </w:r>
     </w:p>
     <w:p>
@@ -108,7 +93,7 @@
           <w:sz w:val="22"/>
           <w:szCs w:val="22"/>
         </w:rPr>
-        <w:t xml:space="preserve">Hands-on with Java 17, Spring Boot microservices, REST APIs, React, Angular, AWS, Docker, Kubernetes, Jenkins/Bitbucket CI/CD, DevSecOps, and observability. Certifications: AWS Certified DevOps Engineer – Professional, AWS Certified Solutions Architect – Associate, HashiCorp Terraform Associate; Oracle Certified Professional Java SE Developer (In Progress). Delivers cloud-native solutions for retail/restaurant POS, insurance and retirement, energy, automotive supply chain, and pharma compliance. Familiar with AI-assisted developer tools including GitHub Copilot and Cursor AI for development acceleration and documentation support.</w:t>
+        <w:t xml:space="preserve">Hands-on enterprise production support for cloud-native microservices and full-stack systems using Java 17, Spring Boot, React, Angular, REST APIs, OAuth2/JWT, AWS, Docker, and Kubernetes. Builds on Kafka, PostgreSQL, MongoDB, Jenkins, GitHub Actions, and operational monitoring (Prometheus/Grafana) across retail/POS, financial services, energy, automotive supply chain, and pharma. Certifications: AWS Certified DevOps Engineer – Professional, AWS Certified Solutions Architect – Associate, HashiCorp Terraform Associate; Oracle Certified Professional Java SE Developer (In Progress). Familiar with AI-assisted developer tools including GitHub Copilot and Cursor AI for development acceleration and documentation support.</w:t>
       </w:r>
     </w:p>
     <w:p>
@@ -141,7 +126,7 @@
           <w:sz w:val="22"/>
           <w:szCs w:val="22"/>
         </w:rPr>
-        <w:t xml:space="preserve">Languages: Java, Java 17, TypeScript, JavaScript, SQL | Backend: Spring Boot, microservices, REST APIs, Spring Security (OAuth2, JWT, RBAC), Hibernate/JPA | Frontend: React, Angular, HTML5, CSS3 | Cloud &amp; DevOps: AWS (EC2, S3, RDS, Lambda, ECS), Docker, Kubernetes, Jenkins, Bitbucket, CI/CD, DevSecOps, Terraform, infrastructure as code | Event-driven architecture &amp; messaging: Kafka, RabbitMQ, Redis | Databases: Oracle, MySQL, PostgreSQL, MongoDB | Quality &amp; observability: JUnit, Mockito, Prometheus, Grafana</w:t>
+        <w:t xml:space="preserve">Languages: Java 17, TypeScript, JavaScript, SQL | Backend: Spring Boot, Spring Security, Hibernate/JPA, REST APIs, Microservices, OAuth2, JWT | Frontend: React, Angular, HTML5, CSS3 | Cloud &amp; infrastructure: AWS (EC2, S3, RDS, Lambda, ECS), Docker, Kubernetes, Terraform, Jenkins, GitHub Actions, CI/CD | Messaging: Kafka, RabbitMQ | Datastores: PostgreSQL, MongoDB, Redis, Oracle, MySQL | Quality &amp; observability: JUnit, Mockito, Prometheus, Grafana</w:t>
       </w:r>
     </w:p>
     <w:p>
@@ -274,7 +259,7 @@
           <w:sz w:val="22"/>
           <w:szCs w:val="22"/>
         </w:rPr>
-        <w:t xml:space="preserve">• Coordinated Jenkins and Bitbucket CI/CD with quality gates; extended observability with Prometheus, Grafana, and JUnit/Mockito.</w:t>
+        <w:t xml:space="preserve">• Coordinated Jenkins, Bitbucket, and GitHub Actions CI/CD checks with quality gates; extended observability with Prometheus, Grafana, and JUnit/Mockito.</w:t>
       </w:r>
     </w:p>
     <w:p>
@@ -374,7 +359,7 @@
           <w:sz w:val="22"/>
           <w:szCs w:val="22"/>
         </w:rPr>
-        <w:t xml:space="preserve">• Participated in Agile delivery with Product/QA and Jenkins/Bitbucket CI/CD, improving feedback from test to production.</w:t>
+        <w:t xml:space="preserve">• Participated in Agile delivery with Product/QA and CI/CD (Jenkins, Bitbucket, GitHub Actions) improving feedback from test to production.</w:t>
       </w:r>
     </w:p>
     <w:p>

</xml_diff>

<commit_message>
Deploy: resume refresh for Vercel (skills, bullets, PDF/DOCX, cache buster).
Co-authored-by: Cursor <cursoragent@cursor.com>
</commit_message>
<xml_diff>
--- a/public/Java_FullStack_FullTime_Resume.docx
+++ b/public/Java_FullStack_FullTime_Resume.docx
@@ -79,7 +79,21 @@
           <w:sz w:val="22"/>
           <w:szCs w:val="22"/>
         </w:rPr>
-        <w:t xml:space="preserve">Senior Java Full Stack Developer with 6+ years of experience delivering enterprise web platforms:</w:t>
+        <w:t xml:space="preserve">Senior Java Full Stack Developer with 6+ years building enterprise web platforms on Java, Spring Boot, Spring Security, Hibernate, and JPA, paired with React.js and Angular (TypeScript, JavaScript, HTML5, CSS3). Delivers contract-first service integrations, microservices architectures, and secure OAuth2/JWT/OIDC patterns across distributed systems on AWS with Docker, Kubernetes, Kafka, PostgreSQL, MongoDB, Redis, Jenkins, GitHub Actions, and Agile/Scrum—including on-call production support, performance tuning, and reliability work.</w:t>
+      </w:r>
+    </w:p>
+    <w:p>
+      <w:pPr>
+        <w:spacing w:after="60"/>
+      </w:pPr>
+      <w:r>
+        <w:rPr>
+          <w:rFonts w:ascii="Calibri" w:cs="Calibri" w:eastAsia="Calibri" w:hAnsi="Calibri"/>
+          <w:color w:val="000000"/>
+          <w:sz w:val="22"/>
+          <w:szCs w:val="22"/>
+        </w:rPr>
+        <w:t xml:space="preserve">Domain experience spans retail point-of-sale, financial services, energy operations, manufacturing and logistics analytics, and regulated pharmaceutical programs, balancing backend depth, cloud-native delivery, operational monitoring, and maintainable frontends.</w:t>
       </w:r>
     </w:p>
     <w:p>
@@ -93,7 +107,7 @@
           <w:sz w:val="22"/>
           <w:szCs w:val="22"/>
         </w:rPr>
-        <w:t xml:space="preserve">Hands-on enterprise production support for cloud-native microservices and full-stack systems using Java 17, Spring Boot, React, Angular, REST APIs, OAuth2/JWT, AWS, Docker, and Kubernetes. Builds on Kafka, PostgreSQL, MongoDB, Jenkins, GitHub Actions, and operational monitoring (Prometheus/Grafana) across retail/POS, financial services, energy, automotive supply chain, and pharma. Certifications: AWS Certified DevOps Engineer – Professional, AWS Certified Solutions Architect – Associate, HashiCorp Terraform Associate; Oracle Certified Professional Java SE Developer (In Progress). Familiar with AI-assisted developer tools including GitHub Copilot and Cursor AI for development acceleration and documentation support.</w:t>
+        <w:t xml:space="preserve">Familiar with AI-assisted developer tools including GitHub Copilot and Cursor AI for development acceleration and documentation support.</w:t>
       </w:r>
     </w:p>
     <w:p>
@@ -117,16 +131,251 @@
     </w:p>
     <w:p>
       <w:pPr>
+        <w:pBdr>
+          <w:bottom w:val="single" w:color="1F3A5F" w:sz="4" w:space="1"/>
+        </w:pBdr>
+        <w:spacing w:after="50"/>
+      </w:pPr>
+      <w:r>
+        <w:rPr>
+          <w:rFonts w:ascii="Calibri" w:cs="Calibri" w:eastAsia="Calibri" w:hAnsi="Calibri"/>
+          <w:b/>
+          <w:bCs/>
+          <w:color w:val="000000"/>
+          <w:sz w:val="22"/>
+          <w:szCs w:val="22"/>
+        </w:rPr>
+        <w:t xml:space="preserve">Languages: </w:t>
+      </w:r>
+      <w:r>
+        <w:rPr>
+          <w:rFonts w:ascii="Calibri" w:cs="Calibri" w:eastAsia="Calibri" w:hAnsi="Calibri"/>
+          <w:color w:val="000000"/>
+          <w:sz w:val="22"/>
+          <w:szCs w:val="22"/>
+        </w:rPr>
+        <w:t xml:space="preserve">Java 17, TypeScript, JavaScript, SQL</w:t>
+      </w:r>
+    </w:p>
+    <w:p>
+      <w:pPr>
+        <w:pBdr>
+          <w:bottom w:val="single" w:color="1F3A5F" w:sz="4" w:space="1"/>
+        </w:pBdr>
+        <w:spacing w:after="50"/>
+      </w:pPr>
+      <w:r>
+        <w:rPr>
+          <w:rFonts w:ascii="Calibri" w:cs="Calibri" w:eastAsia="Calibri" w:hAnsi="Calibri"/>
+          <w:b/>
+          <w:bCs/>
+          <w:color w:val="000000"/>
+          <w:sz w:val="22"/>
+          <w:szCs w:val="22"/>
+        </w:rPr>
+        <w:t xml:space="preserve">Frontend: </w:t>
+      </w:r>
+      <w:r>
+        <w:rPr>
+          <w:rFonts w:ascii="Calibri" w:cs="Calibri" w:eastAsia="Calibri" w:hAnsi="Calibri"/>
+          <w:color w:val="000000"/>
+          <w:sz w:val="22"/>
+          <w:szCs w:val="22"/>
+        </w:rPr>
+        <w:t xml:space="preserve">React.js, Angular, HTML5, CSS3, Redux, RxJS, SPA routing, responsive UI, form validation, Bootstrap, Material UI</w:t>
+      </w:r>
+    </w:p>
+    <w:p>
+      <w:pPr>
+        <w:pBdr>
+          <w:bottom w:val="single" w:color="1F3A5F" w:sz="4" w:space="1"/>
+        </w:pBdr>
+        <w:spacing w:after="50"/>
+      </w:pPr>
+      <w:r>
+        <w:rPr>
+          <w:rFonts w:ascii="Calibri" w:cs="Calibri" w:eastAsia="Calibri" w:hAnsi="Calibri"/>
+          <w:b/>
+          <w:bCs/>
+          <w:color w:val="000000"/>
+          <w:sz w:val="22"/>
+          <w:szCs w:val="22"/>
+        </w:rPr>
+        <w:t xml:space="preserve">Backend: </w:t>
+      </w:r>
+      <w:r>
+        <w:rPr>
+          <w:rFonts w:ascii="Calibri" w:cs="Calibri" w:eastAsia="Calibri" w:hAnsi="Calibri"/>
+          <w:color w:val="000000"/>
+          <w:sz w:val="22"/>
+          <w:szCs w:val="22"/>
+        </w:rPr>
+        <w:t xml:space="preserve">Spring Boot, Spring MVC, Spring Security, Hibernate, JPA, REST APIs, Microservices, Swagger/OpenAPI, Maven, Gradle, OAuth2, JWT, RBAC, RESTful services, distributed systems</w:t>
+      </w:r>
+    </w:p>
+    <w:p>
+      <w:pPr>
+        <w:pBdr>
+          <w:bottom w:val="single" w:color="1F3A5F" w:sz="4" w:space="1"/>
+        </w:pBdr>
+        <w:spacing w:after="50"/>
+      </w:pPr>
+      <w:r>
+        <w:rPr>
+          <w:rFonts w:ascii="Calibri" w:cs="Calibri" w:eastAsia="Calibri" w:hAnsi="Calibri"/>
+          <w:b/>
+          <w:bCs/>
+          <w:color w:val="000000"/>
+          <w:sz w:val="22"/>
+          <w:szCs w:val="22"/>
+        </w:rPr>
+        <w:t xml:space="preserve">Cloud &amp; DevOps: </w:t>
+      </w:r>
+      <w:r>
+        <w:rPr>
+          <w:rFonts w:ascii="Calibri" w:cs="Calibri" w:eastAsia="Calibri" w:hAnsi="Calibri"/>
+          <w:color w:val="000000"/>
+          <w:sz w:val="22"/>
+          <w:szCs w:val="22"/>
+        </w:rPr>
+        <w:t xml:space="preserve">AWS (EC2, S3, RDS, Lambda, API Gateway, ECS), Docker, Kubernetes, Terraform, Jenkins, GitHub Actions, Bitbucket, CI/CD, Git, GitHub, DevSecOps, Infrastructure as Code (IaC)</w:t>
+      </w:r>
+    </w:p>
+    <w:p>
+      <w:pPr>
+        <w:pBdr>
+          <w:bottom w:val="single" w:color="1F3A5F" w:sz="4" w:space="1"/>
+        </w:pBdr>
+        <w:spacing w:after="50"/>
+      </w:pPr>
+      <w:r>
+        <w:rPr>
+          <w:rFonts w:ascii="Calibri" w:cs="Calibri" w:eastAsia="Calibri" w:hAnsi="Calibri"/>
+          <w:b/>
+          <w:bCs/>
+          <w:color w:val="000000"/>
+          <w:sz w:val="22"/>
+          <w:szCs w:val="22"/>
+        </w:rPr>
+        <w:t xml:space="preserve">Databases: </w:t>
+      </w:r>
+      <w:r>
+        <w:rPr>
+          <w:rFonts w:ascii="Calibri" w:cs="Calibri" w:eastAsia="Calibri" w:hAnsi="Calibri"/>
+          <w:color w:val="000000"/>
+          <w:sz w:val="22"/>
+          <w:szCs w:val="22"/>
+        </w:rPr>
+        <w:t xml:space="preserve">PostgreSQL, MySQL, Oracle, MongoDB, Redis, DB2, SQL optimization, indexing, query tuning, stored procedures, transactions</w:t>
+      </w:r>
+    </w:p>
+    <w:p>
+      <w:pPr>
+        <w:pBdr>
+          <w:bottom w:val="single" w:color="1F3A5F" w:sz="4" w:space="1"/>
+        </w:pBdr>
+        <w:spacing w:after="50"/>
+      </w:pPr>
+      <w:r>
+        <w:rPr>
+          <w:rFonts w:ascii="Calibri" w:cs="Calibri" w:eastAsia="Calibri" w:hAnsi="Calibri"/>
+          <w:b/>
+          <w:bCs/>
+          <w:color w:val="000000"/>
+          <w:sz w:val="22"/>
+          <w:szCs w:val="22"/>
+        </w:rPr>
+        <w:t xml:space="preserve">Messaging &amp; Integration: </w:t>
+      </w:r>
+      <w:r>
+        <w:rPr>
+          <w:rFonts w:ascii="Calibri" w:cs="Calibri" w:eastAsia="Calibri" w:hAnsi="Calibri"/>
+          <w:color w:val="000000"/>
+          <w:sz w:val="22"/>
+          <w:szCs w:val="22"/>
+        </w:rPr>
+        <w:t xml:space="preserve">Apache Kafka, RabbitMQ, event-driven architecture, asynchronous processing, batch pipelines, near-real-time processing, REST integrations, API integrations</w:t>
+      </w:r>
+    </w:p>
+    <w:p>
+      <w:pPr>
+        <w:pBdr>
+          <w:bottom w:val="single" w:color="1F3A5F" w:sz="4" w:space="1"/>
+        </w:pBdr>
+        <w:spacing w:after="50"/>
+      </w:pPr>
+      <w:r>
+        <w:rPr>
+          <w:rFonts w:ascii="Calibri" w:cs="Calibri" w:eastAsia="Calibri" w:hAnsi="Calibri"/>
+          <w:b/>
+          <w:bCs/>
+          <w:color w:val="000000"/>
+          <w:sz w:val="22"/>
+          <w:szCs w:val="22"/>
+        </w:rPr>
+        <w:t xml:space="preserve">Testing &amp; Monitoring: </w:t>
+      </w:r>
+      <w:r>
+        <w:rPr>
+          <w:rFonts w:ascii="Calibri" w:cs="Calibri" w:eastAsia="Calibri" w:hAnsi="Calibri"/>
+          <w:color w:val="000000"/>
+          <w:sz w:val="22"/>
+          <w:szCs w:val="22"/>
+        </w:rPr>
+        <w:t xml:space="preserve">JUnit, Mockito, TestNG, Selenium, Cypress, Postman, Prometheus, Grafana, logging, monitoring, alerting, debugging, performance tuning</w:t>
+      </w:r>
+    </w:p>
+    <w:p>
+      <w:pPr>
+        <w:pBdr>
+          <w:bottom w:val="single" w:color="1F3A5F" w:sz="4" w:space="1"/>
+        </w:pBdr>
+        <w:spacing w:after="50"/>
+      </w:pPr>
+      <w:r>
+        <w:rPr>
+          <w:rFonts w:ascii="Calibri" w:cs="Calibri" w:eastAsia="Calibri" w:hAnsi="Calibri"/>
+          <w:b/>
+          <w:bCs/>
+          <w:color w:val="000000"/>
+          <w:sz w:val="22"/>
+          <w:szCs w:val="22"/>
+        </w:rPr>
+        <w:t xml:space="preserve">Developer Tools: </w:t>
+      </w:r>
+      <w:r>
+        <w:rPr>
+          <w:rFonts w:ascii="Calibri" w:cs="Calibri" w:eastAsia="Calibri" w:hAnsi="Calibri"/>
+          <w:color w:val="000000"/>
+          <w:sz w:val="22"/>
+          <w:szCs w:val="22"/>
+        </w:rPr>
+        <w:t xml:space="preserve">IntelliJ IDEA, VS Code, Eclipse, Jira, Confluence, GitHub Copilot, Cursor AI, Claude AI, OpenAI APIs</w:t>
+      </w:r>
+    </w:p>
+    <w:p>
+      <w:pPr>
         <w:spacing w:after="120"/>
       </w:pPr>
       <w:r>
         <w:rPr>
           <w:rFonts w:ascii="Calibri" w:cs="Calibri" w:eastAsia="Calibri" w:hAnsi="Calibri"/>
-          <w:color w:val="000000"/>
-          <w:sz w:val="22"/>
-          <w:szCs w:val="22"/>
-        </w:rPr>
-        <w:t xml:space="preserve">Languages: Java 17, TypeScript, JavaScript, SQL | Backend: Spring Boot, Spring Security, Hibernate/JPA, REST APIs, Microservices, OAuth2, JWT | Frontend: React, Angular, HTML5, CSS3 | Cloud &amp; infrastructure: AWS (EC2, S3, RDS, Lambda, ECS), Docker, Kubernetes, Terraform, Jenkins, GitHub Actions, CI/CD | Messaging: Kafka, RabbitMQ | Datastores: PostgreSQL, MongoDB, Redis, Oracle, MySQL | Quality &amp; observability: JUnit, Mockito, Prometheus, Grafana</w:t>
+          <w:b/>
+          <w:bCs/>
+          <w:color w:val="000000"/>
+          <w:sz w:val="22"/>
+          <w:szCs w:val="22"/>
+        </w:rPr>
+        <w:t xml:space="preserve">Development Practices: </w:t>
+      </w:r>
+      <w:r>
+        <w:rPr>
+          <w:rFonts w:ascii="Calibri" w:cs="Calibri" w:eastAsia="Calibri" w:hAnsi="Calibri"/>
+          <w:color w:val="000000"/>
+          <w:sz w:val="22"/>
+          <w:szCs w:val="22"/>
+        </w:rPr>
+        <w:t xml:space="preserve">Agile methodologies, Scrum, code reviews, CI/CD pipelines, production support, release coordination, defect triage, troubleshooting</w:t>
       </w:r>
     </w:p>
     <w:p>
@@ -175,49 +424,49 @@
           <w:sz w:val="22"/>
           <w:szCs w:val="22"/>
         </w:rPr>
-        <w:t xml:space="preserve">Nov 2025 – Present</w:t>
-      </w:r>
-    </w:p>
-    <w:p>
-      <w:pPr>
-        <w:spacing w:after="20"/>
-      </w:pPr>
-      <w:r>
-        <w:rPr>
-          <w:rFonts w:ascii="Calibri" w:cs="Calibri" w:eastAsia="Calibri" w:hAnsi="Calibri"/>
-          <w:color w:val="000000"/>
-          <w:sz w:val="22"/>
-          <w:szCs w:val="22"/>
-        </w:rPr>
-        <w:t xml:space="preserve">• Worked on Spring Boot microservices supporting high-volume checkout and kiosk flows across distributed retail environments.</w:t>
-      </w:r>
-    </w:p>
-    <w:p>
-      <w:pPr>
-        <w:spacing w:after="20"/>
-      </w:pPr>
-      <w:r>
-        <w:rPr>
-          <w:rFonts w:ascii="Calibri" w:cs="Calibri" w:eastAsia="Calibri" w:hAnsi="Calibri"/>
-          <w:color w:val="000000"/>
-          <w:sz w:val="22"/>
-          <w:szCs w:val="22"/>
-        </w:rPr>
-        <w:t xml:space="preserve">• Collaborated on migration from Spring MVC to Java 17 and Spring Boot microservices for retail and restaurant POS; helped reduce deployment effort by ~25% and improve release stability.</w:t>
-      </w:r>
-    </w:p>
-    <w:p>
-      <w:pPr>
-        <w:spacing w:after="20"/>
-      </w:pPr>
-      <w:r>
-        <w:rPr>
-          <w:rFonts w:ascii="Calibri" w:cs="Calibri" w:eastAsia="Calibri" w:hAnsi="Calibri"/>
-          <w:color w:val="000000"/>
-          <w:sz w:val="22"/>
-          <w:szCs w:val="22"/>
-        </w:rPr>
-        <w:t xml:space="preserve">• Participated in event-driven integration (Kafka, RabbitMQ, Redis) for 10K+ daily transactions with circuit breakers for resilient order and payment flows.</w:t>
+        <w:t xml:space="preserve">Tampa, Florida, USA  |  Nov 2025 – Present</w:t>
+      </w:r>
+    </w:p>
+    <w:p>
+      <w:pPr>
+        <w:spacing w:after="20"/>
+      </w:pPr>
+      <w:r>
+        <w:rPr>
+          <w:rFonts w:ascii="Calibri" w:cs="Calibri" w:eastAsia="Calibri" w:hAnsi="Calibri"/>
+          <w:color w:val="000000"/>
+          <w:sz w:val="22"/>
+          <w:szCs w:val="22"/>
+        </w:rPr>
+        <w:t xml:space="preserve">• Built and maintained Spring Boot microservices for high-volume checkout and kiosk flows across distributed retail environments.</w:t>
+      </w:r>
+    </w:p>
+    <w:p>
+      <w:pPr>
+        <w:spacing w:after="20"/>
+      </w:pPr>
+      <w:r>
+        <w:rPr>
+          <w:rFonts w:ascii="Calibri" w:cs="Calibri" w:eastAsia="Calibri" w:hAnsi="Calibri"/>
+          <w:color w:val="000000"/>
+          <w:sz w:val="22"/>
+          <w:szCs w:val="22"/>
+        </w:rPr>
+        <w:t xml:space="preserve">• Migrated Spring MVC services toward Java 17 and Spring Boot microservices for retail and restaurant POS, reducing deployment effort by ~25% and improving release stability.</w:t>
+      </w:r>
+    </w:p>
+    <w:p>
+      <w:pPr>
+        <w:spacing w:after="20"/>
+      </w:pPr>
+      <w:r>
+        <w:rPr>
+          <w:rFonts w:ascii="Calibri" w:cs="Calibri" w:eastAsia="Calibri" w:hAnsi="Calibri"/>
+          <w:color w:val="000000"/>
+          <w:sz w:val="22"/>
+          <w:szCs w:val="22"/>
+        </w:rPr>
+        <w:t xml:space="preserve">• Implemented event-driven integration (Kafka, RabbitMQ, Redis) for 10K+ daily transactions with circuit breakers for resilient order and payment flows.</w:t>
       </w:r>
     </w:p>
     <w:p>
@@ -245,7 +494,7 @@
           <w:sz w:val="22"/>
           <w:szCs w:val="22"/>
         </w:rPr>
-        <w:t xml:space="preserve">• Supported Spring Data JPA, Oracle, and MongoDB with Docker and Kubernetes on AWS (EC2, ECS) for scalable POS services.</w:t>
+        <w:t xml:space="preserve">• Operated Spring Data JPA with Oracle and MongoDB on Docker and Kubernetes (AWS EC2, ECS) for scalable POS services.</w:t>
       </w:r>
     </w:p>
     <w:p>
@@ -259,7 +508,7 @@
           <w:sz w:val="22"/>
           <w:szCs w:val="22"/>
         </w:rPr>
-        <w:t xml:space="preserve">• Coordinated Jenkins, Bitbucket, and GitHub Actions CI/CD checks with quality gates; extended observability with Prometheus, Grafana, and JUnit/Mockito.</w:t>
+        <w:t xml:space="preserve">• Maintained CI/CD quality gates across Jenkins, Bitbucket, and GitHub Actions; extended observability with Prometheus, Grafana, and JUnit/Mockito.</w:t>
       </w:r>
     </w:p>
     <w:p>
@@ -289,35 +538,35 @@
           <w:sz w:val="22"/>
           <w:szCs w:val="22"/>
         </w:rPr>
-        <w:t xml:space="preserve">Feb 2025 – Oct 2025</w:t>
-      </w:r>
-    </w:p>
-    <w:p>
-      <w:pPr>
-        <w:spacing w:after="20"/>
-      </w:pPr>
-      <w:r>
-        <w:rPr>
-          <w:rFonts w:ascii="Calibri" w:cs="Calibri" w:eastAsia="Calibri" w:hAnsi="Calibri"/>
-          <w:color w:val="000000"/>
-          <w:sz w:val="22"/>
-          <w:szCs w:val="22"/>
-        </w:rPr>
-        <w:t xml:space="preserve">• Collaborated on Spring Boot microservices with Hibernate/JPA for insurance, retirement, and asset management behind customer and agent portals.</w:t>
-      </w:r>
-    </w:p>
-    <w:p>
-      <w:pPr>
-        <w:spacing w:after="20"/>
-      </w:pPr>
-      <w:r>
-        <w:rPr>
-          <w:rFonts w:ascii="Calibri" w:cs="Calibri" w:eastAsia="Calibri" w:hAnsi="Calibri"/>
-          <w:color w:val="000000"/>
-          <w:sz w:val="22"/>
-          <w:szCs w:val="22"/>
-        </w:rPr>
-        <w:t xml:space="preserve">• Supported Docker and Kubernetes releases on AWS (EC2, S3, RDS, Lambda) with OAuth2, JWT, Redis sessions, and RBAC for compliant financial workloads.</w:t>
+        <w:t xml:space="preserve">Houston, Texas, USA  |  Feb 2025 – Oct 2025</w:t>
+      </w:r>
+    </w:p>
+    <w:p>
+      <w:pPr>
+        <w:spacing w:after="20"/>
+      </w:pPr>
+      <w:r>
+        <w:rPr>
+          <w:rFonts w:ascii="Calibri" w:cs="Calibri" w:eastAsia="Calibri" w:hAnsi="Calibri"/>
+          <w:color w:val="000000"/>
+          <w:sz w:val="22"/>
+          <w:szCs w:val="22"/>
+        </w:rPr>
+        <w:t xml:space="preserve">• Built Spring Boot microservices with Hibernate/JPA for insurance, retirement, and asset management behind customer and agent portals.</w:t>
+      </w:r>
+    </w:p>
+    <w:p>
+      <w:pPr>
+        <w:spacing w:after="20"/>
+      </w:pPr>
+      <w:r>
+        <w:rPr>
+          <w:rFonts w:ascii="Calibri" w:cs="Calibri" w:eastAsia="Calibri" w:hAnsi="Calibri"/>
+          <w:color w:val="000000"/>
+          <w:sz w:val="22"/>
+          <w:szCs w:val="22"/>
+        </w:rPr>
+        <w:t xml:space="preserve">• Released Docker and Kubernetes workloads on AWS (EC2, S3, RDS, Lambda) with OAuth2, JWT, Redis sessions, and RBAC for compliant financial environments.</w:t>
       </w:r>
     </w:p>
     <w:p>
@@ -345,21 +594,21 @@
           <w:sz w:val="22"/>
           <w:szCs w:val="22"/>
         </w:rPr>
-        <w:t xml:space="preserve">• Coordinated API specifications and integrations with architecture and compliance partners; participated in on-schedule policy, claims, and reporting deliveries.</w:t>
-      </w:r>
-    </w:p>
-    <w:p>
-      <w:pPr>
-        <w:spacing w:after="20"/>
-      </w:pPr>
-      <w:r>
-        <w:rPr>
-          <w:rFonts w:ascii="Calibri" w:cs="Calibri" w:eastAsia="Calibri" w:hAnsi="Calibri"/>
-          <w:color w:val="000000"/>
-          <w:sz w:val="22"/>
-          <w:szCs w:val="22"/>
-        </w:rPr>
-        <w:t xml:space="preserve">• Participated in Agile delivery with Product/QA and CI/CD (Jenkins, Bitbucket, GitHub Actions) improving feedback from test to production.</w:t>
+        <w:t xml:space="preserve">• Partnered with architecture and compliance on API specifications and integrations; delivered on-schedule policy, claims, and reporting releases.</w:t>
+      </w:r>
+    </w:p>
+    <w:p>
+      <w:pPr>
+        <w:spacing w:after="20"/>
+      </w:pPr>
+      <w:r>
+        <w:rPr>
+          <w:rFonts w:ascii="Calibri" w:cs="Calibri" w:eastAsia="Calibri" w:hAnsi="Calibri"/>
+          <w:color w:val="000000"/>
+          <w:sz w:val="22"/>
+          <w:szCs w:val="22"/>
+        </w:rPr>
+        <w:t xml:space="preserve">• Contributed to Agile delivery with Product and QA and CI/CD (Jenkins, Bitbucket, GitHub Actions), tightening feedback from test to production.</w:t>
       </w:r>
     </w:p>
     <w:p>
@@ -373,7 +622,7 @@
           <w:sz w:val="22"/>
           <w:szCs w:val="22"/>
         </w:rPr>
-        <w:t xml:space="preserve">• Extended fault-tolerance patterns with JUnit and Mockito; supported production observability with Prometheus and Grafana on critical services.</w:t>
+        <w:t xml:space="preserve">• Hardened services with fault-tolerance patterns, JUnit/Mockito tests, and Prometheus/Grafana observability on critical paths.</w:t>
       </w:r>
     </w:p>
     <w:p>
@@ -403,21 +652,21 @@
           <w:sz w:val="22"/>
           <w:szCs w:val="22"/>
         </w:rPr>
-        <w:t xml:space="preserve">Feb 2024 – Dec 2024</w:t>
-      </w:r>
-    </w:p>
-    <w:p>
-      <w:pPr>
-        <w:spacing w:after="20"/>
-      </w:pPr>
-      <w:r>
-        <w:rPr>
-          <w:rFonts w:ascii="Calibri" w:cs="Calibri" w:eastAsia="Calibri" w:hAnsi="Calibri"/>
-          <w:color w:val="000000"/>
-          <w:sz w:val="22"/>
-          <w:szCs w:val="22"/>
-        </w:rPr>
-        <w:t xml:space="preserve">• Collaborated on Java 11, Spring Boot, and Spring Data JPA services for oil and gas portfolio and asset tracking for 500+ users and high daily transaction volume.</w:t>
+        <w:t xml:space="preserve">Houston, Texas, USA  |  Feb 2024 – Dec 2024</w:t>
+      </w:r>
+    </w:p>
+    <w:p>
+      <w:pPr>
+        <w:spacing w:after="20"/>
+      </w:pPr>
+      <w:r>
+        <w:rPr>
+          <w:rFonts w:ascii="Calibri" w:cs="Calibri" w:eastAsia="Calibri" w:hAnsi="Calibri"/>
+          <w:color w:val="000000"/>
+          <w:sz w:val="22"/>
+          <w:szCs w:val="22"/>
+        </w:rPr>
+        <w:t xml:space="preserve">• Built Java 11, Spring Boot, and Spring Data JPA services for oil and gas portfolio and asset tracking for 500+ users and high daily transaction volume.</w:t>
       </w:r>
     </w:p>
     <w:p>
@@ -445,21 +694,21 @@
           <w:sz w:val="22"/>
           <w:szCs w:val="22"/>
         </w:rPr>
-        <w:t xml:space="preserve">• Supported Terraform and Jenkins infrastructure-as-code pipelines; reduced environment provisioning effort by ~25% for AWS-bound workloads.</w:t>
-      </w:r>
-    </w:p>
-    <w:p>
-      <w:pPr>
-        <w:spacing w:after="20"/>
-      </w:pPr>
-      <w:r>
-        <w:rPr>
-          <w:rFonts w:ascii="Calibri" w:cs="Calibri" w:eastAsia="Calibri" w:hAnsi="Calibri"/>
-          <w:color w:val="000000"/>
-          <w:sz w:val="22"/>
-          <w:szCs w:val="22"/>
-        </w:rPr>
-        <w:t xml:space="preserve">• Participated in Kubernetes operations (health checks, readiness probes, auto-scaling) with Oracle and MySQL on AWS for resilient energy data exchange.</w:t>
+        <w:t xml:space="preserve">• Automated Terraform and Jenkins infrastructure-as-code pipelines; reduced environment provisioning effort by ~25% for AWS-bound workloads.</w:t>
+      </w:r>
+    </w:p>
+    <w:p>
+      <w:pPr>
+        <w:spacing w:after="20"/>
+      </w:pPr>
+      <w:r>
+        <w:rPr>
+          <w:rFonts w:ascii="Calibri" w:cs="Calibri" w:eastAsia="Calibri" w:hAnsi="Calibri"/>
+          <w:color w:val="000000"/>
+          <w:sz w:val="22"/>
+          <w:szCs w:val="22"/>
+        </w:rPr>
+        <w:t xml:space="preserve">• Operated Kubernetes (health checks, readiness probes, auto-scaling) with Oracle and MySQL on AWS for resilient energy data exchange.</w:t>
       </w:r>
     </w:p>
     <w:p>
@@ -517,21 +766,21 @@
           <w:sz w:val="22"/>
           <w:szCs w:val="22"/>
         </w:rPr>
-        <w:t xml:space="preserve">Jun 2021 – Jun 2022</w:t>
-      </w:r>
-    </w:p>
-    <w:p>
-      <w:pPr>
-        <w:spacing w:after="20"/>
-      </w:pPr>
-      <w:r>
-        <w:rPr>
-          <w:rFonts w:ascii="Calibri" w:cs="Calibri" w:eastAsia="Calibri" w:hAnsi="Calibri"/>
-          <w:color w:val="000000"/>
-          <w:sz w:val="22"/>
-          <w:szCs w:val="22"/>
-        </w:rPr>
-        <w:t xml:space="preserve">• Collaborated on Java and Spring Boot REST services on Oracle and PostgreSQL for automotive manufacturing and supply-chain analytics across plants, dealers, and logistics.</w:t>
+        <w:t xml:space="preserve">Hyderabad, Telangana, India  |  Jun 2021 – Jun 2022</w:t>
+      </w:r>
+    </w:p>
+    <w:p>
+      <w:pPr>
+        <w:spacing w:after="20"/>
+      </w:pPr>
+      <w:r>
+        <w:rPr>
+          <w:rFonts w:ascii="Calibri" w:cs="Calibri" w:eastAsia="Calibri" w:hAnsi="Calibri"/>
+          <w:color w:val="000000"/>
+          <w:sz w:val="22"/>
+          <w:szCs w:val="22"/>
+        </w:rPr>
+        <w:t xml:space="preserve">• Built Java and Spring Boot REST services on Oracle and PostgreSQL for automotive manufacturing and supply-chain analytics across plants, dealers, and logistics.</w:t>
       </w:r>
     </w:p>
     <w:p>
@@ -559,7 +808,7 @@
           <w:sz w:val="22"/>
           <w:szCs w:val="22"/>
         </w:rPr>
-        <w:t xml:space="preserve">• Supported ETL from vehicle production, dealer systems, and logistics into analytics stores for batch and near-real-time reporting.</w:t>
+        <w:t xml:space="preserve">• Built ETL from vehicle production, dealer systems, and logistics into analytics stores for batch and near-real-time reporting.</w:t>
       </w:r>
     </w:p>
     <w:p>
@@ -601,7 +850,7 @@
           <w:sz w:val="22"/>
           <w:szCs w:val="22"/>
         </w:rPr>
-        <w:t xml:space="preserve">• Supported Jenkins CI/CD pipelines and coordinated deployments across lower environments while enforcing automated testing and release validation.</w:t>
+        <w:t xml:space="preserve">• Maintained Jenkins CI/CD pipelines and deployments across lower environments with automated testing and release validation.</w:t>
       </w:r>
     </w:p>
     <w:p>
@@ -615,23 +864,23 @@
           <w:sz w:val="22"/>
           <w:szCs w:val="22"/>
         </w:rPr>
-        <w:t xml:space="preserve">• Participated in Agile delivery with analysts and QA, using JUnit regression prior to production releases.</w:t>
-      </w:r>
-    </w:p>
-    <w:p>
-      <w:pPr>
-        <w:spacing w:after="20"/>
-      </w:pPr>
-      <w:r>
-        <w:rPr>
-          <w:rFonts w:ascii="Calibri" w:cs="Calibri" w:eastAsia="Calibri" w:hAnsi="Calibri"/>
-          <w:b/>
-          <w:bCs/>
-          <w:color w:val="000000"/>
-          <w:sz w:val="22"/>
-          <w:szCs w:val="22"/>
-        </w:rPr>
-        <w:t xml:space="preserve">Associate System Engineer – Elder Pharmaceuticals</w:t>
+        <w:t xml:space="preserve">• Contributed in Agile squads with analysts and QA, shipping JUnit-backed changes before production releases.</w:t>
+      </w:r>
+    </w:p>
+    <w:p>
+      <w:pPr>
+        <w:spacing w:after="20"/>
+      </w:pPr>
+      <w:r>
+        <w:rPr>
+          <w:rFonts w:ascii="Calibri" w:cs="Calibri" w:eastAsia="Calibri" w:hAnsi="Calibri"/>
+          <w:b/>
+          <w:bCs/>
+          <w:color w:val="000000"/>
+          <w:sz w:val="22"/>
+          <w:szCs w:val="22"/>
+        </w:rPr>
+        <w:t xml:space="preserve">Associate System Engineer – Elder Pharmaceuticals Ltd.</w:t>
       </w:r>
     </w:p>
     <w:p>
@@ -645,35 +894,35 @@
           <w:sz w:val="22"/>
           <w:szCs w:val="22"/>
         </w:rPr>
-        <w:t xml:space="preserve">Jun 2019 – May 2021</w:t>
-      </w:r>
-    </w:p>
-    <w:p>
-      <w:pPr>
-        <w:spacing w:after="20"/>
-      </w:pPr>
-      <w:r>
-        <w:rPr>
-          <w:rFonts w:ascii="Calibri" w:cs="Calibri" w:eastAsia="Calibri" w:hAnsi="Calibri"/>
-          <w:color w:val="000000"/>
-          <w:sz w:val="22"/>
-          <w:szCs w:val="22"/>
-        </w:rPr>
-        <w:t xml:space="preserve">• Collaborated on Spring Boot and Node.js REST services for production monitoring and ERP integration on Oracle and PostgreSQL in a regulated pharma environment.</w:t>
-      </w:r>
-    </w:p>
-    <w:p>
-      <w:pPr>
-        <w:spacing w:after="20"/>
-      </w:pPr>
-      <w:r>
-        <w:rPr>
-          <w:rFonts w:ascii="Calibri" w:cs="Calibri" w:eastAsia="Calibri" w:hAnsi="Calibri"/>
-          <w:color w:val="000000"/>
-          <w:sz w:val="22"/>
-          <w:szCs w:val="22"/>
-        </w:rPr>
-        <w:t xml:space="preserve">• Supported AngularJS and React dashboards (HTML5, CSS3, JavaScript) on secure APIs; reduced manual laboratory, QC, and inventory entry effort by ~40% and accelerated quality reviews.</w:t>
+        <w:t xml:space="preserve">Mumbai, India  |  Jun 2019 – May 2021</w:t>
+      </w:r>
+    </w:p>
+    <w:p>
+      <w:pPr>
+        <w:spacing w:after="20"/>
+      </w:pPr>
+      <w:r>
+        <w:rPr>
+          <w:rFonts w:ascii="Calibri" w:cs="Calibri" w:eastAsia="Calibri" w:hAnsi="Calibri"/>
+          <w:color w:val="000000"/>
+          <w:sz w:val="22"/>
+          <w:szCs w:val="22"/>
+        </w:rPr>
+        <w:t xml:space="preserve">• Built Spring Boot and Node.js REST services for production monitoring and ERP integration on Oracle and PostgreSQL in a regulated pharma environment.</w:t>
+      </w:r>
+    </w:p>
+    <w:p>
+      <w:pPr>
+        <w:spacing w:after="20"/>
+      </w:pPr>
+      <w:r>
+        <w:rPr>
+          <w:rFonts w:ascii="Calibri" w:cs="Calibri" w:eastAsia="Calibri" w:hAnsi="Calibri"/>
+          <w:color w:val="000000"/>
+          <w:sz w:val="22"/>
+          <w:szCs w:val="22"/>
+        </w:rPr>
+        <w:t xml:space="preserve">• Delivered AngularJS and React dashboards (HTML5, CSS3, JavaScript) on secure APIs; reduced manual laboratory, QC, and inventory entry effort by ~40% and accelerated quality reviews.</w:t>
       </w:r>
     </w:p>
     <w:p>
@@ -715,7 +964,7 @@
           <w:sz w:val="22"/>
           <w:szCs w:val="22"/>
         </w:rPr>
-        <w:t xml:space="preserve">• Coordinated Jenkins and Maven CI/CD with mandatory JUnit gates on compliance-critical builds before promotion to controlled environments.</w:t>
+        <w:t xml:space="preserve">• Coordinated Jenkins and Maven CI/CD with mandatory JUnit-gated builds before promotion to controlled environments.</w:t>
       </w:r>
     </w:p>
     <w:p>
@@ -729,7 +978,7 @@
           <w:sz w:val="22"/>
           <w:szCs w:val="22"/>
         </w:rPr>
-        <w:t xml:space="preserve">• Participated in incremental, audit-friendly releases with operations and quality over 24 months, stabilizing regulated reporting and ERP integration.</w:t>
+        <w:t xml:space="preserve">• Supported incremental, audit-friendly releases with operations and quality over 24 months, stabilizing regulated reporting and ERP integration.</w:t>
       </w:r>
     </w:p>
     <w:p>
@@ -762,27 +1011,7 @@
           <w:sz w:val="22"/>
           <w:szCs w:val="22"/>
         </w:rPr>
-        <w:t xml:space="preserve">• </w:t>
-      </w:r>
-      <w:r>
-        <w:rPr>
-          <w:rFonts w:ascii="Calibri" w:cs="Calibri" w:eastAsia="Calibri" w:hAnsi="Calibri"/>
-          <w:b/>
-          <w:bCs/>
-          <w:color w:val="000000"/>
-          <w:sz w:val="22"/>
-          <w:szCs w:val="22"/>
-        </w:rPr>
-        <w:t xml:space="preserve">AWS Certified DevOps Engineer – Professional</w:t>
-      </w:r>
-      <w:r>
-        <w:rPr>
-          <w:rFonts w:ascii="Calibri" w:cs="Calibri" w:eastAsia="Calibri" w:hAnsi="Calibri"/>
-          <w:color w:val="000000"/>
-          <w:sz w:val="22"/>
-          <w:szCs w:val="22"/>
-        </w:rPr>
-        <w:t xml:space="preserve"> (March 2025 – March 2027)</w:t>
+        <w:t xml:space="preserve">• AWS Certified DevOps Engineer – Professional</w:t>
       </w:r>
     </w:p>
     <w:p>
@@ -796,27 +1025,7 @@
           <w:sz w:val="22"/>
           <w:szCs w:val="22"/>
         </w:rPr>
-        <w:t xml:space="preserve">• </w:t>
-      </w:r>
-      <w:r>
-        <w:rPr>
-          <w:rFonts w:ascii="Calibri" w:cs="Calibri" w:eastAsia="Calibri" w:hAnsi="Calibri"/>
-          <w:b/>
-          <w:bCs/>
-          <w:color w:val="000000"/>
-          <w:sz w:val="22"/>
-          <w:szCs w:val="22"/>
-        </w:rPr>
-        <w:t xml:space="preserve">AWS Certified Solutions Architect – Associate</w:t>
-      </w:r>
-      <w:r>
-        <w:rPr>
-          <w:rFonts w:ascii="Calibri" w:cs="Calibri" w:eastAsia="Calibri" w:hAnsi="Calibri"/>
-          <w:color w:val="000000"/>
-          <w:sz w:val="22"/>
-          <w:szCs w:val="22"/>
-        </w:rPr>
-        <w:t xml:space="preserve"> (February 2025 – February 2028)</w:t>
+        <w:t xml:space="preserve">• AWS Certified Solutions Architect – Associate</w:t>
       </w:r>
     </w:p>
     <w:p>
@@ -830,27 +1039,7 @@
           <w:sz w:val="22"/>
           <w:szCs w:val="22"/>
         </w:rPr>
-        <w:t xml:space="preserve">• </w:t>
-      </w:r>
-      <w:r>
-        <w:rPr>
-          <w:rFonts w:ascii="Calibri" w:cs="Calibri" w:eastAsia="Calibri" w:hAnsi="Calibri"/>
-          <w:b/>
-          <w:bCs/>
-          <w:color w:val="000000"/>
-          <w:sz w:val="22"/>
-          <w:szCs w:val="22"/>
-        </w:rPr>
-        <w:t xml:space="preserve">HashiCorp Terraform Associate</w:t>
-      </w:r>
-      <w:r>
-        <w:rPr>
-          <w:rFonts w:ascii="Calibri" w:cs="Calibri" w:eastAsia="Calibri" w:hAnsi="Calibri"/>
-          <w:color w:val="000000"/>
-          <w:sz w:val="22"/>
-          <w:szCs w:val="22"/>
-        </w:rPr>
-        <w:t xml:space="preserve"> (March 2025 – March 2027)</w:t>
+        <w:t xml:space="preserve">• HashiCorp Terraform Associate</w:t>
       </w:r>
     </w:p>
     <w:p>
@@ -864,27 +1053,7 @@
           <w:sz w:val="22"/>
           <w:szCs w:val="22"/>
         </w:rPr>
-        <w:t xml:space="preserve">• </w:t>
-      </w:r>
-      <w:r>
-        <w:rPr>
-          <w:rFonts w:ascii="Calibri" w:cs="Calibri" w:eastAsia="Calibri" w:hAnsi="Calibri"/>
-          <w:b/>
-          <w:bCs/>
-          <w:color w:val="000000"/>
-          <w:sz w:val="22"/>
-          <w:szCs w:val="22"/>
-        </w:rPr>
-        <w:t xml:space="preserve">Oracle Certified Professional Java SE Developer</w:t>
-      </w:r>
-      <w:r>
-        <w:rPr>
-          <w:rFonts w:ascii="Calibri" w:cs="Calibri" w:eastAsia="Calibri" w:hAnsi="Calibri"/>
-          <w:color w:val="000000"/>
-          <w:sz w:val="22"/>
-          <w:szCs w:val="22"/>
-        </w:rPr>
-        <w:t xml:space="preserve"> (In Progress)</w:t>
+        <w:t xml:space="preserve">• Oracle Certified Professional Java SE Developer (In Progress)</w:t>
       </w:r>
     </w:p>
     <w:p>

</xml_diff>